<commit_message>
IJSSC R1: data audit and corrected re-analysis
Audit of the data pipeline (revision_r1/audit/) and a deterministic rebuild
of cohort, career and analysis data (analysis/r1_00_corrected_data.py):
complete extraction, baseline meet by venue and date (n = 2,138), follow-up
through 2025, register-corrected sex, region and baseline club, competition
days, exact Tyrving workbook formulas (tyrving_r2, validated 1,596/1,596).
Secondary analyses corrected (Cox time origin, age-16 landmark, club-robust
models, cross-validated calibration figure); all table notes computed.
Manuscript, supplement, response letter and tracking updated.

Co-Authored-By: Claude Opus 5.5 <noreply@anthropic.com>
</commit_message>
<xml_diff>
--- a/forskning/ncc-kohort/revision_r1/submission_r1/MANUSCRIPT_R1_clean.docx
+++ b/forskning/ncc-kohort/revision_r1/submission_r1/MANUSCRIPT_R1_clean.docx
@@ -104,7 +104,7 @@
         <w:pStyle w:val="FirstParagraph"/>
       </w:pPr>
       <w:r>
-        <w:t xml:space="preserve">Withdrawal from youth sport is theorized as a gradual process, but its longitudinal behavioral signature has been hard to observe directly. We used Norway’s national competition register to follow 2,123 athletes who competed as 13–14-year-olds in a regional youth track-and-field meet (birth years 1998–2002) for up to 14 years. In a prospective logistic regression for active senior status (≥2 registered results in a calendar year at age 20+) using only ages-13–14 predictors, competition volume was the dominant predictor (OR = 2.25 per SD, 95% CI [1.99, 2.55]; cross-validated AUC = 0.746; calibration slope 0.98), discriminated retention better than age-normed performance measured in the same window, was robust to structural controls, club random effects, and club-grouped validation, and was reproduced in two adjacent birth cohorts (an internal replication). Competition participation declined within athletes before exit: relative to their own earlier seasons, dropouts competed 12% less two seasons and 24% less one season before their final season, and among athletes still active at 16, declining volume across ages 15–16 predicted lower senior retention (OR = 0.53 per SD of decline). Higher within-sport event concentration was modestly associated with higher retention. A register-based candidate flag at the end of the age-14 season (&lt; 10 meets) identifies the 26% of athletes whose senior retention is 6%, versus 20% among the unflagged (similar when derived in one birth cohort and applied to the other): a testable targeting rule for retention-supporting outreach in open-entry systems.</w:t>
+        <w:t xml:space="preserve">Withdrawal from youth sport is theorized as a gradual process, but its longitudinal behavioral signature has been hard to observe directly. We used Norway’s national competition register to follow 2,138 athletes who competed as 13–14-year-olds in a regional youth track-and-field meet (birth years 1998–2002) for up to 14 years. In a prospective logistic regression for active senior status (≥2 registered results in a calendar year at age 20+) using only ages-13–14 predictors, competition volume was the strongest predictor (OR = 2.04 per SD, 95% CI [1.80, 2.32]; cross-validated AUC = 0.767; calibration slope 0.98), discriminated retention somewhat better than age-normed performance measured in the same window (which added complementary information; OR = 1.75 per SD), was robust to structural controls, club random effects, and club-grouped validation, and was reproduced in two adjacent birth cohorts (an internal replication). Competition participation declined within athletes before exit: relative to their own earlier seasons, dropouts competed 12% less two seasons and 23% less one season before their final season, and among athletes still active at 16, declining volume across ages 15–16 predicted lower senior retention (OR = 0.54 per SD of decline). Within-sport event concentration was not robustly associated with retention. A register-based candidate flag at the end of the age-14 season (&lt; 10 meets) identifies the 27% of athletes whose senior retention is 5.5%, versus 20% among the unflagged (the same cut-off emerged in each birth cohort and held when applied to the other): a testable targeting rule for retention-supporting outreach in open-entry systems.</w:t>
       </w:r>
     </w:p>
     <w:p>
@@ -548,7 +548,7 @@
         <w:pStyle w:val="FirstParagraph"/>
       </w:pPr>
       <w:r>
-        <w:t xml:space="preserve">Track and field suits such a test: participation choices are visible event by event, entries are individually chosen rather than coach-selected (Section 2.2), performances are objectively measured, and a single national register captures every sanctioned result. We studied 2,123 Norwegian youth athletes longitudinally for up to 14 years using the federation’s competition register (see Figure 1) and tested three hypotheses. First, because withdrawal is described as a protracted, deliberative process</w:t>
+        <w:t xml:space="preserve">Track and field suits such a test: participation choices are visible event by event, entries are individually chosen rather than coach-selected (Section 2.2), performances are objectively measured, and a single national register captures every sanctioned result. We studied 2,138 Norwegian youth athletes longitudinally for up to 14 years using the federation’s competition register (see Figure 1) and tested three hypotheses. First, because withdrawal is described as a protracted, deliberative process</w:t>
       </w:r>
       <w:r>
         <w:rPr>
@@ -743,7 +743,7 @@
         <w:pStyle w:val="BodyText"/>
       </w:pPr>
       <w:r>
-        <w:t xml:space="preserve">The cohort comprises all athletes who competed in any of six consecutive autumn editions (2011–2016) of a regional grassroots youth meet held simultaneously at three venues in eastern, western, and mid Norway (the last also serving the northern districts). Athletes were 13–14 and were entered by their district federations under district quotas, with no qualifying performance standard and no entry fee; this soft selection into the baseline meet is a design feature: disengagement trajectories arise from a baseline of demonstrable engagement. The target population is thus the engaged core of the age group, not every athlete with a registered result (Section 3.1). Birth years were restricted to 1998–2002 (boundary years 1997 and 2003 had only one eligible edition), and athletes appearing in both a 13- and a 14-year-old edition were de-duplicated to the earlier one (Supplementary Figure S0). For an internal cohort replication, participants were partitioned into Cohort A (births 1998–2000, baseline meets 2011–2014; n = 1,301) and Cohort B (births 2001–2002, baseline meets 2014–2016; n = 822). Athletes were retained regardless of club transfers (27.8% recorded results for two or more clubs), so changing club does not register as dropout. The total cohort comprised 2,123 athletes (996 male, 1,103 female, 24 with no registered sex), generating 230,868 competition entries through the most recent register update (April 2026).</w:t>
+        <w:t xml:space="preserve">The cohort comprises all athletes who competed in any of six consecutive autumn editions (2011–2016) of a regional grassroots youth meet held simultaneously at three venues in eastern, western, and mid Norway (the last also serving the northern districts). Athletes were 13–14 and were entered by their district federations under district quotas, with no qualifying performance standard and no entry fee; this soft selection into the baseline meet is a design feature: disengagement trajectories arise from a baseline of demonstrable engagement. The target population is thus the engaged core of the age group, not every athlete with a registered result (Section 3.1). Birth years were restricted to 1998–2002 (boundary years 1997 and 2003 had only one eligible edition), and athletes appearing in both a 13- and a 14-year-old edition were de-duplicated to the earlier one (Supplementary Figure S0). Participation was identified by venue and date, because some venue-days are filed under other meet names (Supplementary Methods S-M12). For an internal cohort replication, participants were partitioned into Cohort A (births 1998–2000, baseline meets 2011–2014; n = 1,309) and Cohort B (births 2001–2002, baseline meets 2014–2016; n = 829). Athletes were retained regardless of club transfers (27.6% recorded results for two or more clubs), so changing club does not register as dropout. The total cohort comprised 2,138 athletes (1,006 male, 1,130 female, 2 with no registered sex), generating 231,144 competition entries through 2025 (register extract of May 2026; corrections made after a data audit during revision are listed in Supplementary Methods S-M12).</w:t>
       </w:r>
     </w:p>
     <w:bookmarkEnd w:id="16"/>
@@ -815,7 +815,7 @@
         <w:t xml:space="preserve">27</w:t>
       </w:r>
       <w:r>
-        <w:t xml:space="preserve">: a published table gives, per event × sex × age, a reference performance worth 1,000 points and a per-unit quotient (values capped at 1,500 to suppress data-entry errors). All events at the baseline meet were scored with the implement- and hurdle-specific norms for the athlete’s sex and age (Supplementary Methods S-M3). We computed tyrving_best (baseline maximum), tyrving_peak_pre15, and per-age scores (yielding a baseline performance trajectory, age-14 minus age-13).</w:t>
+        <w:t xml:space="preserve">: a published table gives, per event × sex × age, a reference performance worth 1,000 points and a per-unit quotient (values capped at 1,500 to suppress data-entry errors). All events at the baseline meet were scored with the implement- and hurdle-specific norms for the athlete’s sex and age and the table’s own formulas (Supplementary Methods S-M3). We computed tyrving_best (baseline maximum), tyrving_peak_pre15, and per-age scores (yielding a baseline performance trajectory, age-14 minus age-13).</w:t>
       </w:r>
     </w:p>
     <w:bookmarkEnd w:id="19"/>
@@ -954,7 +954,7 @@
         <w:pStyle w:val="FirstParagraph"/>
       </w:pPr>
       <w:r>
-        <w:t xml:space="preserve">For each athlete and age-year from 13 to 18 we counted distinct meets attended (vol_age_X; a multi-event competition counts as one meet) and total results (res_age_X, which also define active seasons: ≥2 results in a calendar year). Composites: vol_pre_milestone (meets at 13–14), vol_milestone (15–16), their difference, and n_champ_types (championship types before 17). These are observable behavioral markers, not direct measures of motivation or commitment; because participation can also decline through injury, another sport, or school constraints, we treat declining participation as a marker of disengagement, not disengagement itself.</w:t>
+        <w:t xml:space="preserve">For each athlete and age-year from 13 to 18 we counted competition days (vol_age_X: distinct dates with a registered result; the register stores each day of a multi-day meet as a separate meet), called meets for brevity, and total results (res_age_X, which also define active seasons: ≥2 results in a calendar year). Composites: vol_pre_milestone (meets at 13–14), vol_milestone (15–16), their difference, and n_champ_types (championship types before 17). These are observable behavioral markers, not direct measures of motivation or commitment; because participation can also decline through injury, another sport, or school constraints, we treat declining participation as a marker of disengagement, not disengagement itself.</w:t>
       </w:r>
     </w:p>
     <w:bookmarkEnd w:id="21"/>
@@ -972,7 +972,7 @@
         <w:pStyle w:val="FirstParagraph"/>
       </w:pPr>
       <w:r>
-        <w:t xml:space="preserve">Sex (M/F as registered), birth quarter (Q1–Q4; Q1 = January–March, the relatively oldest in the calendar-year age group; unknown for 84 athletes registered without birth date), baseline region (eastern, mid, or western Norway, by venue), and club size in the baseline year (registered athletes in the same club). The 24 athletes without registered sex are excluded from all regression models, which condition on sex (Supplementary Methods S-M3).</w:t>
+        <w:t xml:space="preserve">Sex (M/F as registered), birth quarter (Q1–Q4; Q1 = January–March, the relatively oldest in the calendar-year age group; unknown for 90 athletes registered without birth date), baseline region (eastern, mid, or western Norway, by venue; Supplementary Methods S-M12), and club size in the baseline year (the number of cohort athletes registered for the athlete’s baseline club that year). The 2 athletes without registered sex are excluded from all regression models, which condition on sex (Supplementary Methods S-M3).</w:t>
       </w:r>
     </w:p>
     <w:bookmarkEnd w:id="22"/>
@@ -1045,7 +1045,7 @@
         <w:pStyle w:val="FirstParagraph"/>
       </w:pPr>
       <w:r>
-        <w:t xml:space="preserve">To disentangle early behavioral heterogeneity from within-athlete decline, we fit a logistic regression on athletes still active at age 14 (1,914; complete-case model n = 1,888) including both the volume level at age 14 and the change from 14 to 15 (Table 4; change = later minus earlier volume, so OR &gt; 1 per SD means that decline predicts lower retention). Because a change score can span the exit itself, three analyses probe the within-athlete claim directly: exit-aligned trajectories (volume one to three seasons before each dropout’s own final active season), a contamination-free change model among athletes still active at 16 (level at 15 plus change 15→16 predicting senior status; Supplementary Table S19), and an athlete fixed-effects model of log(1 + meets) at ages 13–19, with age fixed effects and indicators for the final active season and the three preceding seasons, which estimates each athlete’s decline relative to their own earlier volume (Supplementary Methods S-M6). Prospective early-warning thresholds on pre-milestone volume (classification performance at candidate cut-offs at the end of the age-14 season, with bootstrap CIs) are reported in Table 6, with cut-offs also derived in one birth cohort and tested in the other (Supplementary Table S29).</w:t>
+        <w:t xml:space="preserve">To disentangle early behavioral heterogeneity from within-athlete decline, we fit a logistic regression on athletes still active at age 14 (1,926; complete-case model n = 1,925) including both the volume level at age 14 and the change from 14 to 15 (Table 4; change = later minus earlier volume, so OR &gt; 1 per SD means that decline predicts lower retention). Because a change score can span the exit itself, three analyses probe the within-athlete claim directly: exit-aligned trajectories (volume one to three seasons before each dropout’s own final active season), a contamination-free change model among athletes still active at 16 (level at 15 plus change 15→16 predicting senior status; Supplementary Table S19), and an athlete fixed-effects model of log(1 + meets) at ages 13–19, with age fixed effects and indicators for the final active season and the three preceding seasons, which estimates each athlete’s decline relative to their own earlier volume (Supplementary Methods S-M6). Prospective early-warning thresholds on pre-milestone volume (classification performance at candidate cut-offs at the end of the age-14 season, with bootstrap CIs) are reported in Table 6, with cut-offs also derived in one birth cohort and tested in the other (Supplementary Table S29).</w:t>
       </w:r>
     </w:p>
     <w:bookmarkEnd w:id="26"/>
@@ -1063,7 +1063,7 @@
         <w:pStyle w:val="FirstParagraph"/>
       </w:pPr>
       <w:r>
-        <w:t xml:space="preserve">Time from baseline to last active season was modeled with Cox proportional hazards regression,</w:t>
+        <w:t xml:space="preserve">Time to the last active season was modeled with Cox proportional hazards regression,</w:t>
       </w:r>
       <w:r>
         <w:rPr>
@@ -1075,7 +1075,7 @@
         <w:t xml:space="preserve"> </w:t>
       </w:r>
       <w:r>
-        <w:t xml:space="preserve">with a baseline-only primary specification (Supplementary Table S16), a landmark analysis</w:t>
+        <w:t xml:space="preserve">with a baseline-only primary specification whose clock starts at the end of the age-14 season, when the predictor window closes (Supplementary Tables S10 and S16), a landmark analysis</w:t>
       </w:r>
       <w:r>
         <w:rPr>
@@ -1087,7 +1087,7 @@
         <w:t xml:space="preserve"> </w:t>
       </w:r>
       <w:r>
-        <w:t xml:space="preserve">among athletes active at age 16 (Supplementary Table S8), and a post-baseline specification interpreted with overlap caveats (Table 5). Temporary gaps followed by a return are not events; definitions ending the spell at the first two-season gap or the first inactive season are reported in Supplementary Table S30. Proportional-hazards checks, E-values,</w:t>
+        <w:t xml:space="preserve">among athletes still in their career at age 16 (final active season at 16 or later; Supplementary Table S8), and a post-baseline specification interpreted with overlap caveats (Table 5). Temporary gaps followed by a return are not events; definitions ending the spell at the first two-season gap or the first inactive season are reported in Supplementary Table S30. Proportional-hazards checks, E-values,</w:t>
       </w:r>
       <w:r>
         <w:rPr>
@@ -1129,7 +1129,7 @@
         <w:t xml:space="preserve"> </w:t>
       </w:r>
       <w:r>
-        <w:t xml:space="preserve">Baseline Tyrving was missing for 28 athletes (1.3%; 24 without registered sex); other variables were complete. The primary analysis is complete-case (n = 2,095), with multiple imputation (m = 20; Supplementary Methods S-M3), mean imputation, and club-clustered standard errors as sensitivity analyses (Supplementary Tables S21, S5, S2; sample flow: Supplementary Table S12). Club-level confounding was probed via the intraclass correlation of volume across baseline clubs and a refit with club random intercepts (Supplementary Table S22). The primary and secondary models were re-estimated separately by birth cohort, an internal replication within one register and national system.</w:t>
+        <w:t xml:space="preserve">Baseline Tyrving was missing for 2 athletes (0.1%), both without registered sex; other variables were complete. The primary analysis is complete-case (n = 2,136), with multiple imputation (m = 20; Supplementary Methods S-M3) as sensitivity analysis (Supplementary Table S21; sample flow: Supplementary Table S12). Club-level confounding was probed via the intraclass correlation of volume across baseline clubs, club-clustered standard errors, a population-averaged model, and a refit with club random intercepts (Supplementary Table S22). The primary and secondary models were re-estimated separately by birth cohort, an internal replication within one register and national system.</w:t>
       </w:r>
     </w:p>
     <w:bookmarkEnd w:id="28"/>
@@ -1276,7 +1276,7 @@
         <w:pStyle w:val="FirstParagraph"/>
       </w:pPr>
       <w:r>
-        <w:t xml:space="preserve">The cohort comprised 2,123 athletes (52.0% female): 1,301 in Cohort A and 822 in Cohort B, closely matched at baseline (mean Tyrving 712 and 715 and ~41% active at 17 in each; Table 1). Senior retention (≥1 season with ≥2 results at age 20+) was 15.8% in Cohort A and 17.3% in Cohort B (combined 16.4%). The proportion still active in 2024+ was 5.8% (A) and 10.8% (B), reflecting Cohort B’s shorter follow-up (fixed-window outcome at ages 20–22: 15.3% vs 16.7%; Supplementary Table S24). Of all 7,327 register athletes born 1998–2002 with a result at ages 13–14, the cohort is 29%, but it contains 78% of those with ten or more meets at those ages and 77% of all who later competed as seniors; the others had a median of 2 meets and 2.0% senior retention (Supplementary Table S31).</w:t>
+        <w:t xml:space="preserve">The cohort comprised 2,138 athletes (52.9% female): 1,309 in Cohort A and 829 in Cohort B, closely matched at baseline (mean Tyrving 816 and 836 and ~41% active at 17 in each; Table 1). Senior retention (≥1 season with ≥2 results at age 20+) was 15.8% in Cohort A and 17.0% in Cohort B (combined 16.3%). The proportion still active in 2024+ was 5.7% (A) and 10.5% (B), reflecting Cohort B’s shorter follow-up (fixed-window outcome at ages 20–22: 15.3% vs 16.5%; Supplementary Table S24). Of all 7,266 register athletes born 1998–2002 with a result at ages 13–14, the cohort is 29%, but it contains 80% of those with ten or more meets at those ages and 80% of all who later competed as seniors; the others had a median of 2 meets and 1.7% senior retention (Supplementary Table S31).</w:t>
       </w:r>
     </w:p>
     <w:p>
@@ -1312,7 +1312,7 @@
         <w:pStyle w:val="FirstParagraph"/>
       </w:pPr>
       <w:r>
-        <w:t xml:space="preserve">Figure 2 presents the central behavioral observation (Figure 1 shows the conceptual model): median competitions per year by age, plotted separately for eventual retainers (n = 348) and non-retainers (n = 1,775). The groups already differ at baseline (medians of 13 vs. 8 meets at age 13, and 17 vs. 8 at age 14), and from age 15 they diverge sharply: retainers peak at 19 meets and sustain that level through 17, while future dropouts fall from 8 to 3 to 0. Baseline differences and within-athlete decline are separated formally in Section 3.5.</w:t>
+        <w:t xml:space="preserve">Figure 2 presents the central behavioral observation (Figure 1 shows the conceptual model): median competitions per year by age (Table 2), plotted separately for eventual retainers (n = 348) and non-retainers (n = 1,790). The groups already differ at baseline (medians of 13 vs. 8 meets at age 13, and 16.5 vs. 8 at age 14), and from age 15 they diverge sharply: retainers peak at 19 meets and sustain that level through 17, while future dropouts fall from 8 to 3 to 0. Baseline differences and within-athlete decline are separated formally in Section 3.5.</w:t>
       </w:r>
     </w:p>
     <w:p>
@@ -1320,7 +1320,7 @@
         <w:pStyle w:val="BodyText"/>
       </w:pPr>
       <w:r>
-        <w:t xml:space="preserve">Kaplan–Meier curves summarize the attrition (medians in Table 2): half the cohort ceased active competition within 3 years, 75% within 5, steepest at age 17, the youth-to-junior transition (Supplementary Figure S2); sex-stratified curves overlap (log-rank</w:t>
+        <w:t xml:space="preserve">Kaplan–Meier curves summarize the attrition: half the cohort had its final active season within 2 years of baseline and 79% within 5; the annual exit rate was 22–24% at ages 14–17 and peaked at 18–19 (28%), the first junior years (Supplementary Figure S2); sex-stratified curves overlap (log-rank</w:t>
       </w:r>
       <w:r>
         <w:t xml:space="preserve"> </w:t>
@@ -1336,7 +1336,7 @@
         <w:t xml:space="preserve"> </w:t>
       </w:r>
       <w:r>
-        <w:t xml:space="preserve">= .33). Descriptively, curves by ages-15–16 volume separate monotonically (71% senior retention with ≥31 meets vs. 4% with none; Figure 3), as do curves by pre-17 championship types (Supplementary Figure S3).</w:t>
+        <w:t xml:space="preserve">= .42). Descriptively, curves by ages-15–16 volume separate monotonically (50% senior retention with ≥31 meets vs. 0.8% with none; Figure 3), as do curves by pre-17 championship types (Supplementary Figure S3).</w:t>
       </w:r>
     </w:p>
     <w:p>
@@ -1412,7 +1412,7 @@
           <w:b/>
           <w:bCs/>
         </w:rPr>
-        <w:t xml:space="preserve">Among baseline-window predictors (ages 13–14), competition volume provided the largest incremental contribution to prospective discrimination of senior retention 6–14 years later: OR = 2.25 per SD (95% CI [1.99, 2.55],</w:t>
+        <w:t xml:space="preserve">Among baseline-window predictors (ages 13–14), competition volume was the strongest predictor and made the largest unique contribution to prospective discrimination of senior retention 6–14 years later: OR = 2.04 per SD (95% CI [1.80, 2.32],</w:t>
       </w:r>
       <w:r>
         <w:rPr>
@@ -1442,13 +1442,13 @@
           <w:b/>
           <w:bCs/>
         </w:rPr>
-        <w:t xml:space="preserve">&lt; .001), cross-validated AUC = 0.746 (95% CI 0.716–0.776).</w:t>
-      </w:r>
-      <w:r>
-        <w:t xml:space="preserve"> </w:t>
-      </w:r>
-      <w:r>
-        <w:t xml:space="preserve">In the stepwise models (Table 3), CV-AUC was 0.535 (sex), 0.641 (+ Tyrving), 0.636 (+ HHI), and 0.746 (+ volume; increase 0.110, 95% CI 0.081–0.140; Supplementary Table S27), with well-calibrated predictions (calibration slope 0.98, calibration-in-the-large 0.00, Brier 0.120; Supplementary Table S23). In the full model, baseline performance (OR = 1.23 per SD, 95% CI [1.06, 1.42]) and HHI (OR = 1.27 per SD, 95% CI [1.12, 1.44]) retained smaller associations (§3.9).</w:t>
+        <w:t xml:space="preserve">&lt; .001), cross-validated AUC = 0.767 (95% CI 0.737–0.797).</w:t>
+      </w:r>
+      <w:r>
+        <w:t xml:space="preserve"> </w:t>
+      </w:r>
+      <w:r>
+        <w:t xml:space="preserve">In the stepwise models (Table 3), CV-AUC was 0.535 (sex), 0.700 (+ Tyrving), 0.698 (+ HHI), and 0.767 (+ volume; increase 0.069, 95% CI 0.047–0.091; Supplementary Table S27), with well-calibrated predictions (calibration slope 0.98, calibration-in-the-large 0.00, Brier 0.117; Supplementary Table S23, Supplementary Figure S1). Baseline performance was the second, complementary predictor (OR = 1.75 per SD, 95% CI [1.47, 2.08], in the full model); HHI retained a small association once volume was included (OR = 1.18 per SD, 95% CI [1.04, 1.34]; §3.9).</w:t>
       </w:r>
     </w:p>
     <w:p>
@@ -1484,7 +1484,46 @@
         <w:pStyle w:val="FirstParagraph"/>
       </w:pPr>
       <w:r>
-        <w:t xml:space="preserve">Adding region, birth quarter (Q1/Q4), and club size left the volume coefficient essentially unchanged (OR = 2.26 vs. 2.25); no structural covariate was significant (</w:t>
+        <w:t xml:space="preserve">Adding region, birth quarter (Q1/Q4), and club size left the volume coefficient essentially unchanged (OR = 2.07 vs. 2.04). Of these covariates only birth quarter was associated with retention: conditional on performance and volume, relatively younger athletes were retained somewhat more often (linear trend OR = 1.16 per quarter, 95% CI [1.03, 1.31]; Supplementary Table S13). A quarter of volume variance lies between clubs (ICC = 0.27, 287 clubs), but with club random intercepts the coefficient was, if anything, larger (OR = 2.10, 95% CI [1.88, 2.34]; club-clustered standard errors and a population-averaged model gave the same estimate with wider intervals, OR = 2.04 [1.75, 2.39]; Supplementary Table S22), and folds grouped by club gave the same cross-validated AUC (0.766 [0.735, 0.797]; Supplementary Table S26): the association holds within clubs and carries over to clubs not used for fitting.</w:t>
+      </w:r>
+    </w:p>
+    <w:bookmarkEnd w:id="37"/>
+    <w:bookmarkStart w:id="38" w:name="Xb605678fcb2abceaec1c001a4bcd0f3eaaa0fb1"/>
+    <w:p>
+      <w:pPr>
+        <w:pStyle w:val="Heading2"/>
+      </w:pPr>
+      <w:r>
+        <w:t xml:space="preserve">3.5 Within-athlete decline versus baseline heterogeneity</w:t>
+      </w:r>
+    </w:p>
+    <w:p>
+      <w:pPr>
+        <w:pStyle w:val="FirstParagraph"/>
+      </w:pPr>
+      <w:r>
+        <w:rPr>
+          <w:b/>
+          <w:bCs/>
+        </w:rPr>
+        <w:t xml:space="preserve">Early behavioral heterogeneity and within-athlete decline contribute independently; they are not substitutes.</w:t>
+      </w:r>
+      <w:r>
+        <w:t xml:space="preserve"> </w:t>
+      </w:r>
+      <w:r>
+        <w:t xml:space="preserve">Four analyses separate the two readings of Figure 2.</w:t>
+      </w:r>
+    </w:p>
+    <w:p>
+      <w:pPr>
+        <w:pStyle w:val="BodyText"/>
+      </w:pPr>
+      <w:r>
+        <w:t xml:space="preserve">First, level and change. Among athletes still active at age 14 (1,926; complete-case model n = 1,925), the age-14 volume level (OR = 2.51 per SD, 95% CI [2.17, 2.89]) and the change from age 14 to 15 (OR = 2.29 per SD increase, 95% CI [2.00, 2.62]; i.e., OR = 0.44 per SD, about 6.4 meets, of decline) contributed independently (both</w:t>
+      </w:r>
+      <w:r>
+        <w:t xml:space="preserve"> </w:t>
       </w:r>
       <w:r>
         <w:rPr>
@@ -1497,35 +1536,122 @@
         <w:t xml:space="preserve"> </w:t>
       </w:r>
       <w:r>
-        <w:t xml:space="preserve">&gt; .17; Supplementary Table S13; full quarter coding: χ²(3) = 3.24, p = .36). A quarter of volume variance lies between clubs (ICC = 0.24, 287 clubs), but with club random intercepts the coefficient was, if anything, larger (OR = 2.43, 95% CI [2.17, 2.72]; Supplementary Table S22), and folds grouped by club gave the same cross-validated AUC (0.746 [0.709, 0.783]; Supplementary Table S26): the association holds within clubs and carries over to clubs not used for fitting.</w:t>
-      </w:r>
-    </w:p>
-    <w:bookmarkEnd w:id="37"/>
-    <w:bookmarkStart w:id="38" w:name="Xb605678fcb2abceaec1c001a4bcd0f3eaaa0fb1"/>
-    <w:p>
-      <w:pPr>
-        <w:pStyle w:val="Heading2"/>
-      </w:pPr>
-      <w:r>
-        <w:t xml:space="preserve">3.5 Within-athlete decline versus baseline heterogeneity</w:t>
-      </w:r>
-    </w:p>
-    <w:p>
-      <w:pPr>
-        <w:pStyle w:val="FirstParagraph"/>
-      </w:pPr>
+        <w:t xml:space="preserve">&lt; .001); adding change raised pseudo-</w:t>
+      </w:r>
+      <w:r>
+        <w:rPr>
+          <w:i/>
+          <w:iCs/>
+        </w:rPr>
+        <w:t xml:space="preserve">R</w:t>
+      </w:r>
+      <w:r>
+        <w:t xml:space="preserve">² from 0.150 to 0.245 (Table 4).</w:t>
+      </w:r>
+    </w:p>
+    <w:p>
+      <w:pPr>
+        <w:pStyle w:val="BodyText"/>
+      </w:pPr>
+      <w:r>
+        <w:t xml:space="preserve">Second, because a change score spanning the exit could conflate decline with the exit itself, we repeated the test where no exit can contaminate it: among athletes still competing at age 16 (≥2 results; n = 1,088), volume at 15 (OR = 3.04, 95% CI [2.56, 3.62]) and change from 15 to 16 (OR = 1.87 per SD increase, 95% CI [1.60, 2.19]; 0.54 per SD of decline; both</w:t>
+      </w:r>
+      <w:r>
+        <w:t xml:space="preserve"> </w:t>
+      </w:r>
+      <w:r>
+        <w:rPr>
+          <w:i/>
+          <w:iCs/>
+        </w:rPr>
+        <w:t xml:space="preserve">p</w:t>
+      </w:r>
+      <w:r>
+        <w:t xml:space="preserve"> </w:t>
+      </w:r>
+      <w:r>
+        <w:t xml:space="preserve">&lt; .001) predicted senior status four or more years later (CV-AUC = 0.762): decline predicts exit among athletes who are all, at measurement, still active.</w:t>
+      </w:r>
+    </w:p>
+    <w:p>
+      <w:pPr>
+        <w:pStyle w:val="BodyText"/>
+      </w:pPr>
+      <w:r>
+        <w:t xml:space="preserve">Third, exit-aligned trajectories. Aligned to each dropout’s own final active season (n = 1,146 with final seasons at ages 15–19), median volumes at T−3, T−2, T−1, and T were 12, 10, 9, and 4 meets; 95% were still competing in their penultimate season, and among final seasons at 16+ (n = 800), 74% had a</w:t>
+      </w:r>
+      <w:r>
+        <w:t xml:space="preserve"> </w:t>
+      </w:r>
+      <w:r>
+        <w:rPr>
+          <w:i/>
+          <w:iCs/>
+        </w:rPr>
+        <w:t xml:space="preserve">reduced-but-nonzero</w:t>
+      </w:r>
+      <w:r>
+        <w:t xml:space="preserve"> </w:t>
+      </w:r>
+      <w:r>
+        <w:t xml:space="preserve">penultimate season relative to their earlier peak, 6.5% a gap year, and 20% exited from peak volume (Supplementary Table S19).</w:t>
+      </w:r>
+    </w:p>
+    <w:p>
+      <w:pPr>
+        <w:pStyle w:val="BodyText"/>
+      </w:pPr>
+      <w:r>
+        <w:t xml:space="preserve">Fourth, the athlete fixed-effects model (1,909 athletes; Supplementary Table S28, Supplementary Figure S5) placed volume 7% (95% CI 0–13%), 12% (5–19%), and 23% (16–31%) below each athlete’s own earlier level three, two, and one season(s) before the final active season, net of the common age profile; the decline steepened towards exit (</w:t>
+      </w:r>
+      <w:r>
+        <w:rPr>
+          <w:i/>
+          <w:iCs/>
+        </w:rPr>
+        <w:t xml:space="preserve">p</w:t>
+      </w:r>
+      <w:r>
+        <w:t xml:space="preserve"> </w:t>
+      </w:r>
+      <w:r>
+        <w:t xml:space="preserve">&lt; .001) and was reproduced among exits at ages 17–19.</w:t>
+      </w:r>
+    </w:p>
+    <w:p>
+      <w:pPr>
+        <w:pStyle w:val="BodyText"/>
+      </w:pPr>
+      <w:r>
+        <w:t xml:space="preserve">[</w:t>
+      </w:r>
       <w:r>
         <w:rPr>
           <w:b/>
           <w:bCs/>
         </w:rPr>
-        <w:t xml:space="preserve">Early behavioral heterogeneity and within-athlete decline contribute independently; they are not substitutes.</w:t>
-      </w:r>
-      <w:r>
-        <w:t xml:space="preserve"> </w:t>
-      </w:r>
-      <w:r>
-        <w:t xml:space="preserve">Four analyses separate the two readings of Figure 2.</w:t>
+        <w:t xml:space="preserve">Table 4 about here</w:t>
+      </w:r>
+      <w:r>
+        <w:t xml:space="preserve">]</w:t>
+      </w:r>
+    </w:p>
+    <w:bookmarkEnd w:id="38"/>
+    <w:bookmarkStart w:id="39" w:name="time-aligned-behavior-vs.-performance"/>
+    <w:p>
+      <w:pPr>
+        <w:pStyle w:val="Heading2"/>
+      </w:pPr>
+      <w:r>
+        <w:t xml:space="preserve">3.6 Time-aligned behavior vs. performance</w:t>
+      </w:r>
+    </w:p>
+    <w:p>
+      <w:pPr>
+        <w:pStyle w:val="FirstParagraph"/>
+      </w:pPr>
+      <w:r>
+        <w:t xml:space="preserve">In a fully time-aligned comparison, with behavior and performance both measured at ages 13–14 to remove any temporal advantage, volume discriminated somewhat better than baseline performance: CV-AUC = 0.700 for sex + baseline Tyrving and 0.740 for sex + volume (difference 0.040, 95% CI 0.006–0.074; Supplementary Table S27). The two were complementary: adding Tyrving to volume raised the AUC by 0.023 (0.007–0.038). With its within-baseline trajectory (change from 13 to 14), performance matched volume (0.737 vs. 0.736; n = 1,721). Because Tyrving norms are unequally demanding across event groups (mean baseline-meet points 798 in sprints, 501 in throws), we also ranked athletes within event, sex and age at the baseline meet; this rank discriminated less well (0.689).</w:t>
       </w:r>
     </w:p>
     <w:p>
@@ -1533,7 +1659,61 @@
         <w:pStyle w:val="BodyText"/>
       </w:pPr>
       <w:r>
-        <w:t xml:space="preserve">First, level and change. Among athletes still active at age 14 (1,914; complete-case model n = 1,888), the age-14 volume level (OR = 2.70 per SD, 95% CI [2.33, 3.12]) and the change from age 14 to 15 (OR = 2.38 per SD increase, 95% CI [2.08, 2.73]; i.e., OR = 0.42 per SD, about 6.5 meets, of decline) contributed independently (both</w:t>
+        <w:t xml:space="preserve">Volume and performance were moderately correlated (Spearman ρ = .35 with baseline Tyrving; .52 with pre-15 peak; .63 for milestone volume vs. age-15 Tyrving), but above-median volume was associated with higher senior retention within every baseline-Tyrving quartile, from 15.8% vs. 3.9% in the lowest to 38.1% vs. 13.5% in the highest (Supplementary Table S32). Volume is related to, but clearly not reducible to, performance level.</w:t>
+      </w:r>
+    </w:p>
+    <w:bookmarkEnd w:id="39"/>
+    <w:bookmarkStart w:id="40" w:name="X5edab9ffdb59cfb1a6c0e842c5a243c15ec97ab"/>
+    <w:p>
+      <w:pPr>
+        <w:pStyle w:val="Heading2"/>
+      </w:pPr>
+      <w:r>
+        <w:t xml:space="preserve">3.7 Landmark analysis: post-baseline behavior among continuing athletes</w:t>
+      </w:r>
+    </w:p>
+    <w:p>
+      <w:pPr>
+        <w:pStyle w:val="FirstParagraph"/>
+      </w:pPr>
+      <w:r>
+        <w:t xml:space="preserve">Conditioning on athletes still in their career at age 16 (final active season at 16 or later; n = 1,148), volume across ages 15–16 was the largest contributor to subsequent cessation risk (HR = 0.68 per SD, 95% CI [0.62, 0.74], C-index = 0.695; complete-case n = 1,147; Supplementary Table S8). The baseline-only Cox model, with its clock starting at the end of the age-14 season (volume HR = 0.65 per SD, 95% CI [0.62, 0.69]; Supplementary Tables S10 and S16), a period-specific decomposition (Table 5), and diagnostics (Supplementary Tables S1, S6, S11, S17; Supplementary Figure S4) are descriptive companions; post-baseline Cox estimates are not primary (predictor and at-risk window overlap), and their contamination-free analogue is the change model in Section 3.5.</w:t>
+      </w:r>
+    </w:p>
+    <w:p>
+      <w:pPr>
+        <w:pStyle w:val="BodyText"/>
+      </w:pPr>
+      <w:r>
+        <w:t xml:space="preserve">[</w:t>
+      </w:r>
+      <w:r>
+        <w:rPr>
+          <w:b/>
+          <w:bCs/>
+        </w:rPr>
+        <w:t xml:space="preserve">Table 5 about here</w:t>
+      </w:r>
+      <w:r>
+        <w:t xml:space="preserve">]</w:t>
+      </w:r>
+    </w:p>
+    <w:bookmarkEnd w:id="40"/>
+    <w:bookmarkStart w:id="41" w:name="prospective-early-warning-thresholds"/>
+    <w:p>
+      <w:pPr>
+        <w:pStyle w:val="Heading2"/>
+      </w:pPr>
+      <w:r>
+        <w:t xml:space="preserve">3.8 Prospective early-warning thresholds</w:t>
+      </w:r>
+    </w:p>
+    <w:p>
+      <w:pPr>
+        <w:pStyle w:val="FirstParagraph"/>
+      </w:pPr>
+      <w:r>
+        <w:t xml:space="preserve">Because the primary analysis uses only baseline-window data, a prospective rule can be evaluated at the end of the age-14 season (Table 6, with bootstrap CIs). At a moderate candidate threshold (vol &lt; 10 meets across ages 13–14, flagging 27.3%), senior retention was 5.5% among flagged athletes versus 20.3% among unflagged, a 3.7-fold difference in retention prospects (PPV = 0.95, sensitivity = 0.31); lower (&lt; 5) and higher (&lt; 15) thresholds narrow or broaden the screen. Two properties discipline use: PPV partly reflects the 84% base rate (~11-point precision gain), and NPV = 0.20 means unflagged athletes are</w:t>
       </w:r>
       <w:r>
         <w:t xml:space="preserve"> </w:t>
@@ -1543,31 +1723,86 @@
           <w:i/>
           <w:iCs/>
         </w:rPr>
-        <w:t xml:space="preserve">p</w:t>
-      </w:r>
-      <w:r>
-        <w:t xml:space="preserve"> </w:t>
-      </w:r>
-      <w:r>
-        <w:t xml:space="preserve">&lt; .001); adding change raised pseudo-</w:t>
+        <w:t xml:space="preserve">not</w:t>
+      </w:r>
+      <w:r>
+        <w:t xml:space="preserve"> </w:t>
+      </w:r>
+      <w:r>
+        <w:t xml:space="preserve">“safe”</w:t>
+      </w:r>
+      <w:r>
+        <w:t xml:space="preserve">: four in five also fail to retain. Derived in one cohort and tested in the other, the rule held: the lowest volume quartile is &lt; 10 meets in both cohorts, and in the other cohort it gave retention of 4.6% versus 21.4% (Cohort B) and 6.0% versus 19.7% (Cohort A; Supplementary Table S29). Youden’s J favours broader screens (&lt; 21 to &lt; 29 meets), so &lt; 10 remains a candidate targeting rule.</w:t>
+      </w:r>
+    </w:p>
+    <w:p>
+      <w:pPr>
+        <w:pStyle w:val="BodyText"/>
+      </w:pPr>
+      <w:r>
+        <w:t xml:space="preserve">[</w:t>
+      </w:r>
+      <w:r>
+        <w:rPr>
+          <w:b/>
+          <w:bCs/>
+        </w:rPr>
+        <w:t xml:space="preserve">Table 6 about here</w:t>
+      </w:r>
+      <w:r>
+        <w:t xml:space="preserve">]</w:t>
+      </w:r>
+    </w:p>
+    <w:bookmarkEnd w:id="41"/>
+    <w:bookmarkStart w:id="42" w:name="Xce71a58b6e16173dc667ed72ce929a73f522038"/>
+    <w:p>
+      <w:pPr>
+        <w:pStyle w:val="Heading2"/>
+      </w:pPr>
+      <w:r>
+        <w:t xml:space="preserve">3.9 Within-sport event concentration and retention</w:t>
+      </w:r>
+    </w:p>
+    <w:p>
+      <w:pPr>
+        <w:pStyle w:val="FirstParagraph"/>
+      </w:pPr>
+      <w:r>
+        <w:t xml:space="preserve">Higher baseline HHI (more event-category concentration at ages 13–14) was associated with higher senior retention only once volume was in the model (OR = 1.18 per SD, 95% CI [1.04, 1.34]; without volume, 1.00), only in Cohort B (1.32; Cohort A 1.07 [0.90, 1.28]), without gain in discrimination (ΔAUC = −0.002), and not once performance in the athlete’s main event category was controlled (1.07 [0.94, 1.23]; Supplementary Table S18). Because HHI is bounded below by 1/(result count), we stress-tested for count-dependence; the association was unchanged under restriction to ≥5 and ≥8 results at ages 13–14 (OR = 1.17, 1.17) and a finite-sample-corrected index (OR = 1.20, 95% CI [1.05, 1.35]; Supplementary Table S20). The index captures concentration</w:t>
+      </w:r>
+      <w:r>
+        <w:t xml:space="preserve"> </w:t>
       </w:r>
       <w:r>
         <w:rPr>
           <w:i/>
           <w:iCs/>
         </w:rPr>
-        <w:t xml:space="preserve">R</w:t>
-      </w:r>
-      <w:r>
-        <w:t xml:space="preserve">² from 0.122 to 0.229 (Table 4).</w:t>
-      </w:r>
-    </w:p>
-    <w:p>
-      <w:pPr>
-        <w:pStyle w:val="BodyText"/>
-      </w:pPr>
-      <w:r>
-        <w:t xml:space="preserve">Second, because a change score spanning the exit could conflate decline with the exit itself, we repeated the test where no exit can contaminate it: among athletes still competing at age 16 (≥2 results; n = 1,075), volume at 15 (OR = 3.04, 95% CI [2.55, 3.62]) and change from 15 to 16 (OR = 1.88 per SD increase, 95% CI [1.60, 2.20]; 0.53 per SD of decline; both</w:t>
+        <w:t xml:space="preserve">within</w:t>
+      </w:r>
+      <w:r>
+        <w:t xml:space="preserve"> </w:t>
+      </w:r>
+      <w:r>
+        <w:t xml:space="preserve">track and field, not multisport diversification (§4.6).</w:t>
+      </w:r>
+    </w:p>
+    <w:bookmarkEnd w:id="42"/>
+    <w:bookmarkStart w:id="43" w:name="Xc24900d152d1ea4b537c2240c8708c9c2bfa41a"/>
+    <w:p>
+      <w:pPr>
+        <w:pStyle w:val="Heading2"/>
+      </w:pPr>
+      <w:r>
+        <w:t xml:space="preserve">3.10 Internal cohort replication and sensitivity</w:t>
+      </w:r>
+    </w:p>
+    <w:p>
+      <w:pPr>
+        <w:pStyle w:val="FirstParagraph"/>
+      </w:pPr>
+      <w:r>
+        <w:t xml:space="preserve">Re-estimated by cohort, the pre-milestone volume effect was reproduced: Cohort A OR = 2.03 (95% CI [1.72, 2.38]), Cohort B OR = 2.10 (95% CI [1.71, 2.58]), both</w:t>
       </w:r>
       <w:r>
         <w:t xml:space="preserve"> </w:t>
@@ -1583,52 +1818,7 @@
         <w:t xml:space="preserve"> </w:t>
       </w:r>
       <w:r>
-        <w:t xml:space="preserve">&lt; .001) predicted senior status four or more years later (CV-AUC = 0.761): decline predicts exit among athletes who are all, at measurement, still active.</w:t>
-      </w:r>
-    </w:p>
-    <w:p>
-      <w:pPr>
-        <w:pStyle w:val="BodyText"/>
-      </w:pPr>
-      <w:r>
-        <w:t xml:space="preserve">Third, exit-aligned trajectories. Aligned to each dropout’s own final active season (n = 1,139 with final seasons at ages 15–19), median volumes at T−3, T−2, T−1, and T were 12, 10, 9, and 4 meets; 95% were still competing in their penultimate season, and among final seasons at 16+ (n = 795), 74% had a</w:t>
-      </w:r>
-      <w:r>
-        <w:t xml:space="preserve"> </w:t>
-      </w:r>
-      <w:r>
-        <w:rPr>
-          <w:i/>
-          <w:iCs/>
-        </w:rPr>
-        <w:t xml:space="preserve">reduced-but-nonzero</w:t>
-      </w:r>
-      <w:r>
-        <w:t xml:space="preserve"> </w:t>
-      </w:r>
-      <w:r>
-        <w:t xml:space="preserve">penultimate season relative to their earlier peak, 6.5% a gap year, and 19% exited from peak volume (Supplementary Table S19).</w:t>
-      </w:r>
-    </w:p>
-    <w:p>
-      <w:pPr>
-        <w:pStyle w:val="BodyText"/>
-      </w:pPr>
-      <w:r>
-        <w:t xml:space="preserve">Fourth, the athlete fixed-effects model (1,897 athletes; Supplementary Table S28, Supplementary Figure S5) placed volume 7% (95% CI 0–13%), 12% (5–19%), and 24% (16–31%) below each athlete’s own earlier level three, two, and one season(s) before the final active season, net of the common age profile; the decline steepened towards exit (</w:t>
-      </w:r>
-      <w:r>
-        <w:rPr>
-          <w:i/>
-          <w:iCs/>
-        </w:rPr>
-        <w:t xml:space="preserve">p</w:t>
-      </w:r>
-      <w:r>
-        <w:t xml:space="preserve"> </w:t>
-      </w:r>
-      <w:r>
-        <w:t xml:space="preserve">&lt; .001) and was reproduced among exits at ages 17–19.</w:t>
+        <w:t xml:space="preserve">&lt; .001 (Table 7); female sex predicted lower and baseline performance higher retention in both cohorts.</w:t>
       </w:r>
     </w:p>
     <w:p>
@@ -1643,237 +1833,18 @@
           <w:b/>
           <w:bCs/>
         </w:rPr>
-        <w:t xml:space="preserve">Table 4 about here</w:t>
+        <w:t xml:space="preserve">Table 7 about here</w:t>
       </w:r>
       <w:r>
         <w:t xml:space="preserve">]</w:t>
       </w:r>
     </w:p>
-    <w:bookmarkEnd w:id="38"/>
-    <w:bookmarkStart w:id="39" w:name="time-aligned-behavior-vs.-performance"/>
-    <w:p>
-      <w:pPr>
-        <w:pStyle w:val="Heading2"/>
-      </w:pPr>
-      <w:r>
-        <w:t xml:space="preserve">3.6 Time-aligned behavior vs. performance</w:t>
-      </w:r>
-    </w:p>
-    <w:p>
-      <w:pPr>
-        <w:pStyle w:val="FirstParagraph"/>
-      </w:pPr>
-      <w:r>
-        <w:t xml:space="preserve">In a fully time-aligned comparison, with behavior and performance both measured at ages 13–14 to remove any temporal advantage, volume discriminated better: CV-AUC = 0.641 for sex + baseline Tyrving and 0.739 for sex + volume (difference 0.098, 95% CI 0.063–0.133), and adding Tyrving to volume changed nothing (difference −0.002 [−0.011, 0.007]; Supplementary Table S27). A within-baseline performance trajectory (Tyrving change from 13 to 14) raised performance-based discrimination to 0.701 (n = 1,692), narrowing but not reversing the gap (volume 0.734; difference 0.033 [−0.003, 0.069]).</w:t>
-      </w:r>
-    </w:p>
     <w:p>
       <w:pPr>
         <w:pStyle w:val="BodyText"/>
       </w:pPr>
       <w:r>
-        <w:t xml:space="preserve">Volume and performance were moderately correlated (Spearman ρ = .38 with baseline Tyrving; .55 with pre-15 peak; .60 for milestone volume vs. age-15 Tyrving), but above-median volume was associated with higher senior retention within every baseline-Tyrving quartile, from 15.4% vs. 9.5% in the lowest to 36.0% vs. 13.9% in the highest (Supplementary Table S32). Volume is related to, but clearly not reducible to, performance level.</w:t>
-      </w:r>
-    </w:p>
-    <w:bookmarkEnd w:id="39"/>
-    <w:bookmarkStart w:id="40" w:name="X5edab9ffdb59cfb1a6c0e842c5a243c15ec97ab"/>
-    <w:p>
-      <w:pPr>
-        <w:pStyle w:val="Heading2"/>
-      </w:pPr>
-      <w:r>
-        <w:t xml:space="preserve">3.7 Landmark analysis: post-baseline behavior among continuing athletes</w:t>
-      </w:r>
-    </w:p>
-    <w:p>
-      <w:pPr>
-        <w:pStyle w:val="FirstParagraph"/>
-      </w:pPr>
-      <w:r>
-        <w:t xml:space="preserve">Conditioning on athletes active at age 16 (≥1 result; n = 1,167), volume across ages 15–16 was the largest contributor to subsequent cessation risk (HR = 0.60 per SD, 95% CI [0.55, 0.66], C-index = 0.735; complete-case n = 1,153; Supplementary Table S8); excluding athletes with milestone volume = 0 gave HR = 0.52 (Supplementary Table S11). The baseline-only Cox model (Supplementary Table S16), a period-specific decomposition (Table 5), and diagnostics (Supplementary Tables S1, S6, S10, S17; Supplementary Figures S1, S4) are descriptive companions; post-baseline Cox estimates are not primary (predictor and at-risk window overlap), and their contamination-free analogue is the change model in Section 3.5.</w:t>
-      </w:r>
-    </w:p>
-    <w:p>
-      <w:pPr>
-        <w:pStyle w:val="BodyText"/>
-      </w:pPr>
-      <w:r>
-        <w:t xml:space="preserve">[</w:t>
-      </w:r>
-      <w:r>
-        <w:rPr>
-          <w:b/>
-          <w:bCs/>
-        </w:rPr>
-        <w:t xml:space="preserve">Table 5 about here</w:t>
-      </w:r>
-      <w:r>
-        <w:t xml:space="preserve">]</w:t>
-      </w:r>
-    </w:p>
-    <w:bookmarkEnd w:id="40"/>
-    <w:bookmarkStart w:id="41" w:name="prospective-early-warning-thresholds"/>
-    <w:p>
-      <w:pPr>
-        <w:pStyle w:val="Heading2"/>
-      </w:pPr>
-      <w:r>
-        <w:t xml:space="preserve">3.8 Prospective early-warning thresholds</w:t>
-      </w:r>
-    </w:p>
-    <w:p>
-      <w:pPr>
-        <w:pStyle w:val="FirstParagraph"/>
-      </w:pPr>
-      <w:r>
-        <w:t xml:space="preserve">Because the primary analysis uses only baseline-window data, a prospective rule can be evaluated at the end of the age-14 season (Table 6, with bootstrap CIs). At a moderate candidate threshold (vol &lt; 10 meets across ages 13–14, flagging 26.4%), senior retention was 5.7% among flagged athletes versus 20.2% among unflagged, a 3.5-fold difference in retention prospects (PPV = 0.94, sensitivity = 0.30); lower (&lt; 5) and higher (&lt; 15) thresholds narrow or broaden the screen. Two properties discipline use: PPV partly reflects the 84% base rate (~10-point precision gain), and NPV = 0.20 means unflagged athletes are</w:t>
-      </w:r>
-      <w:r>
-        <w:t xml:space="preserve"> </w:t>
-      </w:r>
-      <w:r>
-        <w:rPr>
-          <w:i/>
-          <w:iCs/>
-        </w:rPr>
-        <w:t xml:space="preserve">not</w:t>
-      </w:r>
-      <w:r>
-        <w:t xml:space="preserve"> </w:t>
-      </w:r>
-      <w:r>
-        <w:t xml:space="preserve">“safe”</w:t>
-      </w:r>
-      <w:r>
-        <w:t xml:space="preserve">: four in five also fail to retain. Derived in one cohort and tested in the other, the rule held: the lowest volume quartile in Cohort A is exactly &lt; 10 meets, which in Cohort B flagged 24.8%, with retention 4.9% versus 21.4% (PPV = 0.95), and the reverse direction was similar (Supplementary Table S29). Youden’s J favours broader screens (&lt; 21 to &lt; 29 meets), so &lt; 10 remains a candidate targeting rule.</w:t>
-      </w:r>
-    </w:p>
-    <w:p>
-      <w:pPr>
-        <w:pStyle w:val="BodyText"/>
-      </w:pPr>
-      <w:r>
-        <w:t xml:space="preserve">[</w:t>
-      </w:r>
-      <w:r>
-        <w:rPr>
-          <w:b/>
-          <w:bCs/>
-        </w:rPr>
-        <w:t xml:space="preserve">Table 6 about here</w:t>
-      </w:r>
-      <w:r>
-        <w:t xml:space="preserve">]</w:t>
-      </w:r>
-    </w:p>
-    <w:bookmarkEnd w:id="41"/>
-    <w:bookmarkStart w:id="42" w:name="Xce71a58b6e16173dc667ed72ce929a73f522038"/>
-    <w:p>
-      <w:pPr>
-        <w:pStyle w:val="Heading2"/>
-      </w:pPr>
-      <w:r>
-        <w:t xml:space="preserve">3.9 Within-sport event concentration and retention</w:t>
-      </w:r>
-    </w:p>
-    <w:p>
-      <w:pPr>
-        <w:pStyle w:val="FirstParagraph"/>
-      </w:pPr>
-      <w:r>
-        <w:t xml:space="preserve">Higher baseline HHI (more event-category concentration at ages 13–14) was associated with higher senior retention: OR = 1.27 per SD (95% CI [1.12, 1.44],</w:t>
-      </w:r>
-      <w:r>
-        <w:t xml:space="preserve"> </w:t>
-      </w:r>
-      <w:r>
-        <w:rPr>
-          <w:i/>
-          <w:iCs/>
-        </w:rPr>
-        <w:t xml:space="preserve">p</w:t>
-      </w:r>
-      <w:r>
-        <w:t xml:space="preserve"> </w:t>
-      </w:r>
-      <w:r>
-        <w:t xml:space="preserve">&lt; .001) in the primary regression and HR = 0.89 [0.85, 0.94] in the baseline-only Cox model, but the association was modest: clear in Cohort B (OR = 1.44), not significant in Cohort A (OR = 1.16, 95% CI [0.97, 1.37]), and without gain in discrimination (ΔAUC = −0.005 [−0.017, 0.008]). Because HHI is bounded below by 1/(result count), we stress-tested for count-dependence; the association was unchanged under restriction to ≥5 and ≥8 results at ages 13–14 (OR = 1.26, 1.24) and a finite-sample-corrected index (OR = 1.29, 95% CI [1.14, 1.46]; Supplementary Table S20): it is not a small-count artifact. The index captures concentration</w:t>
-      </w:r>
-      <w:r>
-        <w:t xml:space="preserve"> </w:t>
-      </w:r>
-      <w:r>
-        <w:rPr>
-          <w:i/>
-          <w:iCs/>
-        </w:rPr>
-        <w:t xml:space="preserve">within</w:t>
-      </w:r>
-      <w:r>
-        <w:t xml:space="preserve"> </w:t>
-      </w:r>
-      <w:r>
-        <w:t xml:space="preserve">track and field, not multisport diversification (§4.6).</w:t>
-      </w:r>
-    </w:p>
-    <w:bookmarkEnd w:id="42"/>
-    <w:bookmarkStart w:id="43" w:name="Xc24900d152d1ea4b537c2240c8708c9c2bfa41a"/>
-    <w:p>
-      <w:pPr>
-        <w:pStyle w:val="Heading2"/>
-      </w:pPr>
-      <w:r>
-        <w:t xml:space="preserve">3.10 Internal cohort replication and sensitivity</w:t>
-      </w:r>
-    </w:p>
-    <w:p>
-      <w:pPr>
-        <w:pStyle w:val="FirstParagraph"/>
-      </w:pPr>
-      <w:r>
-        <w:t xml:space="preserve">Re-estimated by cohort, the pre-milestone volume effect was reproduced: Cohort A OR = 2.22 (95% CI [1.89, 2.60]), Cohort B OR = 2.33 (95% CI [1.90, 2.87]), both</w:t>
-      </w:r>
-      <w:r>
-        <w:t xml:space="preserve"> </w:t>
-      </w:r>
-      <w:r>
-        <w:rPr>
-          <w:i/>
-          <w:iCs/>
-        </w:rPr>
-        <w:t xml:space="preserve">p</w:t>
-      </w:r>
-      <w:r>
-        <w:t xml:space="preserve"> </w:t>
-      </w:r>
-      <w:r>
-        <w:t xml:space="preserve">&lt; .001 (Table 7); female sex predicted lower retention in both cohorts.</w:t>
-      </w:r>
-    </w:p>
-    <w:p>
-      <w:pPr>
-        <w:pStyle w:val="BodyText"/>
-      </w:pPr>
-      <w:r>
-        <w:t xml:space="preserve">[</w:t>
-      </w:r>
-      <w:r>
-        <w:rPr>
-          <w:b/>
-          <w:bCs/>
-        </w:rPr>
-        <w:t xml:space="preserve">Table 7 about here</w:t>
-      </w:r>
-      <w:r>
-        <w:t xml:space="preserve">]</w:t>
-      </w:r>
-    </w:p>
-    <w:p>
-      <w:pPr>
-        <w:pStyle w:val="BodyText"/>
-      </w:pPr>
-      <w:r>
-        <w:t xml:space="preserve">On the primary specification, the effect was robust to outcome definition (OR = 2.16, 2.25, 2.08 across the three definitions; Supplementary Table S9), to the fixed-window outcome (ages 20–22: OR = 2.28; Supplementary Table S24), to multiple imputation (Supplementary Table S21), to treating temporary gaps as exits (Cox HR 0.54, 0.51, 0.50; Supplementary Table S30; only 4.4% of athletes who missed two consecutive seasons ever returned), and to cluster-robust standard errors (Supplementary Table S2). For unmeasured confounding, the E-value is 2.4 (odds ratio converted to a risk ratio of ≈1.50 for this common outcome; baseline-only Cox: 2.4; Supplementary Table S3): a confounder would need risk-ratio associations of ≈2.4 with both early volume and retention, stronger than any measured covariate, to explain the association away.</w:t>
+        <w:t xml:space="preserve">On the primary specification, the effect was robust to outcome definition (OR = 1.95, 2.04, 1.87 across the three definitions; Supplementary Table S9), to the fixed-window outcome (ages 20–22: OR = 2.08; Supplementary Table S24), to multiple imputation (Supplementary Table S21), to treating temporary gaps as exits (Cox HR 0.65, 0.62, 0.62; Supplementary Table S30; only 4.4% of athletes who missed two consecutive seasons ever returned), and to club-clustered standard errors (Supplementary Table S22). For unmeasured confounding, the E-value is 2.2 (confidence limit 2.0; Supplementary Table S3): a confounder would need risk-ratio associations of ≈2.2 with both early volume and retention, stronger than any measured covariate, to explain the association away.</w:t>
       </w:r>
     </w:p>
     <w:p>
@@ -1908,17 +1879,17 @@
         <w:pStyle w:val="FirstParagraph"/>
       </w:pPr>
       <w:r>
-        <w:t xml:space="preserve">Four findings emerge from this 14-year follow-up of 2,123 young athletes. First, competition volume at ages 13–14 was strongly and prospectively associated with retaining senior competition. Second, the association was reproduced in both birth cohorts and withstood structural controls, club random effects, club-grouped validation, and multiple imputation. Third, the dropout signal decomposed into two components: early behavioral heterogeneity visible at 13–14, and a within-athlete decline in competition participation before exit. Exit-aligned trajectories showed most dropouts tapering (median 12 → 10 → 9 → 4 meets across their last four seasons), each athlete’s volume fell below their own earlier level in the two seasons before exit, and decline predicted exit even among athletes all still active at 16. Fourth, higher event-category concentration within track and field was modestly associated with higher retention; this is a different construct from, not a contradiction of, multisport diversification (§4.6).</w:t>
+        <w:t xml:space="preserve">Four findings emerge from this 14-year follow-up of 2,138 young athletes. First, competition volume at ages 13–14 was strongly and prospectively associated with retaining senior competition, more strongly than performance measured in the same window, which nonetheless added complementary information. Second, the association was reproduced in both birth cohorts and withstood structural controls, club random effects, club-clustered and club-grouped validation, and multiple imputation. Third, the dropout signal decomposed into two components: early behavioral heterogeneity visible at 13–14, and a within-athlete decline in competition participation before exit. Exit-aligned trajectories showed most dropouts tapering (median 12 → 10 → 9 → 4 meets across their last four seasons), each athlete’s volume fell below their own earlier level in the two seasons before exit, and decline predicted exit even among athletes all still active at 16. Fourth, event-category concentration within track and field was not robustly associated with retention once performance in the athlete’s main event was taken into account; this is a different construct from, not a contradiction of, multisport diversification (§4.6).</w:t>
       </w:r>
     </w:p>
     <w:bookmarkEnd w:id="45"/>
-    <w:bookmarkStart w:id="46" w:name="Xd43e38b2e9a635f0e8c69db93183c1dd760b038"/>
+    <w:bookmarkStart w:id="46" w:name="X6e10a14ec842d509e460c37e9b714f61dcf7446"/>
     <w:p>
       <w:pPr>
         <w:pStyle w:val="Heading2"/>
       </w:pPr>
       <w:r>
-        <w:t xml:space="preserve">4.2 Competition volume discriminates retention better than performance</w:t>
+        <w:t xml:space="preserve">4.2 Competition volume and performance carry complementary information</w:t>
       </w:r>
     </w:p>
     <w:p>
@@ -1926,7 +1897,7 @@
         <w:pStyle w:val="FirstParagraph"/>
       </w:pPr>
       <w:r>
-        <w:t xml:space="preserve">Competition volume showed better discrimination of senior retention than performance (Tyrving score) measured in the same window (AUC difference 0.098; Section 3.6); a within-baseline performance trajectory narrowed but did not reverse the gap. Performance reflects capability; volume reflects the athlete’s own choices about taking part (licensed by the open-entry structure of Section 2.2), and those choices carry more information about later retention than capability does. Two caveats: volume is a near-noiseless count while Tyrving is a scored maximum, so part of the gap could be measurement precision (the within-stratum effects argue not all of it); and predictor and outcome both index registered activity, so volume’s advantage describes when disengagement becomes observable, not a causal mechanism.</w:t>
+        <w:t xml:space="preserve">Competition volume discriminated senior retention somewhat better than performance (Tyrving score) measured in the same window (AUC difference 0.040, 95% CI 0.006–0.074), but the two were complementary, and with its within-baseline trajectory performance matched volume (Section 3.6): Hypothesis 2 holds in a weak form, behavior discriminating at least as well as performance, not instead of it. Performance reflects capability; volume reflects the athlete’s own choices about taking part (licensed by the open-entry structure of Section 2.2), and those choices carry at least as much information about later retention as capability does, and partly different information. Two caveats: volume is a near-noiseless count while Tyrving is a scored maximum whose norms are not equally demanding across event groups, so part of the gap could be measurement precision (a within-event rank did not close it, and the within-stratum effects argue not all of it); and predictor and outcome both index registered activity, so volume’s advantage describes when disengagement becomes observable, not a causal mechanism.</w:t>
       </w:r>
     </w:p>
     <w:p>
@@ -2034,7 +2005,7 @@
         <w:pStyle w:val="FirstParagraph"/>
       </w:pPr>
       <w:r>
-        <w:t xml:space="preserve">Is the divergence in Figure 2 a within-athlete decline, or early differentiation only, or an artifact of averaging abrupt exits at heterogeneous ages? The exit-aligned and fixed-effects analyses answer at the individual level: 95% of dropouts were still competing in their penultimate season, only 19% exited directly from peak volume, and athletes competed 12% and 24% less than their own earlier level two seasons and one season before their final season. The typical exit is preceded by declining participation, not a cliff, although the register shows the timing of this decline, not its reasons (§4.2). Both components are nonetheless present: level and change carried independent information (Table 4), the pattern held in the contamination-free window (level OR = 3.04; change OR = 1.88 per SD increase), and future dropouts already differed at 13–14, consistent with retrospective evidence that dropouts’ developmental activities differ years before exit.</w:t>
+        <w:t xml:space="preserve">Is the divergence in Figure 2 a within-athlete decline, or early differentiation only, or an artifact of averaging abrupt exits at heterogeneous ages? The exit-aligned and fixed-effects analyses answer at the individual level: 95% of dropouts were still competing in their penultimate season, only 20% exited directly from peak volume, and athletes competed 12% and 23% less than their own earlier level two seasons and one season before their final season. The typical exit is preceded by declining participation, not a cliff, although the register shows the timing of this decline, not its reasons (§4.2). Both components are nonetheless present: level and change carried independent information (Table 4), the pattern held in the contamination-free window (level OR = 3.04; change OR = 1.87 per SD increase), and future dropouts already differed at 13–14, consistent with retrospective evidence that dropouts’ developmental activities differ years before exit.</w:t>
       </w:r>
       <w:r>
         <w:rPr>
@@ -2237,7 +2208,7 @@
         <w:t xml:space="preserve"> </w:t>
       </w:r>
       <w:r>
-        <w:t xml:space="preserve">= .33); adjusted, females retained at significantly lower odds in every layer of the primary model (OR = 0.76 sex-only, 0.61 full model; Table 3) and in both cohorts:</w:t>
+        <w:t xml:space="preserve">= .42); adjusted, females retained at significantly lower odds in every layer of the primary model (OR = 0.75 sex-only, 0.56 full model; Table 3) and in both cohorts:</w:t>
       </w:r>
       <w:r>
         <w:t xml:space="preserve"> </w:t>
@@ -2250,7 +2221,7 @@
         <w:t xml:space="preserve">conditional on the same early volume, concentration, and performance</w:t>
       </w:r>
       <w:r>
-        <w:t xml:space="preserve">, girls were less likely to remain, their higher early volumes partially masking the gap. The behavioral mechanism itself was similar across sexes (milestone-window volume HR = 0.44 for males and 0.45 for females; Supplementary Table S7), so the residual sex effect operates</w:t>
+        <w:t xml:space="preserve">, girls were less likely to remain, their higher early volumes partially masking the gap. The behavioral mechanism itself was similar across sexes (milestone-window volume HR = 0.46 for males and 0.45 for females; Supplementary Table S7), so the residual sex effect operates</w:t>
       </w:r>
       <w:r>
         <w:t xml:space="preserve"> </w:t>
@@ -2318,7 +2289,7 @@
         <w:pStyle w:val="FirstParagraph"/>
       </w:pPr>
       <w:r>
-        <w:t xml:space="preserve">Event-category concentration at ages 13–14 was modestly associated with greater senior retention (OR = 1.27 per SD; Cox HR = 0.89), robust to count-dependence tests but clear only in the younger cohort and without discriminative value (Section 3.9). That finding should not be read against the diversification literature, which concerns diversification</w:t>
+        <w:t xml:space="preserve">Event-category concentration at ages 13–14 was associated with greater senior retention only conditional on volume, only in the younger cohort, without discriminative value, and not once performance in the athlete’s main event was controlled (Section 3.9): concentrated athletes tend to be those who do well in their main event, and concentration itself adds little. That finding should not be read against the diversification literature, which concerns diversification</w:t>
       </w:r>
       <w:r>
         <w:t xml:space="preserve"> </w:t>
@@ -2399,7 +2370,7 @@
         <w:t xml:space="preserve"> </w:t>
       </w:r>
       <w:r>
-        <w:t xml:space="preserve">The outcome also differs (retention at 20, not elite performance), and HHI is not a proxy for main-event performance (r = −0.06; coefficient 1.23 when primary-category Tyrving is added; Supplementary Table S18). Governing bodies should read this neither as a license to push early specialization nor as grounds for forced diversification among motivated adolescents.</w:t>
+        <w:t xml:space="preserve">The outcome also differs (retention at 20, not elite performance), and the association that remains is largely accounted for by main-event performance (OR = 1.07 [0.94, 1.23] when primary-category Tyrving is added; Supplementary Table S18). Governing bodies should read this neither as a license to push early specialization nor as grounds for forced diversification among motivated adolescents.</w:t>
       </w:r>
     </w:p>
     <w:bookmarkEnd w:id="50"/>
@@ -2417,7 +2388,7 @@
         <w:pStyle w:val="FirstParagraph"/>
       </w:pPr>
       <w:r>
-        <w:t xml:space="preserve">Registers address two structural problems in dropout research: withdrawn athletes are hard to recruit, and retrospective accounts compress a continuous process into a remembered decision. They bring no new theory, but a longitudinal behavioral test of theories built largely on cross-sectional or short-prospective evidence: here a well-calibrated baseline-only signal (AUC = 0.746, unchanged under club-grouped validation), an internal cohort replication, and an E-value of ≈2.4.</w:t>
+        <w:t xml:space="preserve">Registers address two structural problems in dropout research: withdrawn athletes are hard to recruit, and retrospective accounts compress a continuous process into a remembered decision. They bring no new theory, but a longitudinal behavioral test of theories built largely on cross-sectional or short-prospective evidence: here a well-calibrated baseline-only signal (AUC = 0.767, unchanged under club-grouped validation), an internal cohort replication, and an E-value of ≈2.2.</w:t>
       </w:r>
     </w:p>
     <w:bookmarkEnd w:id="51"/>
@@ -2482,7 +2453,7 @@
         <w:t xml:space="preserve"> </w:t>
       </w:r>
       <w:r>
-        <w:t xml:space="preserve">Flag athletes whose ages-13–14 competition count falls below a candidate threshold. At &lt; 10 meets, the flag captures 26% of the cohort whose senior retention is 5.7%, versus 20.2% among the unflagged, a 3.5-fold difference computed automatically from data the federation already holds (Table 6; similar when derived in one birth cohort and applied to the other, Supplementary Table S29). Every flagged athlete is low-but-active (cohort entry guarantees a baseline meet), so the flag list is an outreach list, and the threshold behaves similarly against an activity-at-17 outcome (14% vs 51% still active). Two numbers discipline its use: sensitivity is 0.30, so most future dropouts are</w:t>
+        <w:t xml:space="preserve">Flag athletes whose ages-13–14 competition count falls below a candidate threshold. At &lt; 10 meets, the flag captures 27% of the cohort whose senior retention is 5.5%, versus 20.3% among the unflagged, a 3.7-fold difference computed automatically from data the federation already holds (Table 6; similar when derived in one birth cohort and applied to the other, Supplementary Table S29). Every flagged athlete is low-but-active (cohort entry guarantees a baseline meet), so the flag list is an outreach list, and the threshold behaves similarly against an activity-at-17 outcome (14% vs 51% still active). Two numbers discipline its use: sensitivity is 0.31, so most future dropouts are</w:t>
       </w:r>
       <w:r>
         <w:t xml:space="preserve"> </w:t>
@@ -2532,7 +2503,7 @@
         <w:t xml:space="preserve"> </w:t>
       </w:r>
       <w:r>
-        <w:t xml:space="preserve">Level and change carry independent information (Section 3.5): screen on level at end of age 14 and on change at end of age 15, the latter just after the first selective gate and ahead of the steepest attrition at 17.</w:t>
+        <w:t xml:space="preserve">Level and change carry independent information (Section 3.5): screen on level at end of age 14 and on change at end of age 15, the latter just after the first selective gate and ahead of the junior years, when the annual exit rate peaks.</w:t>
       </w:r>
     </w:p>
     <w:p>
@@ -2596,7 +2567,7 @@
         <w:t xml:space="preserve"> </w:t>
       </w:r>
       <w:r>
-        <w:t xml:space="preserve">Within-sport concentration was, if anything, associated with higher retention (§4.6); federations should not assume diversification pressure aids retention in this age group.</w:t>
+        <w:t xml:space="preserve">Within-sport concentration was not associated with lower retention (§4.6); federations should not assume diversification pressure aids retention in this age group.</w:t>
       </w:r>
     </w:p>
     <w:p>
@@ -2670,7 +2641,7 @@
         <w:t xml:space="preserve"> </w:t>
       </w:r>
       <w:r>
-        <w:t xml:space="preserve">volume declines. Third, the target population is the engaged core, athletes entered for the national 13–14 meet (29% of register athletes with a result at 13–14, but 77% of eventual seniors), not all young athletes; among casual participants outside the cohort, volume was also associated with retention (OR = 2.07 per 10 meets; Supplementary Table S31), but the thresholds and absolute rates apply to the engaged core. The three venues cover eastern, western, and mid Norway, with northern districts served by the mid-Norway venue. Fourth, predictor and outcome share a measurement scale; despite the baseline-only model, the change models, the exit-aligned and fixed-effects analyses, and landmark and zero-volume sensitivities, structural overlap remains a conceptual limitation of register-only designs. Fifth, the post-baseline Cox specification violated proportional hazards (Schoenfeld χ² = 277.1); its estimates are descriptive only. Sixth, the HHI treats event categories symmetrically although they co-occur unevenly (98% of hurdlers also sprinted), so identical values can represent different combination patterns. Seventh, the youngest cohort has at most four post-senior years of observation, though the fixed-window outcome gives near-identical results. Eighth, the thresholds are candidates calibrated to a complete-register, open-entry, club-pays system; they do not transfer to coach-gated or pay-to-play systems without re-derivation, and no intervention effect has been demonstrated: §4.8 is targeting logic, not evaluated policy.</w:t>
+        <w:t xml:space="preserve">volume declines. Third, the target population is the engaged core, athletes entered for the national 13–14 meet (29% of register athletes with a result at 13–14, but 80% of eventual seniors), not all young athletes; among casual participants outside the cohort, volume was also associated with retention (OR = 2.17 per 10 meets; Supplementary Table S31), but the thresholds and absolute rates apply to the engaged core. The three venues cover eastern, western, and mid Norway, with northern districts served by the mid-Norway venue. Fourth, predictor and outcome share a measurement scale; despite the baseline-only model, the change models, the exit-aligned and fixed-effects analyses, and the landmark analysis, structural overlap remains a conceptual limitation of register-only designs. Fifth, the post-baseline Cox specification violated proportional hazards (Schoenfeld χ² = 293.2); its estimates are descriptive only. Sixth, Tyrving norms are not equally demanding across event groups (throws and race walking score lower), and the HHI treats event categories symmetrically although they co-occur unevenly (98% of hurdlers also sprinted), so identical values can represent different combination patterns. Seventh, the youngest cohort has at most four post-senior years of observation, though the fixed-window outcome gives near-identical results. Eighth, the thresholds are candidates calibrated to a complete-register, open-entry, club-pays system; they do not transfer to coach-gated or pay-to-play systems without re-derivation, and no intervention effect has been demonstrated: §4.8 is targeting logic, not evaluated policy.</w:t>
       </w:r>
     </w:p>
     <w:bookmarkEnd w:id="53"/>
@@ -2706,7 +2677,7 @@
         <w:pStyle w:val="FirstParagraph"/>
       </w:pPr>
       <w:r>
-        <w:t xml:space="preserve">Senior retention in Norwegian youth track and field is prospectively associated with baseline-window competition behavior: athletes who already compete more at ages 13–14 retain at substantially higher rates, and those who decline retain at substantially lower rates. The decline is visible within athletes in the seasons before exit, and is no averaging artifact. The effect withstands structural, club-level, missing-data, and outcome-definition checks and is reproduced in both birth cohorts; early heterogeneity and within-athlete decline contribute independently. The findings are consistent with, though do not by themselves confirm, accounts of withdrawal as a gradual deliberative process, and they yield a register-implementable targeting rule whose intervention value, under the governance preconditions above, is now a testable question.</w:t>
+        <w:t xml:space="preserve">Senior retention in Norwegian youth track and field is prospectively associated with baseline-window competition behavior: athletes who already compete more at ages 13–14 retain at substantially higher rates, and those who decline retain at substantially lower rates. The decline is visible within athletes in the seasons before exit, and is no averaging artifact. The effect withstands structural, club-level, missing-data, and outcome-definition checks and is reproduced in both birth cohorts; early heterogeneity and within-athlete decline contribute independently, and baseline performance adds complementary information. The findings are consistent with, though do not by themselves confirm, accounts of withdrawal as a gradual deliberative process, and they yield a register-implementable targeting rule whose intervention value, under the governance preconditions above, is now a testable question.</w:t>
       </w:r>
     </w:p>
     <w:p>
@@ -3968,29 +3939,29 @@
               <w:pStyle w:val="Compact"/>
             </w:pPr>
             <w:r>
-              <w:t xml:space="preserve">1,301</w:t>
-            </w:r>
-          </w:p>
-        </w:tc>
-        <w:tc>
-          <w:tcPr/>
-          <w:p>
-            <w:pPr>
-              <w:pStyle w:val="Compact"/>
-            </w:pPr>
-            <w:r>
-              <w:t xml:space="preserve">822</w:t>
-            </w:r>
-          </w:p>
-        </w:tc>
-        <w:tc>
-          <w:tcPr/>
-          <w:p>
-            <w:pPr>
-              <w:pStyle w:val="Compact"/>
-            </w:pPr>
-            <w:r>
-              <w:t xml:space="preserve">2,123</w:t>
+              <w:t xml:space="preserve">1,309</w:t>
+            </w:r>
+          </w:p>
+        </w:tc>
+        <w:tc>
+          <w:tcPr/>
+          <w:p>
+            <w:pPr>
+              <w:pStyle w:val="Compact"/>
+            </w:pPr>
+            <w:r>
+              <w:t xml:space="preserve">829</w:t>
+            </w:r>
+          </w:p>
+        </w:tc>
+        <w:tc>
+          <w:tcPr/>
+          <w:p>
+            <w:pPr>
+              <w:pStyle w:val="Compact"/>
+            </w:pPr>
+            <w:r>
+              <w:t xml:space="preserve">2,138</w:t>
             </w:r>
           </w:p>
         </w:tc>
@@ -4014,29 +3985,29 @@
               <w:pStyle w:val="Compact"/>
             </w:pPr>
             <w:r>
-              <w:t xml:space="preserve">603</w:t>
-            </w:r>
-          </w:p>
-        </w:tc>
-        <w:tc>
-          <w:tcPr/>
-          <w:p>
-            <w:pPr>
-              <w:pStyle w:val="Compact"/>
-            </w:pPr>
-            <w:r>
-              <w:t xml:space="preserve">393</w:t>
-            </w:r>
-          </w:p>
-        </w:tc>
-        <w:tc>
-          <w:tcPr/>
-          <w:p>
-            <w:pPr>
-              <w:pStyle w:val="Compact"/>
-            </w:pPr>
-            <w:r>
-              <w:t xml:space="preserve">996</w:t>
+              <w:t xml:space="preserve">608</w:t>
+            </w:r>
+          </w:p>
+        </w:tc>
+        <w:tc>
+          <w:tcPr/>
+          <w:p>
+            <w:pPr>
+              <w:pStyle w:val="Compact"/>
+            </w:pPr>
+            <w:r>
+              <w:t xml:space="preserve">398</w:t>
+            </w:r>
+          </w:p>
+        </w:tc>
+        <w:tc>
+          <w:tcPr/>
+          <w:p>
+            <w:pPr>
+              <w:pStyle w:val="Compact"/>
+            </w:pPr>
+            <w:r>
+              <w:t xml:space="preserve">1,006</w:t>
             </w:r>
           </w:p>
         </w:tc>
@@ -4060,29 +4031,29 @@
               <w:pStyle w:val="Compact"/>
             </w:pPr>
             <w:r>
-              <w:t xml:space="preserve">684</w:t>
-            </w:r>
-          </w:p>
-        </w:tc>
-        <w:tc>
-          <w:tcPr/>
-          <w:p>
-            <w:pPr>
-              <w:pStyle w:val="Compact"/>
-            </w:pPr>
-            <w:r>
-              <w:t xml:space="preserve">419</w:t>
-            </w:r>
-          </w:p>
-        </w:tc>
-        <w:tc>
-          <w:tcPr/>
-          <w:p>
-            <w:pPr>
-              <w:pStyle w:val="Compact"/>
-            </w:pPr>
-            <w:r>
-              <w:t xml:space="preserve">1,103</w:t>
+              <w:t xml:space="preserve">700</w:t>
+            </w:r>
+          </w:p>
+        </w:tc>
+        <w:tc>
+          <w:tcPr/>
+          <w:p>
+            <w:pPr>
+              <w:pStyle w:val="Compact"/>
+            </w:pPr>
+            <w:r>
+              <w:t xml:space="preserve">430</w:t>
+            </w:r>
+          </w:p>
+        </w:tc>
+        <w:tc>
+          <w:tcPr/>
+          <w:p>
+            <w:pPr>
+              <w:pStyle w:val="Compact"/>
+            </w:pPr>
+            <w:r>
+              <w:t xml:space="preserve">1,130</w:t>
             </w:r>
           </w:p>
         </w:tc>
@@ -4106,29 +4077,29 @@
               <w:pStyle w:val="Compact"/>
             </w:pPr>
             <w:r>
-              <w:t xml:space="preserve">14</w:t>
-            </w:r>
-          </w:p>
-        </w:tc>
-        <w:tc>
-          <w:tcPr/>
-          <w:p>
-            <w:pPr>
-              <w:pStyle w:val="Compact"/>
-            </w:pPr>
-            <w:r>
-              <w:t xml:space="preserve">10</w:t>
-            </w:r>
-          </w:p>
-        </w:tc>
-        <w:tc>
-          <w:tcPr/>
-          <w:p>
-            <w:pPr>
-              <w:pStyle w:val="Compact"/>
-            </w:pPr>
-            <w:r>
-              <w:t xml:space="preserve">24</w:t>
+              <w:t xml:space="preserve">1</w:t>
+            </w:r>
+          </w:p>
+        </w:tc>
+        <w:tc>
+          <w:tcPr/>
+          <w:p>
+            <w:pPr>
+              <w:pStyle w:val="Compact"/>
+            </w:pPr>
+            <w:r>
+              <w:t xml:space="preserve">1</w:t>
+            </w:r>
+          </w:p>
+        </w:tc>
+        <w:tc>
+          <w:tcPr/>
+          <w:p>
+            <w:pPr>
+              <w:pStyle w:val="Compact"/>
+            </w:pPr>
+            <w:r>
+              <w:t xml:space="preserve">2</w:t>
             </w:r>
           </w:p>
         </w:tc>
@@ -4209,18 +4180,18 @@
               <w:pStyle w:val="Compact"/>
             </w:pPr>
             <w:r>
-              <w:t xml:space="preserve">41.6</w:t>
-            </w:r>
-          </w:p>
-        </w:tc>
-        <w:tc>
-          <w:tcPr/>
-          <w:p>
-            <w:pPr>
-              <w:pStyle w:val="Compact"/>
-            </w:pPr>
-            <w:r>
               <w:t xml:space="preserve">41.3</w:t>
+            </w:r>
+          </w:p>
+        </w:tc>
+        <w:tc>
+          <w:tcPr/>
+          <w:p>
+            <w:pPr>
+              <w:pStyle w:val="Compact"/>
+            </w:pPr>
+            <w:r>
+              <w:t xml:space="preserve">41.1</w:t>
             </w:r>
           </w:p>
         </w:tc>
@@ -4255,18 +4226,18 @@
               <w:pStyle w:val="Compact"/>
             </w:pPr>
             <w:r>
-              <w:t xml:space="preserve">17.3</w:t>
-            </w:r>
-          </w:p>
-        </w:tc>
-        <w:tc>
-          <w:tcPr/>
-          <w:p>
-            <w:pPr>
-              <w:pStyle w:val="Compact"/>
-            </w:pPr>
-            <w:r>
-              <w:t xml:space="preserve">16.4</w:t>
+              <w:t xml:space="preserve">17.0</w:t>
+            </w:r>
+          </w:p>
+        </w:tc>
+        <w:tc>
+          <w:tcPr/>
+          <w:p>
+            <w:pPr>
+              <w:pStyle w:val="Compact"/>
+            </w:pPr>
+            <w:r>
+              <w:t xml:space="preserve">16.3</w:t>
             </w:r>
           </w:p>
         </w:tc>
@@ -4290,29 +4261,29 @@
               <w:pStyle w:val="Compact"/>
             </w:pPr>
             <w:r>
-              <w:t xml:space="preserve">5.8</w:t>
-            </w:r>
-          </w:p>
-        </w:tc>
-        <w:tc>
-          <w:tcPr/>
-          <w:p>
-            <w:pPr>
-              <w:pStyle w:val="Compact"/>
-            </w:pPr>
-            <w:r>
-              <w:t xml:space="preserve">10.8</w:t>
-            </w:r>
-          </w:p>
-        </w:tc>
-        <w:tc>
-          <w:tcPr/>
-          <w:p>
-            <w:pPr>
-              <w:pStyle w:val="Compact"/>
-            </w:pPr>
-            <w:r>
-              <w:t xml:space="preserve">7.7</w:t>
+              <w:t xml:space="preserve">5.7</w:t>
+            </w:r>
+          </w:p>
+        </w:tc>
+        <w:tc>
+          <w:tcPr/>
+          <w:p>
+            <w:pPr>
+              <w:pStyle w:val="Compact"/>
+            </w:pPr>
+            <w:r>
+              <w:t xml:space="preserve">10.5</w:t>
+            </w:r>
+          </w:p>
+        </w:tc>
+        <w:tc>
+          <w:tcPr/>
+          <w:p>
+            <w:pPr>
+              <w:pStyle w:val="Compact"/>
+            </w:pPr>
+            <w:r>
+              <w:t xml:space="preserve">7.6</w:t>
             </w:r>
           </w:p>
         </w:tc>
@@ -4336,29 +4307,29 @@
               <w:pStyle w:val="Compact"/>
             </w:pPr>
             <w:r>
-              <w:t xml:space="preserve">712</w:t>
-            </w:r>
-          </w:p>
-        </w:tc>
-        <w:tc>
-          <w:tcPr/>
-          <w:p>
-            <w:pPr>
-              <w:pStyle w:val="Compact"/>
-            </w:pPr>
-            <w:r>
-              <w:t xml:space="preserve">715</w:t>
-            </w:r>
-          </w:p>
-        </w:tc>
-        <w:tc>
-          <w:tcPr/>
-          <w:p>
-            <w:pPr>
-              <w:pStyle w:val="Compact"/>
-            </w:pPr>
-            <w:r>
-              <w:t xml:space="preserve">713</w:t>
+              <w:t xml:space="preserve">816</w:t>
+            </w:r>
+          </w:p>
+        </w:tc>
+        <w:tc>
+          <w:tcPr/>
+          <w:p>
+            <w:pPr>
+              <w:pStyle w:val="Compact"/>
+            </w:pPr>
+            <w:r>
+              <w:t xml:space="preserve">836</w:t>
+            </w:r>
+          </w:p>
+        </w:tc>
+        <w:tc>
+          <w:tcPr/>
+          <w:p>
+            <w:pPr>
+              <w:pStyle w:val="Compact"/>
+            </w:pPr>
+            <w:r>
+              <w:t xml:space="preserve">824</w:t>
             </w:r>
           </w:p>
         </w:tc>
@@ -4382,18 +4353,18 @@
               <w:pStyle w:val="Compact"/>
             </w:pPr>
             <w:r>
-              <w:t xml:space="preserve">16</w:t>
-            </w:r>
-          </w:p>
-        </w:tc>
-        <w:tc>
-          <w:tcPr/>
-          <w:p>
-            <w:pPr>
-              <w:pStyle w:val="Compact"/>
-            </w:pPr>
-            <w:r>
-              <w:t xml:space="preserve">19</w:t>
+              <w:t xml:space="preserve">15</w:t>
+            </w:r>
+          </w:p>
+        </w:tc>
+        <w:tc>
+          <w:tcPr/>
+          <w:p>
+            <w:pPr>
+              <w:pStyle w:val="Compact"/>
+            </w:pPr>
+            <w:r>
+              <w:t xml:space="preserve">18</w:t>
             </w:r>
           </w:p>
         </w:tc>
@@ -4443,7 +4414,7 @@
         <w:t xml:space="preserve"> </w:t>
       </w:r>
       <w:r>
-        <w:t xml:space="preserve">is the outcome prevalence (≥2 results in any calendar year at age 20 or later). Tyrving points = the Norwegian Athletics Federation’s age-norm score, where 1,000 corresponds to the published reference performance for that event × sex × age combination; all baseline events scored with implement- and hurdle-specific norms (Supplementary Methods S-M3).</w:t>
+        <w:t xml:space="preserve">is the outcome prevalence (≥2 results in any calendar year at age 20 or later). Tyrving points = the Norwegian Athletics Federation’s age-norm score, where 1,000 corresponds to the published reference performance for that event × sex × age combination; all baseline events scored with implement- and hurdle-specific norms and the workbook’s own formulas (Supplementary Methods S-M3). Meets are counted as competition days (Section 2.4.3). Follow-up through 2025.</w:t>
       </w:r>
     </w:p>
     <w:p>
@@ -4603,29 +4574,29 @@
               <w:pStyle w:val="Compact"/>
             </w:pPr>
             <w:r>
-              <w:t xml:space="preserve">13 [6–21]</w:t>
-            </w:r>
-          </w:p>
-        </w:tc>
-        <w:tc>
-          <w:tcPr/>
-          <w:p>
-            <w:pPr>
-              <w:pStyle w:val="Compact"/>
-            </w:pPr>
-            <w:r>
-              <w:t xml:space="preserve">17 [10–25]</w:t>
-            </w:r>
-          </w:p>
-        </w:tc>
-        <w:tc>
-          <w:tcPr/>
-          <w:p>
-            <w:pPr>
-              <w:pStyle w:val="Compact"/>
-            </w:pPr>
-            <w:r>
-              <w:t xml:space="preserve">19 [11–27]</w:t>
+              <w:t xml:space="preserve">13 [6–20]</w:t>
+            </w:r>
+          </w:p>
+        </w:tc>
+        <w:tc>
+          <w:tcPr/>
+          <w:p>
+            <w:pPr>
+              <w:pStyle w:val="Compact"/>
+            </w:pPr>
+            <w:r>
+              <w:t xml:space="preserve">16.5 [10–24]</w:t>
+            </w:r>
+          </w:p>
+        </w:tc>
+        <w:tc>
+          <w:tcPr/>
+          <w:p>
+            <w:pPr>
+              <w:pStyle w:val="Compact"/>
+            </w:pPr>
+            <w:r>
+              <w:t xml:space="preserve">19 [11–26]</w:t>
             </w:r>
           </w:p>
         </w:tc>
@@ -4682,7 +4653,7 @@
               <w:pStyle w:val="Compact"/>
             </w:pPr>
             <w:r>
-              <w:t xml:space="preserve">1,775</w:t>
+              <w:t xml:space="preserve">1,790</w:t>
             </w:r>
           </w:p>
         </w:tc>
@@ -4769,7 +4740,7 @@
         <w:t xml:space="preserve"> </w:t>
       </w:r>
       <w:r>
-        <w:t xml:space="preserve">Values are median number of meets per year [IQR]. Future retainers and future dropouts already differ at ages 13–14; the gap widens further across the age-14-to-15 transition.</w:t>
+        <w:t xml:space="preserve">Values are median number of meets (competition days) per year [IQR]. Future retainers and future dropouts already differ at ages 13–14; the gap widens further across the age-14-to-15 transition.</w:t>
       </w:r>
     </w:p>
     <w:p>
@@ -4917,7 +4888,7 @@
               <w:pStyle w:val="Compact"/>
             </w:pPr>
             <w:r>
-              <w:t xml:space="preserve">0.76</w:t>
+              <w:t xml:space="preserve">0.75</w:t>
             </w:r>
           </w:p>
         </w:tc>
@@ -4939,29 +4910,29 @@
               <w:pStyle w:val="Compact"/>
             </w:pPr>
             <w:r>
-              <w:t xml:space="preserve">.019</w:t>
-            </w:r>
-          </w:p>
-        </w:tc>
-        <w:tc>
-          <w:tcPr/>
-          <w:p>
-            <w:pPr>
-              <w:pStyle w:val="Compact"/>
-            </w:pPr>
-            <w:r>
-              <w:t xml:space="preserve">0.535 [0.506, 0.564]</w:t>
-            </w:r>
-          </w:p>
-        </w:tc>
-        <w:tc>
-          <w:tcPr/>
-          <w:p>
-            <w:pPr>
-              <w:pStyle w:val="Compact"/>
-            </w:pPr>
-            <w:r>
-              <w:t xml:space="preserve">2,095</w:t>
+              <w:t xml:space="preserve">.016</w:t>
+            </w:r>
+          </w:p>
+        </w:tc>
+        <w:tc>
+          <w:tcPr/>
+          <w:p>
+            <w:pPr>
+              <w:pStyle w:val="Compact"/>
+            </w:pPr>
+            <w:r>
+              <w:t xml:space="preserve">0.535 [0.506, 0.565]</w:t>
+            </w:r>
+          </w:p>
+        </w:tc>
+        <w:tc>
+          <w:tcPr/>
+          <w:p>
+            <w:pPr>
+              <w:pStyle w:val="Compact"/>
+            </w:pPr>
+            <w:r>
+              <w:t xml:space="preserve">2,136</w:t>
             </w:r>
           </w:p>
         </w:tc>
@@ -4996,51 +4967,51 @@
               <w:pStyle w:val="Compact"/>
             </w:pPr>
             <w:r>
-              <w:t xml:space="preserve">0.69</w:t>
-            </w:r>
-          </w:p>
-        </w:tc>
-        <w:tc>
-          <w:tcPr/>
-          <w:p>
-            <w:pPr>
-              <w:pStyle w:val="Compact"/>
-            </w:pPr>
-            <w:r>
-              <w:t xml:space="preserve">[0.54, 0.87]</w:t>
-            </w:r>
-          </w:p>
-        </w:tc>
-        <w:tc>
-          <w:tcPr/>
-          <w:p>
-            <w:pPr>
-              <w:pStyle w:val="Compact"/>
-            </w:pPr>
-            <w:r>
-              <w:t xml:space="preserve">.002</w:t>
-            </w:r>
-          </w:p>
-        </w:tc>
-        <w:tc>
-          <w:tcPr/>
-          <w:p>
-            <w:pPr>
-              <w:pStyle w:val="Compact"/>
-            </w:pPr>
-            <w:r>
-              <w:t xml:space="preserve">0.641 [0.609, 0.673]</w:t>
-            </w:r>
-          </w:p>
-        </w:tc>
-        <w:tc>
-          <w:tcPr/>
-          <w:p>
-            <w:pPr>
-              <w:pStyle w:val="Compact"/>
-            </w:pPr>
-            <w:r>
-              <w:t xml:space="preserve">2,095</w:t>
+              <w:t xml:space="preserve">0.63</w:t>
+            </w:r>
+          </w:p>
+        </w:tc>
+        <w:tc>
+          <w:tcPr/>
+          <w:p>
+            <w:pPr>
+              <w:pStyle w:val="Compact"/>
+            </w:pPr>
+            <w:r>
+              <w:t xml:space="preserve">[0.50, 0.80]</w:t>
+            </w:r>
+          </w:p>
+        </w:tc>
+        <w:tc>
+          <w:tcPr/>
+          <w:p>
+            <w:pPr>
+              <w:pStyle w:val="Compact"/>
+            </w:pPr>
+            <w:r>
+              <w:t xml:space="preserve">&lt; .001</w:t>
+            </w:r>
+          </w:p>
+        </w:tc>
+        <w:tc>
+          <w:tcPr/>
+          <w:p>
+            <w:pPr>
+              <w:pStyle w:val="Compact"/>
+            </w:pPr>
+            <w:r>
+              <w:t xml:space="preserve">0.700 [0.671, 0.730]</w:t>
+            </w:r>
+          </w:p>
+        </w:tc>
+        <w:tc>
+          <w:tcPr/>
+          <w:p>
+            <w:pPr>
+              <w:pStyle w:val="Compact"/>
+            </w:pPr>
+            <w:r>
+              <w:t xml:space="preserve">2,136</w:t>
             </w:r>
           </w:p>
         </w:tc>
@@ -5072,18 +5043,18 @@
               <w:pStyle w:val="Compact"/>
             </w:pPr>
             <w:r>
-              <w:t xml:space="preserve">1.61</w:t>
-            </w:r>
-          </w:p>
-        </w:tc>
-        <w:tc>
-          <w:tcPr/>
-          <w:p>
-            <w:pPr>
-              <w:pStyle w:val="Compact"/>
-            </w:pPr>
-            <w:r>
-              <w:t xml:space="preserve">[1.39, 1.87]</w:t>
+              <w:t xml:space="preserve">2.54</w:t>
+            </w:r>
+          </w:p>
+        </w:tc>
+        <w:tc>
+          <w:tcPr/>
+          <w:p>
+            <w:pPr>
+              <w:pStyle w:val="Compact"/>
+            </w:pPr>
+            <w:r>
+              <w:t xml:space="preserve">[2.14, 3.02]</w:t>
             </w:r>
           </w:p>
         </w:tc>
@@ -5145,51 +5116,51 @@
               <w:pStyle w:val="Compact"/>
             </w:pPr>
             <w:r>
-              <w:t xml:space="preserve">0.69</w:t>
-            </w:r>
-          </w:p>
-        </w:tc>
-        <w:tc>
-          <w:tcPr/>
-          <w:p>
-            <w:pPr>
-              <w:pStyle w:val="Compact"/>
-            </w:pPr>
-            <w:r>
-              <w:t xml:space="preserve">[0.54, 0.87]</w:t>
-            </w:r>
-          </w:p>
-        </w:tc>
-        <w:tc>
-          <w:tcPr/>
-          <w:p>
-            <w:pPr>
-              <w:pStyle w:val="Compact"/>
-            </w:pPr>
-            <w:r>
-              <w:t xml:space="preserve">.002</w:t>
-            </w:r>
-          </w:p>
-        </w:tc>
-        <w:tc>
-          <w:tcPr/>
-          <w:p>
-            <w:pPr>
-              <w:pStyle w:val="Compact"/>
-            </w:pPr>
-            <w:r>
-              <w:t xml:space="preserve">0.636 [0.602, 0.670]</w:t>
-            </w:r>
-          </w:p>
-        </w:tc>
-        <w:tc>
-          <w:tcPr/>
-          <w:p>
-            <w:pPr>
-              <w:pStyle w:val="Compact"/>
-            </w:pPr>
-            <w:r>
-              <w:t xml:space="preserve">2,095</w:t>
+              <w:t xml:space="preserve">0.63</w:t>
+            </w:r>
+          </w:p>
+        </w:tc>
+        <w:tc>
+          <w:tcPr/>
+          <w:p>
+            <w:pPr>
+              <w:pStyle w:val="Compact"/>
+            </w:pPr>
+            <w:r>
+              <w:t xml:space="preserve">[0.50, 0.80]</w:t>
+            </w:r>
+          </w:p>
+        </w:tc>
+        <w:tc>
+          <w:tcPr/>
+          <w:p>
+            <w:pPr>
+              <w:pStyle w:val="Compact"/>
+            </w:pPr>
+            <w:r>
+              <w:t xml:space="preserve">&lt; .001</w:t>
+            </w:r>
+          </w:p>
+        </w:tc>
+        <w:tc>
+          <w:tcPr/>
+          <w:p>
+            <w:pPr>
+              <w:pStyle w:val="Compact"/>
+            </w:pPr>
+            <w:r>
+              <w:t xml:space="preserve">0.698 [0.668, 0.728]</w:t>
+            </w:r>
+          </w:p>
+        </w:tc>
+        <w:tc>
+          <w:tcPr/>
+          <w:p>
+            <w:pPr>
+              <w:pStyle w:val="Compact"/>
+            </w:pPr>
+            <w:r>
+              <w:t xml:space="preserve">2,136</w:t>
             </w:r>
           </w:p>
         </w:tc>
@@ -5221,18 +5192,18 @@
               <w:pStyle w:val="Compact"/>
             </w:pPr>
             <w:r>
-              <w:t xml:space="preserve">1.64</w:t>
-            </w:r>
-          </w:p>
-        </w:tc>
-        <w:tc>
-          <w:tcPr/>
-          <w:p>
-            <w:pPr>
-              <w:pStyle w:val="Compact"/>
-            </w:pPr>
-            <w:r>
-              <w:t xml:space="preserve">[1.42, 1.90]</w:t>
+              <w:t xml:space="preserve">2.54</w:t>
+            </w:r>
+          </w:p>
+        </w:tc>
+        <w:tc>
+          <w:tcPr/>
+          <w:p>
+            <w:pPr>
+              <w:pStyle w:val="Compact"/>
+            </w:pPr>
+            <w:r>
+              <w:t xml:space="preserve">[2.14, 3.02]</w:t>
             </w:r>
           </w:p>
         </w:tc>
@@ -5291,29 +5262,29 @@
               <w:pStyle w:val="Compact"/>
             </w:pPr>
             <w:r>
-              <w:t xml:space="preserve">1.12</w:t>
-            </w:r>
-          </w:p>
-        </w:tc>
-        <w:tc>
-          <w:tcPr/>
-          <w:p>
-            <w:pPr>
-              <w:pStyle w:val="Compact"/>
-            </w:pPr>
-            <w:r>
-              <w:t xml:space="preserve">[1.00, 1.26]</w:t>
-            </w:r>
-          </w:p>
-        </w:tc>
-        <w:tc>
-          <w:tcPr/>
-          <w:p>
-            <w:pPr>
-              <w:pStyle w:val="Compact"/>
-            </w:pPr>
-            <w:r>
-              <w:t xml:space="preserve">.054</w:t>
+              <w:t xml:space="preserve">1.00</w:t>
+            </w:r>
+          </w:p>
+        </w:tc>
+        <w:tc>
+          <w:tcPr/>
+          <w:p>
+            <w:pPr>
+              <w:pStyle w:val="Compact"/>
+            </w:pPr>
+            <w:r>
+              <w:t xml:space="preserve">[0.89, 1.13]</w:t>
+            </w:r>
+          </w:p>
+        </w:tc>
+        <w:tc>
+          <w:tcPr/>
+          <w:p>
+            <w:pPr>
+              <w:pStyle w:val="Compact"/>
+            </w:pPr>
+            <w:r>
+              <w:t xml:space="preserve">.956</w:t>
             </w:r>
           </w:p>
         </w:tc>
@@ -5364,18 +5335,18 @@
               <w:pStyle w:val="Compact"/>
             </w:pPr>
             <w:r>
-              <w:t xml:space="preserve">0.61</w:t>
-            </w:r>
-          </w:p>
-        </w:tc>
-        <w:tc>
-          <w:tcPr/>
-          <w:p>
-            <w:pPr>
-              <w:pStyle w:val="Compact"/>
-            </w:pPr>
-            <w:r>
-              <w:t xml:space="preserve">[0.47, 0.79]</w:t>
+              <w:t xml:space="preserve">0.56</w:t>
+            </w:r>
+          </w:p>
+        </w:tc>
+        <w:tc>
+          <w:tcPr/>
+          <w:p>
+            <w:pPr>
+              <w:pStyle w:val="Compact"/>
+            </w:pPr>
+            <w:r>
+              <w:t xml:space="preserve">[0.43, 0.72]</w:t>
             </w:r>
           </w:p>
         </w:tc>
@@ -5401,24 +5372,24 @@
                 <w:b/>
                 <w:bCs/>
               </w:rPr>
-              <w:t xml:space="preserve">0.746</w:t>
+              <w:t xml:space="preserve">0.767</w:t>
             </w:r>
             <w:r>
               <w:t xml:space="preserve"> </w:t>
             </w:r>
             <w:r>
-              <w:t xml:space="preserve">[0.716, 0.776]</w:t>
-            </w:r>
-          </w:p>
-        </w:tc>
-        <w:tc>
-          <w:tcPr/>
-          <w:p>
-            <w:pPr>
-              <w:pStyle w:val="Compact"/>
-            </w:pPr>
-            <w:r>
-              <w:t xml:space="preserve">2,095</w:t>
+              <w:t xml:space="preserve">[0.737, 0.797]</w:t>
+            </w:r>
+          </w:p>
+        </w:tc>
+        <w:tc>
+          <w:tcPr/>
+          <w:p>
+            <w:pPr>
+              <w:pStyle w:val="Compact"/>
+            </w:pPr>
+            <w:r>
+              <w:t xml:space="preserve">2,136</w:t>
             </w:r>
           </w:p>
         </w:tc>
@@ -5450,29 +5421,29 @@
               <w:pStyle w:val="Compact"/>
             </w:pPr>
             <w:r>
-              <w:t xml:space="preserve">1.23</w:t>
-            </w:r>
-          </w:p>
-        </w:tc>
-        <w:tc>
-          <w:tcPr/>
-          <w:p>
-            <w:pPr>
-              <w:pStyle w:val="Compact"/>
-            </w:pPr>
-            <w:r>
-              <w:t xml:space="preserve">[1.06, 1.42]</w:t>
-            </w:r>
-          </w:p>
-        </w:tc>
-        <w:tc>
-          <w:tcPr/>
-          <w:p>
-            <w:pPr>
-              <w:pStyle w:val="Compact"/>
-            </w:pPr>
-            <w:r>
-              <w:t xml:space="preserve">.006</w:t>
+              <w:t xml:space="preserve">1.75</w:t>
+            </w:r>
+          </w:p>
+        </w:tc>
+        <w:tc>
+          <w:tcPr/>
+          <w:p>
+            <w:pPr>
+              <w:pStyle w:val="Compact"/>
+            </w:pPr>
+            <w:r>
+              <w:t xml:space="preserve">[1.47, 2.08]</w:t>
+            </w:r>
+          </w:p>
+        </w:tc>
+        <w:tc>
+          <w:tcPr/>
+          <w:p>
+            <w:pPr>
+              <w:pStyle w:val="Compact"/>
+            </w:pPr>
+            <w:r>
+              <w:t xml:space="preserve">&lt; .001</w:t>
             </w:r>
           </w:p>
         </w:tc>
@@ -5520,29 +5491,29 @@
               <w:pStyle w:val="Compact"/>
             </w:pPr>
             <w:r>
-              <w:t xml:space="preserve">1.27</w:t>
-            </w:r>
-          </w:p>
-        </w:tc>
-        <w:tc>
-          <w:tcPr/>
-          <w:p>
-            <w:pPr>
-              <w:pStyle w:val="Compact"/>
-            </w:pPr>
-            <w:r>
-              <w:t xml:space="preserve">[1.12, 1.44]</w:t>
-            </w:r>
-          </w:p>
-        </w:tc>
-        <w:tc>
-          <w:tcPr/>
-          <w:p>
-            <w:pPr>
-              <w:pStyle w:val="Compact"/>
-            </w:pPr>
-            <w:r>
-              <w:t xml:space="preserve">&lt; .001</w:t>
+              <w:t xml:space="preserve">1.18</w:t>
+            </w:r>
+          </w:p>
+        </w:tc>
+        <w:tc>
+          <w:tcPr/>
+          <w:p>
+            <w:pPr>
+              <w:pStyle w:val="Compact"/>
+            </w:pPr>
+            <w:r>
+              <w:t xml:space="preserve">[1.04, 1.34]</w:t>
+            </w:r>
+          </w:p>
+        </w:tc>
+        <w:tc>
+          <w:tcPr/>
+          <w:p>
+            <w:pPr>
+              <w:pStyle w:val="Compact"/>
+            </w:pPr>
+            <w:r>
+              <w:t xml:space="preserve">.012</w:t>
             </w:r>
           </w:p>
         </w:tc>
@@ -5598,7 +5569,7 @@
                 <w:b/>
                 <w:bCs/>
               </w:rPr>
-              <w:t xml:space="preserve">2.25</w:t>
+              <w:t xml:space="preserve">2.04</w:t>
             </w:r>
           </w:p>
         </w:tc>
@@ -5613,7 +5584,7 @@
                 <w:b/>
                 <w:bCs/>
               </w:rPr>
-              <w:t xml:space="preserve">[1.99, 2.55]</w:t>
+              <w:t xml:space="preserve">[1.80, 2.32]</w:t>
             </w:r>
           </w:p>
         </w:tc>
@@ -5665,7 +5636,7 @@
         <w:t xml:space="preserve"> </w:t>
       </w:r>
       <w:r>
-        <w:t xml:space="preserve">Logistic regression for binary active senior status (≥2 registered results in any year at age 20+). Predictors are observed during the baseline window (ages 13–14) only, including HHI (results at ages 13–14). Pre-milestone volume is the sum of distinct meets attended at ages 13 and 14. Continuous covariates are z-standardized so ORs reflect per-SD effects. CV-AUC: mean of fold-level AUCs from stratified 5-fold cross-validation repeated 20 times, with standardization inside the training folds; 95% CI from the corrected resampled t (Supplementary Methods S-M4). Adding volume raised the AUC by 0.110 (95% CI 0.081–0.140; Supplementary Table S27). HHI is associated with retention once volume is entered (mutual adjustment) but does not improve discrimination (see also Discussion 4.6).</w:t>
+        <w:t xml:space="preserve">Logistic regression for binary active senior status (≥2 registered results in any year at age 20+). Predictors are observed during the baseline window (ages 13–14) only, including HHI (results at ages 13–14). Pre-milestone volume is the number of meets (competition days) at ages 13 and 14. Continuous covariates are z-standardized so ORs reflect per-SD effects. CV-AUC: mean of fold-level AUCs from stratified 5-fold cross-validation repeated 20 times, with standardization inside the training folds; 95% CI from the corrected resampled t (Supplementary Methods S-M4). Adding volume raised the AUC by 0.069 (95% CI 0.047 to 0.091; Supplementary Table S27). HHI is associated with retention only once volume is entered, does not improve discrimination, and is not robust to performance in the athlete’s main event category (Supplementary Table S18; Discussion 4.6).</w:t>
       </w:r>
     </w:p>
     <w:p>
@@ -5789,18 +5760,18 @@
               <w:pStyle w:val="Compact"/>
             </w:pPr>
             <w:r>
-              <w:t xml:space="preserve">0.60</w:t>
-            </w:r>
-          </w:p>
-        </w:tc>
-        <w:tc>
-          <w:tcPr/>
-          <w:p>
-            <w:pPr>
-              <w:pStyle w:val="Compact"/>
-            </w:pPr>
-            <w:r>
-              <w:t xml:space="preserve">[0.46, 0.77]</w:t>
+              <w:t xml:space="preserve">0.55</w:t>
+            </w:r>
+          </w:p>
+        </w:tc>
+        <w:tc>
+          <w:tcPr/>
+          <w:p>
+            <w:pPr>
+              <w:pStyle w:val="Compact"/>
+            </w:pPr>
+            <w:r>
+              <w:t xml:space="preserve">[0.42, 0.71]</w:t>
             </w:r>
           </w:p>
         </w:tc>
@@ -5843,29 +5814,29 @@
               <w:pStyle w:val="Compact"/>
             </w:pPr>
             <w:r>
-              <w:t xml:space="preserve">1.21</w:t>
-            </w:r>
-          </w:p>
-        </w:tc>
-        <w:tc>
-          <w:tcPr/>
-          <w:p>
-            <w:pPr>
-              <w:pStyle w:val="Compact"/>
-            </w:pPr>
-            <w:r>
-              <w:t xml:space="preserve">[1.04, 1.41]</w:t>
-            </w:r>
-          </w:p>
-        </w:tc>
-        <w:tc>
-          <w:tcPr/>
-          <w:p>
-            <w:pPr>
-              <w:pStyle w:val="Compact"/>
-            </w:pPr>
-            <w:r>
-              <w:t xml:space="preserve">.012</w:t>
+              <w:t xml:space="preserve">1.79</w:t>
+            </w:r>
+          </w:p>
+        </w:tc>
+        <w:tc>
+          <w:tcPr/>
+          <w:p>
+            <w:pPr>
+              <w:pStyle w:val="Compact"/>
+            </w:pPr>
+            <w:r>
+              <w:t xml:space="preserve">[1.50, 2.13]</w:t>
+            </w:r>
+          </w:p>
+        </w:tc>
+        <w:tc>
+          <w:tcPr/>
+          <w:p>
+            <w:pPr>
+              <w:pStyle w:val="Compact"/>
+            </w:pPr>
+            <w:r>
+              <w:t xml:space="preserve">&lt; .001</w:t>
             </w:r>
           </w:p>
         </w:tc>
@@ -5905,7 +5876,7 @@
                 <w:b/>
                 <w:bCs/>
               </w:rPr>
-              <w:t xml:space="preserve">2.20</w:t>
+              <w:t xml:space="preserve">2.05</w:t>
             </w:r>
           </w:p>
         </w:tc>
@@ -5920,7 +5891,7 @@
                 <w:b/>
                 <w:bCs/>
               </w:rPr>
-              <w:t xml:space="preserve">[1.94, 2.50]</w:t>
+              <w:t xml:space="preserve">[1.80, 2.33]</w:t>
             </w:r>
           </w:p>
         </w:tc>
@@ -5970,18 +5941,18 @@
               <w:pStyle w:val="Compact"/>
             </w:pPr>
             <w:r>
-              <w:t xml:space="preserve">0.60</w:t>
-            </w:r>
-          </w:p>
-        </w:tc>
-        <w:tc>
-          <w:tcPr/>
-          <w:p>
-            <w:pPr>
-              <w:pStyle w:val="Compact"/>
-            </w:pPr>
-            <w:r>
-              <w:t xml:space="preserve">[0.45, 0.79]</w:t>
+              <w:t xml:space="preserve">0.55</w:t>
+            </w:r>
+          </w:p>
+        </w:tc>
+        <w:tc>
+          <w:tcPr/>
+          <w:p>
+            <w:pPr>
+              <w:pStyle w:val="Compact"/>
+            </w:pPr>
+            <w:r>
+              <w:t xml:space="preserve">[0.42, 0.72]</w:t>
             </w:r>
           </w:p>
         </w:tc>
@@ -6024,29 +5995,29 @@
               <w:pStyle w:val="Compact"/>
             </w:pPr>
             <w:r>
-              <w:t xml:space="preserve">1.12</w:t>
-            </w:r>
-          </w:p>
-        </w:tc>
-        <w:tc>
-          <w:tcPr/>
-          <w:p>
-            <w:pPr>
-              <w:pStyle w:val="Compact"/>
-            </w:pPr>
-            <w:r>
-              <w:t xml:space="preserve">[0.96, 1.30]</w:t>
-            </w:r>
-          </w:p>
-        </w:tc>
-        <w:tc>
-          <w:tcPr/>
-          <w:p>
-            <w:pPr>
-              <w:pStyle w:val="Compact"/>
-            </w:pPr>
-            <w:r>
-              <w:t xml:space="preserve">.140</w:t>
+              <w:t xml:space="preserve">1.59</w:t>
+            </w:r>
+          </w:p>
+        </w:tc>
+        <w:tc>
+          <w:tcPr/>
+          <w:p>
+            <w:pPr>
+              <w:pStyle w:val="Compact"/>
+            </w:pPr>
+            <w:r>
+              <w:t xml:space="preserve">[1.33, 1.91]</w:t>
+            </w:r>
+          </w:p>
+        </w:tc>
+        <w:tc>
+          <w:tcPr/>
+          <w:p>
+            <w:pPr>
+              <w:pStyle w:val="Compact"/>
+            </w:pPr>
+            <w:r>
+              <w:t xml:space="preserve">&lt; .001</w:t>
             </w:r>
           </w:p>
         </w:tc>
@@ -6086,7 +6057,7 @@
                 <w:b/>
                 <w:bCs/>
               </w:rPr>
-              <w:t xml:space="preserve">2.70</w:t>
+              <w:t xml:space="preserve">2.51</w:t>
             </w:r>
           </w:p>
         </w:tc>
@@ -6101,7 +6072,7 @@
                 <w:b/>
                 <w:bCs/>
               </w:rPr>
-              <w:t xml:space="preserve">[2.33, 3.12]</w:t>
+              <w:t xml:space="preserve">[2.17, 2.89]</w:t>
             </w:r>
           </w:p>
         </w:tc>
@@ -6156,7 +6127,7 @@
                 <w:b/>
                 <w:bCs/>
               </w:rPr>
-              <w:t xml:space="preserve">2.38</w:t>
+              <w:t xml:space="preserve">2.29</w:t>
             </w:r>
           </w:p>
         </w:tc>
@@ -6171,7 +6142,7 @@
                 <w:b/>
                 <w:bCs/>
               </w:rPr>
-              <w:t xml:space="preserve">[2.08, 2.73]</w:t>
+              <w:t xml:space="preserve">[2.00, 2.62]</w:t>
             </w:r>
           </w:p>
         </w:tc>
@@ -6207,7 +6178,7 @@
         <w:t xml:space="preserve"> </w:t>
       </w:r>
       <w:r>
-        <w:t xml:space="preserve">Change = volume at 15 minus volume at 14 (positive = increase; mean −2.3, SD 6.5 meets). The OR of 2.38 per SD increase is equivalent to OR = 0.42 [0.37, 0.48] per SD of greater decline (about 6.5 fewer meets), conditional on the level at age 14; per 5 fewer meets, OR = 0.51. Because the model is linear in the logit, it is identical to one with volume at 14 and volume at 15 as separate levels (the per-meet OR for change equals the per-meet OR for volume at 15). Pseudo-R² (McFadden) rose from 0.122 (M1) to 0.229 (M2); CV-AUC 0.735 → 0.823. 26 of the 1,914 athletes active at 14 lack registered sex or a Tyrving score (sample n = 1,888). Both baseline level and within-athlete decline contribute substantially and independently.</w:t>
+        <w:t xml:space="preserve">Change = volume at 15 minus volume at 14 (positive = increase; mean −2.2, SD 6.4 meets). The OR of 2.29 per SD increase is equivalent to OR = 0.44 [0.38, 0.50] per SD of greater decline (about 6.4 fewer meets), conditional on the level at age 14; per 5 fewer meets, OR = 0.52. Because the model is linear in the logit, it is identical to one with volume at 14 and volume at 15 as separate levels (the per-meet OR for change equals the per-meet OR for volume at 15). Pseudo-R² (McFadden) rose from 0.150 (M1) to 0.245 (M2); CV-AUC 0.763 → 0.833. 1 of the 1,926 athletes active at 14 lacks registered sex or a Tyrving score (sample n = 1,925). Both baseline level and within-athlete decline contribute substantially and independently.</w:t>
       </w:r>
     </w:p>
     <w:p>
@@ -6308,29 +6279,29 @@
               <w:pStyle w:val="Compact"/>
             </w:pPr>
             <w:r>
-              <w:t xml:space="preserve">0.13 [0.11, 0.16]</w:t>
-            </w:r>
-          </w:p>
-        </w:tc>
-        <w:tc>
-          <w:tcPr/>
-          <w:p>
-            <w:pPr>
-              <w:pStyle w:val="Compact"/>
-            </w:pPr>
-            <w:r>
-              <w:t xml:space="preserve">0.70 [0.62, 0.80]</w:t>
-            </w:r>
-          </w:p>
-        </w:tc>
-        <w:tc>
-          <w:tcPr/>
-          <w:p>
-            <w:pPr>
-              <w:pStyle w:val="Compact"/>
-            </w:pPr>
-            <w:r>
-              <w:t xml:space="preserve">0.90 [0.74, 1.09]</w:t>
+              <w:t xml:space="preserve">0.14 [0.11, 0.16]</w:t>
+            </w:r>
+          </w:p>
+        </w:tc>
+        <w:tc>
+          <w:tcPr/>
+          <w:p>
+            <w:pPr>
+              <w:pStyle w:val="Compact"/>
+            </w:pPr>
+            <w:r>
+              <w:t xml:space="preserve">0.70 [0.62, 0.79]</w:t>
+            </w:r>
+          </w:p>
+        </w:tc>
+        <w:tc>
+          <w:tcPr/>
+          <w:p>
+            <w:pPr>
+              <w:pStyle w:val="Compact"/>
+            </w:pPr>
+            <w:r>
+              <w:t xml:space="preserve">0.93 [0.77, 1.12]</w:t>
             </w:r>
           </w:p>
         </w:tc>
@@ -6354,18 +6325,18 @@
               <w:pStyle w:val="Compact"/>
             </w:pPr>
             <w:r>
-              <w:t xml:space="preserve">0.78 [0.72, 0.85]</w:t>
-            </w:r>
-          </w:p>
-        </w:tc>
-        <w:tc>
-          <w:tcPr/>
-          <w:p>
-            <w:pPr>
-              <w:pStyle w:val="Compact"/>
-            </w:pPr>
-            <w:r>
-              <w:t xml:space="preserve">0.88 [0.77, 1.00]</w:t>
+              <w:t xml:space="preserve">0.79 [0.73, 0.86]</w:t>
+            </w:r>
+          </w:p>
+        </w:tc>
+        <w:tc>
+          <w:tcPr/>
+          <w:p>
+            <w:pPr>
+              <w:pStyle w:val="Compact"/>
+            </w:pPr>
+            <w:r>
+              <w:t xml:space="preserve">0.93 [0.81, 1.06]</w:t>
             </w:r>
           </w:p>
         </w:tc>
@@ -6400,29 +6371,29 @@
               <w:pStyle w:val="Compact"/>
             </w:pPr>
             <w:r>
-              <w:t xml:space="preserve">0.99 [0.94, 1.05]</w:t>
-            </w:r>
-          </w:p>
-        </w:tc>
-        <w:tc>
-          <w:tcPr/>
-          <w:p>
-            <w:pPr>
-              <w:pStyle w:val="Compact"/>
-            </w:pPr>
-            <w:r>
-              <w:t xml:space="preserve">0.96 [0.88, 1.06]</w:t>
-            </w:r>
-          </w:p>
-        </w:tc>
-        <w:tc>
-          <w:tcPr/>
-          <w:p>
-            <w:pPr>
-              <w:pStyle w:val="Compact"/>
-            </w:pPr>
-            <w:r>
-              <w:t xml:space="preserve">1.15 [0.97, 1.36]</w:t>
+              <w:t xml:space="preserve">0.93 [0.89, 0.98]</w:t>
+            </w:r>
+          </w:p>
+        </w:tc>
+        <w:tc>
+          <w:tcPr/>
+          <w:p>
+            <w:pPr>
+              <w:pStyle w:val="Compact"/>
+            </w:pPr>
+            <w:r>
+              <w:t xml:space="preserve">0.84 [0.76, 0.94]</w:t>
+            </w:r>
+          </w:p>
+        </w:tc>
+        <w:tc>
+          <w:tcPr/>
+          <w:p>
+            <w:pPr>
+              <w:pStyle w:val="Compact"/>
+            </w:pPr>
+            <w:r>
+              <w:t xml:space="preserve">1.05 [0.85, 1.28]</w:t>
             </w:r>
           </w:p>
         </w:tc>
@@ -6446,29 +6417,29 @@
               <w:pStyle w:val="Compact"/>
             </w:pPr>
             <w:r>
-              <w:t xml:space="preserve">1.02 [0.97, 1.08]</w:t>
-            </w:r>
-          </w:p>
-        </w:tc>
-        <w:tc>
-          <w:tcPr/>
-          <w:p>
-            <w:pPr>
-              <w:pStyle w:val="Compact"/>
-            </w:pPr>
-            <w:r>
-              <w:t xml:space="preserve">0.89 [0.81, 0.98]</w:t>
-            </w:r>
-          </w:p>
-        </w:tc>
-        <w:tc>
-          <w:tcPr/>
-          <w:p>
-            <w:pPr>
-              <w:pStyle w:val="Compact"/>
-            </w:pPr>
-            <w:r>
-              <w:t xml:space="preserve">1.01 [0.87, 1.17]</w:t>
+              <w:t xml:space="preserve">1.03 [0.98, 1.09]</w:t>
+            </w:r>
+          </w:p>
+        </w:tc>
+        <w:tc>
+          <w:tcPr/>
+          <w:p>
+            <w:pPr>
+              <w:pStyle w:val="Compact"/>
+            </w:pPr>
+            <w:r>
+              <w:t xml:space="preserve">0.90 [0.82, 0.99]</w:t>
+            </w:r>
+          </w:p>
+        </w:tc>
+        <w:tc>
+          <w:tcPr/>
+          <w:p>
+            <w:pPr>
+              <w:pStyle w:val="Compact"/>
+            </w:pPr>
+            <w:r>
+              <w:t xml:space="preserve">1.00 [0.86, 1.16]</w:t>
             </w:r>
           </w:p>
         </w:tc>
@@ -6492,29 +6463,29 @@
               <w:pStyle w:val="Compact"/>
             </w:pPr>
             <w:r>
-              <w:t xml:space="preserve">1.04 [0.93, 1.16]</w:t>
-            </w:r>
-          </w:p>
-        </w:tc>
-        <w:tc>
-          <w:tcPr/>
-          <w:p>
-            <w:pPr>
-              <w:pStyle w:val="Compact"/>
-            </w:pPr>
-            <w:r>
-              <w:t xml:space="preserve">1.40 [1.16, 1.68]</w:t>
-            </w:r>
-          </w:p>
-        </w:tc>
-        <w:tc>
-          <w:tcPr/>
-          <w:p>
-            <w:pPr>
-              <w:pStyle w:val="Compact"/>
-            </w:pPr>
-            <w:r>
-              <w:t xml:space="preserve">1.06 [0.78, 1.44]</w:t>
+              <w:t xml:space="preserve">1.07 [0.96, 1.19]</w:t>
+            </w:r>
+          </w:p>
+        </w:tc>
+        <w:tc>
+          <w:tcPr/>
+          <w:p>
+            <w:pPr>
+              <w:pStyle w:val="Compact"/>
+            </w:pPr>
+            <w:r>
+              <w:t xml:space="preserve">1.48 [1.23, 1.78]</w:t>
+            </w:r>
+          </w:p>
+        </w:tc>
+        <w:tc>
+          <w:tcPr/>
+          <w:p>
+            <w:pPr>
+              <w:pStyle w:val="Compact"/>
+            </w:pPr>
+            <w:r>
+              <w:t xml:space="preserve">1.03 [0.76, 1.41]</w:t>
             </w:r>
           </w:p>
         </w:tc>
@@ -6538,29 +6509,29 @@
               <w:pStyle w:val="Compact"/>
             </w:pPr>
             <w:r>
-              <w:t xml:space="preserve">2,095</w:t>
-            </w:r>
-          </w:p>
-        </w:tc>
-        <w:tc>
-          <w:tcPr/>
-          <w:p>
-            <w:pPr>
-              <w:pStyle w:val="Compact"/>
-            </w:pPr>
-            <w:r>
-              <w:t xml:space="preserve">812</w:t>
-            </w:r>
-          </w:p>
-        </w:tc>
-        <w:tc>
-          <w:tcPr/>
-          <w:p>
-            <w:pPr>
-              <w:pStyle w:val="Compact"/>
-            </w:pPr>
-            <w:r>
-              <w:t xml:space="preserve">331</w:t>
+              <w:t xml:space="preserve">2,136</w:t>
+            </w:r>
+          </w:p>
+        </w:tc>
+        <w:tc>
+          <w:tcPr/>
+          <w:p>
+            <w:pPr>
+              <w:pStyle w:val="Compact"/>
+            </w:pPr>
+            <w:r>
+              <w:t xml:space="preserve">823</w:t>
+            </w:r>
+          </w:p>
+        </w:tc>
+        <w:tc>
+          <w:tcPr/>
+          <w:p>
+            <w:pPr>
+              <w:pStyle w:val="Compact"/>
+            </w:pPr>
+            <w:r>
+              <w:t xml:space="preserve">335</w:t>
             </w:r>
           </w:p>
         </w:tc>
@@ -6584,29 +6555,29 @@
               <w:pStyle w:val="Compact"/>
             </w:pPr>
             <w:r>
-              <w:t xml:space="preserve">1,283</w:t>
-            </w:r>
-          </w:p>
-        </w:tc>
-        <w:tc>
-          <w:tcPr/>
-          <w:p>
-            <w:pPr>
-              <w:pStyle w:val="Compact"/>
-            </w:pPr>
-            <w:r>
-              <w:t xml:space="preserve">481</w:t>
-            </w:r>
-          </w:p>
-        </w:tc>
-        <w:tc>
-          <w:tcPr/>
-          <w:p>
-            <w:pPr>
-              <w:pStyle w:val="Compact"/>
-            </w:pPr>
-            <w:r>
-              <w:t xml:space="preserve">170</w:t>
+              <w:t xml:space="preserve">1,313</w:t>
+            </w:r>
+          </w:p>
+        </w:tc>
+        <w:tc>
+          <w:tcPr/>
+          <w:p>
+            <w:pPr>
+              <w:pStyle w:val="Compact"/>
+            </w:pPr>
+            <w:r>
+              <w:t xml:space="preserve">488</w:t>
+            </w:r>
+          </w:p>
+        </w:tc>
+        <w:tc>
+          <w:tcPr/>
+          <w:p>
+            <w:pPr>
+              <w:pStyle w:val="Compact"/>
+            </w:pPr>
+            <w:r>
+              <w:t xml:space="preserve">174</w:t>
             </w:r>
           </w:p>
         </w:tc>
@@ -6641,18 +6612,18 @@
               <w:pStyle w:val="Compact"/>
             </w:pPr>
             <w:r>
-              <w:t xml:space="preserve">0.657</w:t>
-            </w:r>
-          </w:p>
-        </w:tc>
-        <w:tc>
-          <w:tcPr/>
-          <w:p>
-            <w:pPr>
-              <w:pStyle w:val="Compact"/>
-            </w:pPr>
-            <w:r>
-              <w:t xml:space="preserve">0.581</w:t>
+              <w:t xml:space="preserve">0.660</w:t>
+            </w:r>
+          </w:p>
+        </w:tc>
+        <w:tc>
+          <w:tcPr/>
+          <w:p>
+            <w:pPr>
+              <w:pStyle w:val="Compact"/>
+            </w:pPr>
+            <w:r>
+              <w:t xml:space="preserve">0.580</w:t>
             </w:r>
           </w:p>
         </w:tc>
@@ -6822,18 +6793,18 @@
               <w:pStyle w:val="Compact"/>
             </w:pPr>
             <w:r>
-              <w:t xml:space="preserve">9.3</w:t>
-            </w:r>
-          </w:p>
-        </w:tc>
-        <w:tc>
-          <w:tcPr/>
-          <w:p>
-            <w:pPr>
-              <w:pStyle w:val="Compact"/>
-            </w:pPr>
-            <w:r>
-              <w:t xml:space="preserve">0.10 [0.09, 0.12]</w:t>
+              <w:t xml:space="preserve">9.5</w:t>
+            </w:r>
+          </w:p>
+        </w:tc>
+        <w:tc>
+          <w:tcPr/>
+          <w:p>
+            <w:pPr>
+              <w:pStyle w:val="Compact"/>
+            </w:pPr>
+            <w:r>
+              <w:t xml:space="preserve">0.11 [0.09, 0.12]</w:t>
             </w:r>
           </w:p>
         </w:tc>
@@ -6887,18 +6858,18 @@
               <w:pStyle w:val="Compact"/>
             </w:pPr>
             <w:r>
-              <w:t xml:space="preserve">7.1% [3.6, 11.3]</w:t>
-            </w:r>
-          </w:p>
-        </w:tc>
-        <w:tc>
-          <w:tcPr/>
-          <w:p>
-            <w:pPr>
-              <w:pStyle w:val="Compact"/>
-            </w:pPr>
-            <w:r>
-              <w:t xml:space="preserve">17.3% [15.7, 19.1]</w:t>
+              <w:t xml:space="preserve">6.9% [3.7, 10.7]</w:t>
+            </w:r>
+          </w:p>
+        </w:tc>
+        <w:tc>
+          <w:tcPr/>
+          <w:p>
+            <w:pPr>
+              <w:pStyle w:val="Compact"/>
+            </w:pPr>
+            <w:r>
+              <w:t xml:space="preserve">17.3% [15.6, 18.9]</w:t>
             </w:r>
           </w:p>
         </w:tc>
@@ -6922,18 +6893,18 @@
               <w:pStyle w:val="Compact"/>
             </w:pPr>
             <w:r>
-              <w:t xml:space="preserve">19.8</w:t>
-            </w:r>
-          </w:p>
-        </w:tc>
-        <w:tc>
-          <w:tcPr/>
-          <w:p>
-            <w:pPr>
-              <w:pStyle w:val="Compact"/>
-            </w:pPr>
-            <w:r>
-              <w:t xml:space="preserve">0.22 [0.20, 0.24]</w:t>
+              <w:t xml:space="preserve">20.4</w:t>
+            </w:r>
+          </w:p>
+        </w:tc>
+        <w:tc>
+          <w:tcPr/>
+          <w:p>
+            <w:pPr>
+              <w:pStyle w:val="Compact"/>
+            </w:pPr>
+            <w:r>
+              <w:t xml:space="preserve">0.23 [0.21, 0.25]</w:t>
             </w:r>
           </w:p>
         </w:tc>
@@ -6959,13 +6930,13 @@
                 <w:b/>
                 <w:bCs/>
               </w:rPr>
-              <w:t xml:space="preserve">0.94</w:t>
+              <w:t xml:space="preserve">0.95</w:t>
             </w:r>
             <w:r>
               <w:t xml:space="preserve"> </w:t>
             </w:r>
             <w:r>
-              <w:t xml:space="preserve">[0.92, 0.96]</w:t>
+              <w:t xml:space="preserve">[0.92, 0.97]</w:t>
             </w:r>
           </w:p>
         </w:tc>
@@ -6987,18 +6958,18 @@
               <w:pStyle w:val="Compact"/>
             </w:pPr>
             <w:r>
-              <w:t xml:space="preserve">5.7% [3.6, 7.9]</w:t>
-            </w:r>
-          </w:p>
-        </w:tc>
-        <w:tc>
-          <w:tcPr/>
-          <w:p>
-            <w:pPr>
-              <w:pStyle w:val="Compact"/>
-            </w:pPr>
-            <w:r>
-              <w:t xml:space="preserve">19.0% [17.2, 21.0]</w:t>
+              <w:t xml:space="preserve">5.5% [3.4, 7.8]</w:t>
+            </w:r>
+          </w:p>
+        </w:tc>
+        <w:tc>
+          <w:tcPr/>
+          <w:p>
+            <w:pPr>
+              <w:pStyle w:val="Compact"/>
+            </w:pPr>
+            <w:r>
+              <w:t xml:space="preserve">19.0% [17.2, 20.9]</w:t>
             </w:r>
           </w:p>
         </w:tc>
@@ -7022,18 +6993,18 @@
               <w:pStyle w:val="Compact"/>
             </w:pPr>
             <w:r>
-              <w:t xml:space="preserve">26.4</w:t>
-            </w:r>
-          </w:p>
-        </w:tc>
-        <w:tc>
-          <w:tcPr/>
-          <w:p>
-            <w:pPr>
-              <w:pStyle w:val="Compact"/>
-            </w:pPr>
-            <w:r>
-              <w:t xml:space="preserve">0.30 [0.28, 0.32]</w:t>
+              <w:t xml:space="preserve">27.3</w:t>
+            </w:r>
+          </w:p>
+        </w:tc>
+        <w:tc>
+          <w:tcPr/>
+          <w:p>
+            <w:pPr>
+              <w:pStyle w:val="Compact"/>
+            </w:pPr>
+            <w:r>
+              <w:t xml:space="preserve">0.31 [0.29, 0.33]</w:t>
             </w:r>
           </w:p>
         </w:tc>
@@ -7059,13 +7030,13 @@
                 <w:b/>
                 <w:bCs/>
               </w:rPr>
-              <w:t xml:space="preserve">0.94</w:t>
+              <w:t xml:space="preserve">0.95</w:t>
             </w:r>
             <w:r>
               <w:t xml:space="preserve"> </w:t>
             </w:r>
             <w:r>
-              <w:t xml:space="preserve">[0.92, 0.96]</w:t>
+              <w:t xml:space="preserve">[0.93, 0.96]</w:t>
             </w:r>
           </w:p>
         </w:tc>
@@ -7087,18 +7058,18 @@
               <w:pStyle w:val="Compact"/>
             </w:pPr>
             <w:r>
-              <w:t xml:space="preserve">5.7% [3.9, 7.7]</w:t>
-            </w:r>
-          </w:p>
-        </w:tc>
-        <w:tc>
-          <w:tcPr/>
-          <w:p>
-            <w:pPr>
-              <w:pStyle w:val="Compact"/>
-            </w:pPr>
-            <w:r>
-              <w:t xml:space="preserve">20.2% [18.3, 22.2]</w:t>
+              <w:t xml:space="preserve">5.5% [3.7, 7.4]</w:t>
+            </w:r>
+          </w:p>
+        </w:tc>
+        <w:tc>
+          <w:tcPr/>
+          <w:p>
+            <w:pPr>
+              <w:pStyle w:val="Compact"/>
+            </w:pPr>
+            <w:r>
+              <w:t xml:space="preserve">20.3% [18.3, 22.4]</w:t>
             </w:r>
           </w:p>
         </w:tc>
@@ -7122,29 +7093,29 @@
               <w:pStyle w:val="Compact"/>
             </w:pPr>
             <w:r>
-              <w:t xml:space="preserve">43.1</w:t>
-            </w:r>
-          </w:p>
-        </w:tc>
-        <w:tc>
-          <w:tcPr/>
-          <w:p>
-            <w:pPr>
-              <w:pStyle w:val="Compact"/>
-            </w:pPr>
-            <w:r>
-              <w:t xml:space="preserve">0.48 [0.46, 0.50]</w:t>
-            </w:r>
-          </w:p>
-        </w:tc>
-        <w:tc>
-          <w:tcPr/>
-          <w:p>
-            <w:pPr>
-              <w:pStyle w:val="Compact"/>
-            </w:pPr>
-            <w:r>
-              <w:t xml:space="preserve">0.82 [0.77, 0.85]</w:t>
+              <w:t xml:space="preserve">44.4</w:t>
+            </w:r>
+          </w:p>
+        </w:tc>
+        <w:tc>
+          <w:tcPr/>
+          <w:p>
+            <w:pPr>
+              <w:pStyle w:val="Compact"/>
+            </w:pPr>
+            <w:r>
+              <w:t xml:space="preserve">0.49 [0.47, 0.52]</w:t>
+            </w:r>
+          </w:p>
+        </w:tc>
+        <w:tc>
+          <w:tcPr/>
+          <w:p>
+            <w:pPr>
+              <w:pStyle w:val="Compact"/>
+            </w:pPr>
+            <w:r>
+              <w:t xml:space="preserve">0.80 [0.76, 0.85]</w:t>
             </w:r>
           </w:p>
         </w:tc>
@@ -7165,7 +7136,7 @@
               <w:t xml:space="preserve"> </w:t>
             </w:r>
             <w:r>
-              <w:t xml:space="preserve">[0.91, 0.95]</w:t>
+              <w:t xml:space="preserve">[0.91, 0.94]</w:t>
             </w:r>
           </w:p>
         </w:tc>
@@ -7187,7 +7158,7 @@
               <w:pStyle w:val="Compact"/>
             </w:pPr>
             <w:r>
-              <w:t xml:space="preserve">7.0% [5.4, 8.7]</w:t>
+              <w:t xml:space="preserve">7.2% [5.5, 8.9]</w:t>
             </w:r>
           </w:p>
         </w:tc>
@@ -7219,7 +7190,7 @@
         <w:t xml:space="preserve"> </w:t>
       </w:r>
       <w:r>
-        <w:t xml:space="preserve">Classification performance of pre-milestone (ages 13–14) competition volume as a prospective early-warning indicator, applicable at the end of an athlete’s age-14 season, before the qualification window opens. All metrics are computed on one denominator (full cohort, n = 2,123); brackets are 2,000-replicate bootstrap 95% CIs. PPV is the proportion of flagged athletes who subsequently failed to retain senior activity. The final two columns give the absolute retention contrast: at the &lt; 10 threshold, 5.7% among flagged vs. 20.2% among unflagged athletes (a 3.5-fold difference). The high PPV partly reflects the population’s 84% non-retention base rate (the threshold improves precision by ~10 percentage points over base-rate prediction), and the NPV of ≈ 0.20 means unflagged athletes are not</w:t>
+        <w:t xml:space="preserve">Classification performance of pre-milestone (ages 13–14) competition volume as a prospective early-warning indicator, applicable at the end of an athlete’s age-14 season, before the qualification window opens. All metrics are computed on one denominator (full cohort, n = 2,138); brackets are 2,000-replicate bootstrap 95% CIs. PPV is the proportion of flagged athletes who subsequently failed to retain senior activity. The final two columns give the absolute retention contrast: at the &lt; 10 threshold, 5.5% among flagged vs. 20.3% among unflagged athletes (a 3.7-fold difference). The high PPV partly reflects the population’s 84% non-retention base rate (the threshold improves precision by ~11 percentage points over base-rate prediction), and the NPV of ≈ 0.20 means unflagged athletes are not</w:t>
       </w:r>
       <w:r>
         <w:t xml:space="preserve"> </w:t>
@@ -7353,7 +7324,7 @@
               <w:pStyle w:val="Compact"/>
             </w:pPr>
             <w:r>
-              <w:t xml:space="preserve">1,286</w:t>
+              <w:t xml:space="preserve">1,308</w:t>
             </w:r>
           </w:p>
         </w:tc>
@@ -7375,29 +7346,29 @@
               <w:pStyle w:val="Compact"/>
             </w:pPr>
             <w:r>
-              <w:t xml:space="preserve">0.64</w:t>
-            </w:r>
-          </w:p>
-        </w:tc>
-        <w:tc>
-          <w:tcPr/>
-          <w:p>
-            <w:pPr>
-              <w:pStyle w:val="Compact"/>
-            </w:pPr>
-            <w:r>
-              <w:t xml:space="preserve">[0.47, 0.89]</w:t>
-            </w:r>
-          </w:p>
-        </w:tc>
-        <w:tc>
-          <w:tcPr/>
-          <w:p>
-            <w:pPr>
-              <w:pStyle w:val="Compact"/>
-            </w:pPr>
-            <w:r>
-              <w:t xml:space="preserve">.008</w:t>
+              <w:t xml:space="preserve">0.57</w:t>
+            </w:r>
+          </w:p>
+        </w:tc>
+        <w:tc>
+          <w:tcPr/>
+          <w:p>
+            <w:pPr>
+              <w:pStyle w:val="Compact"/>
+            </w:pPr>
+            <w:r>
+              <w:t xml:space="preserve">[0.41, 0.79]</w:t>
+            </w:r>
+          </w:p>
+        </w:tc>
+        <w:tc>
+          <w:tcPr/>
+          <w:p>
+            <w:pPr>
+              <w:pStyle w:val="Compact"/>
+            </w:pPr>
+            <w:r>
+              <w:t xml:space="preserve">&lt; .001</w:t>
             </w:r>
           </w:p>
         </w:tc>
@@ -7437,29 +7408,29 @@
               <w:pStyle w:val="Compact"/>
             </w:pPr>
             <w:r>
-              <w:t xml:space="preserve">1.22</w:t>
-            </w:r>
-          </w:p>
-        </w:tc>
-        <w:tc>
-          <w:tcPr/>
-          <w:p>
-            <w:pPr>
-              <w:pStyle w:val="Compact"/>
-            </w:pPr>
-            <w:r>
-              <w:t xml:space="preserve">[1.01, 1.48]</w:t>
-            </w:r>
-          </w:p>
-        </w:tc>
-        <w:tc>
-          <w:tcPr/>
-          <w:p>
-            <w:pPr>
-              <w:pStyle w:val="Compact"/>
-            </w:pPr>
-            <w:r>
-              <w:t xml:space="preserve">.041</w:t>
+              <w:t xml:space="preserve">1.80</w:t>
+            </w:r>
+          </w:p>
+        </w:tc>
+        <w:tc>
+          <w:tcPr/>
+          <w:p>
+            <w:pPr>
+              <w:pStyle w:val="Compact"/>
+            </w:pPr>
+            <w:r>
+              <w:t xml:space="preserve">[1.44, 2.25]</w:t>
+            </w:r>
+          </w:p>
+        </w:tc>
+        <w:tc>
+          <w:tcPr/>
+          <w:p>
+            <w:pPr>
+              <w:pStyle w:val="Compact"/>
+            </w:pPr>
+            <w:r>
+              <w:t xml:space="preserve">&lt; .001</w:t>
             </w:r>
           </w:p>
         </w:tc>
@@ -7499,29 +7470,29 @@
               <w:pStyle w:val="Compact"/>
             </w:pPr>
             <w:r>
-              <w:t xml:space="preserve">1.16</w:t>
-            </w:r>
-          </w:p>
-        </w:tc>
-        <w:tc>
-          <w:tcPr/>
-          <w:p>
-            <w:pPr>
-              <w:pStyle w:val="Compact"/>
-            </w:pPr>
-            <w:r>
-              <w:t xml:space="preserve">[0.97, 1.37]</w:t>
-            </w:r>
-          </w:p>
-        </w:tc>
-        <w:tc>
-          <w:tcPr/>
-          <w:p>
-            <w:pPr>
-              <w:pStyle w:val="Compact"/>
-            </w:pPr>
-            <w:r>
-              <w:t xml:space="preserve">.096</w:t>
+              <w:t xml:space="preserve">1.07</w:t>
+            </w:r>
+          </w:p>
+        </w:tc>
+        <w:tc>
+          <w:tcPr/>
+          <w:p>
+            <w:pPr>
+              <w:pStyle w:val="Compact"/>
+            </w:pPr>
+            <w:r>
+              <w:t xml:space="preserve">[0.90, 1.28]</w:t>
+            </w:r>
+          </w:p>
+        </w:tc>
+        <w:tc>
+          <w:tcPr/>
+          <w:p>
+            <w:pPr>
+              <w:pStyle w:val="Compact"/>
+            </w:pPr>
+            <w:r>
+              <w:t xml:space="preserve">.414</w:t>
             </w:r>
           </w:p>
         </w:tc>
@@ -7569,7 +7540,7 @@
                 <w:b/>
                 <w:bCs/>
               </w:rPr>
-              <w:t xml:space="preserve">2.22</w:t>
+              <w:t xml:space="preserve">2.03</w:t>
             </w:r>
           </w:p>
         </w:tc>
@@ -7584,7 +7555,7 @@
                 <w:b/>
                 <w:bCs/>
               </w:rPr>
-              <w:t xml:space="preserve">[1.89, 2.60]</w:t>
+              <w:t xml:space="preserve">[1.72, 2.38]</w:t>
             </w:r>
           </w:p>
         </w:tc>
@@ -7623,7 +7594,7 @@
               <w:pStyle w:val="Compact"/>
             </w:pPr>
             <w:r>
-              <w:t xml:space="preserve">809</w:t>
+              <w:t xml:space="preserve">828</w:t>
             </w:r>
           </w:p>
         </w:tc>
@@ -7645,29 +7616,29 @@
               <w:pStyle w:val="Compact"/>
             </w:pPr>
             <w:r>
-              <w:t xml:space="preserve">0.57</w:t>
-            </w:r>
-          </w:p>
-        </w:tc>
-        <w:tc>
-          <w:tcPr/>
-          <w:p>
-            <w:pPr>
-              <w:pStyle w:val="Compact"/>
-            </w:pPr>
-            <w:r>
-              <w:t xml:space="preserve">[0.38, 0.86]</w:t>
-            </w:r>
-          </w:p>
-        </w:tc>
-        <w:tc>
-          <w:tcPr/>
-          <w:p>
-            <w:pPr>
-              <w:pStyle w:val="Compact"/>
-            </w:pPr>
-            <w:r>
-              <w:t xml:space="preserve">.007</w:t>
+              <w:t xml:space="preserve">0.55</w:t>
+            </w:r>
+          </w:p>
+        </w:tc>
+        <w:tc>
+          <w:tcPr/>
+          <w:p>
+            <w:pPr>
+              <w:pStyle w:val="Compact"/>
+            </w:pPr>
+            <w:r>
+              <w:t xml:space="preserve">[0.37, 0.83]</w:t>
+            </w:r>
+          </w:p>
+        </w:tc>
+        <w:tc>
+          <w:tcPr/>
+          <w:p>
+            <w:pPr>
+              <w:pStyle w:val="Compact"/>
+            </w:pPr>
+            <w:r>
+              <w:t xml:space="preserve">.005</w:t>
             </w:r>
           </w:p>
         </w:tc>
@@ -7707,29 +7678,29 @@
               <w:pStyle w:val="Compact"/>
             </w:pPr>
             <w:r>
-              <w:t xml:space="preserve">1.23</w:t>
-            </w:r>
-          </w:p>
-        </w:tc>
-        <w:tc>
-          <w:tcPr/>
-          <w:p>
-            <w:pPr>
-              <w:pStyle w:val="Compact"/>
-            </w:pPr>
-            <w:r>
-              <w:t xml:space="preserve">[0.98, 1.54]</w:t>
-            </w:r>
-          </w:p>
-        </w:tc>
-        <w:tc>
-          <w:tcPr/>
-          <w:p>
-            <w:pPr>
-              <w:pStyle w:val="Compact"/>
-            </w:pPr>
-            <w:r>
-              <w:t xml:space="preserve">.075</w:t>
+              <w:t xml:space="preserve">1.69</w:t>
+            </w:r>
+          </w:p>
+        </w:tc>
+        <w:tc>
+          <w:tcPr/>
+          <w:p>
+            <w:pPr>
+              <w:pStyle w:val="Compact"/>
+            </w:pPr>
+            <w:r>
+              <w:t xml:space="preserve">[1.28, 2.24]</w:t>
+            </w:r>
+          </w:p>
+        </w:tc>
+        <w:tc>
+          <w:tcPr/>
+          <w:p>
+            <w:pPr>
+              <w:pStyle w:val="Compact"/>
+            </w:pPr>
+            <w:r>
+              <w:t xml:space="preserve">&lt; .001</w:t>
             </w:r>
           </w:p>
         </w:tc>
@@ -7769,29 +7740,29 @@
               <w:pStyle w:val="Compact"/>
             </w:pPr>
             <w:r>
-              <w:t xml:space="preserve">1.44</w:t>
-            </w:r>
-          </w:p>
-        </w:tc>
-        <w:tc>
-          <w:tcPr/>
-          <w:p>
-            <w:pPr>
-              <w:pStyle w:val="Compact"/>
-            </w:pPr>
-            <w:r>
-              <w:t xml:space="preserve">[1.19, 1.74]</w:t>
-            </w:r>
-          </w:p>
-        </w:tc>
-        <w:tc>
-          <w:tcPr/>
-          <w:p>
-            <w:pPr>
-              <w:pStyle w:val="Compact"/>
-            </w:pPr>
-            <w:r>
-              <w:t xml:space="preserve">&lt; .001</w:t>
+              <w:t xml:space="preserve">1.32</w:t>
+            </w:r>
+          </w:p>
+        </w:tc>
+        <w:tc>
+          <w:tcPr/>
+          <w:p>
+            <w:pPr>
+              <w:pStyle w:val="Compact"/>
+            </w:pPr>
+            <w:r>
+              <w:t xml:space="preserve">[1.10, 1.60]</w:t>
+            </w:r>
+          </w:p>
+        </w:tc>
+        <w:tc>
+          <w:tcPr/>
+          <w:p>
+            <w:pPr>
+              <w:pStyle w:val="Compact"/>
+            </w:pPr>
+            <w:r>
+              <w:t xml:space="preserve">.004</w:t>
             </w:r>
           </w:p>
         </w:tc>
@@ -7839,7 +7810,7 @@
                 <w:b/>
                 <w:bCs/>
               </w:rPr>
-              <w:t xml:space="preserve">2.33</w:t>
+              <w:t xml:space="preserve">2.10</w:t>
             </w:r>
           </w:p>
         </w:tc>
@@ -7854,7 +7825,7 @@
                 <w:b/>
                 <w:bCs/>
               </w:rPr>
-              <w:t xml:space="preserve">[1.90, 2.87]</w:t>
+              <w:t xml:space="preserve">[1.71, 2.58]</w:t>
             </w:r>
           </w:p>
         </w:tc>
@@ -7890,7 +7861,7 @@
         <w:t xml:space="preserve"> </w:t>
       </w:r>
       <w:r>
-        <w:t xml:space="preserve">The primary baseline-only logistic model re-estimated separately within each birth-year cohort. Both cohorts come from the same register and national system, so this is an internal replication. The pre-milestone volume effect is reproduced at similar magnitude in both cohorts; female sex predicts lower retention in both. The HHI association is clear in the 2001–2002 cohort but not significant in the 1998–2000 cohort (see Section 3.9).</w:t>
+        <w:t xml:space="preserve">The primary baseline-only logistic model re-estimated separately within each birth-year cohort. Both cohorts come from the same register and national system, so this is an internal replication. The pre-milestone volume effect and the performance association are reproduced at similar magnitude in both cohorts; female sex predicts lower retention in both. The HHI association is clear in the 2001–2002 cohort but not significant in the 1998–2000 cohort (see Section 3.9).</w:t>
       </w:r>
     </w:p>
     <w:p>
@@ -7943,7 +7914,7 @@
         <w:t xml:space="preserve"> </w:t>
       </w:r>
       <w:r>
-        <w:t xml:space="preserve">Competition volume trajectory by senior-retention status. Median competitions per year (with interquartile range as shaded band) plotted by athlete age (13–18), separately for athletes who retained active senior status (≥2 results in any year at age ≥20; n = 348) and those who did not (n = 1,775). The dashed vertical line at age 15 marks the first qualification milestone (Norwegian Youth Championships). Future retainers and future dropouts already differ at ages 13–14; the gap widens further across the age-14-to-15 transition.</w:t>
+        <w:t xml:space="preserve">Competition volume trajectory by senior-retention status. Median competitions (competition days) per year (with interquartile range as shaded band) plotted by athlete age (13–18), separately for athletes who retained active senior status (≥2 results in any year at age ≥20; n = 348) and those who did not (n = 1,790). The dashed vertical line at age 15 marks the first qualification milestone (Norwegian Youth Championships). Future retainers and future dropouts already differ at ages 13–14; the gap widens further across the age-14-to-15 transition.</w:t>
       </w:r>
     </w:p>
     <w:p>
@@ -7961,7 +7932,7 @@
         <w:t xml:space="preserve"> </w:t>
       </w:r>
       <w:r>
-        <w:t xml:space="preserve">Kaplan–Meier retention curves stratified by total competition volume across ages 15 and 16 (descriptive). Strata are: 0 meets, 1–5 meets, 6–15 meets, 16–30 meets, and 31+ meets. Athletes in the highest stratum retained 71% senior activity at follow-up year 14; athletes in the lowest stratum retained 4%. (Note: this descriptive stratification uses post-baseline measurement; primary effect estimates in Table 3 use only baseline-window predictors.)</w:t>
+        <w:t xml:space="preserve">Kaplan–Meier retention curves stratified by total competition volume across ages 15 and 16 (descriptive). Strata are: 0 meets, 1–5 meets, 6–15 meets, 16–30 meets, and 31+ meets. In the highest stratum 22% were still active 14 years after baseline and 50% reached active senior status; in the lowest stratum, 0.3% and 0.8%. (Note: this descriptive stratification uses post-baseline measurement; primary effect estimates in Table 3 use only baseline-window predictors.)</w:t>
       </w:r>
     </w:p>
     <w:bookmarkEnd w:id="73"/>

</xml_diff>

<commit_message>
IJSSC R1: fixes from the number cross-check
Detection capacity recomputed from the correctly timed Cox model and the
primary logistic model (Table S4, S-M2, Methods); sample-flow table uses the
corrected landmark and Cox samples; paired AUC comparisons added for HHI with
volume and for the within-event rank vs. Tyrving; sex-vs-implements check
added as audit/audit_05 with explicit definitions; quoted descriptive numbers
stored in r1_text_numbers.json; wording fixes (active vs. competing at 14,
regional meet, senior seasons, event categories); build now rejects nested
highlight markers.

Co-Authored-By: Claude Opus 5.5 <noreply@anthropic.com>
</commit_message>
<xml_diff>
--- a/forskning/ncc-kohort/revision_r1/submission_r1/MANUSCRIPT_R1_clean.docx
+++ b/forskning/ncc-kohort/revision_r1/submission_r1/MANUSCRIPT_R1_clean.docx
@@ -104,7 +104,7 @@
         <w:pStyle w:val="FirstParagraph"/>
       </w:pPr>
       <w:r>
-        <w:t xml:space="preserve">Withdrawal from youth sport is theorized as a gradual process, but its longitudinal behavioral signature has been hard to observe directly. We used Norway’s national competition register to follow 2,138 athletes who competed as 13–14-year-olds in a regional youth track-and-field meet (birth years 1998–2002) for up to 14 years. In a prospective logistic regression for active senior status (≥2 registered results in a calendar year at age 20+) using only ages-13–14 predictors, competition volume was the strongest predictor (OR = 2.04 per SD, 95% CI [1.80, 2.32]; cross-validated AUC = 0.767; calibration slope 0.98), discriminated retention somewhat better than age-normed performance measured in the same window (which added complementary information; OR = 1.75 per SD), was robust to structural controls, club random effects, and club-grouped validation, and was reproduced in two adjacent birth cohorts (an internal replication). Competition participation declined within athletes before exit: relative to their own earlier seasons, dropouts competed 12% less two seasons and 23% less one season before their final season, and among athletes still active at 16, declining volume across ages 15–16 predicted lower senior retention (OR = 0.54 per SD of decline). Within-sport event concentration was not robustly associated with retention. A register-based candidate flag at the end of the age-14 season (&lt; 10 meets) identifies the 27% of athletes whose senior retention is 5.5%, versus 20% among the unflagged (the same cut-off emerged in each birth cohort and held when applied to the other): a testable targeting rule for retention-supporting outreach in open-entry systems.</w:t>
+        <w:t xml:space="preserve">Withdrawal from youth sport is theorized as a gradual process, but its longitudinal behavioral signature has been hard to observe directly. We used Norway’s national competition register to follow 2,138 athletes who competed as 13–14-year-olds in a regional youth track-and-field meet (birth years 1998–2002) for up to 14 years. In a prospective logistic regression for active senior status (≥2 registered results in a calendar year at age 20+) using only ages-13–14 predictors, competition volume was the strongest predictor (OR = 2.04 per SD, 95% CI [1.80, 2.32]; cross-validated AUC = 0.767; calibration slope 0.98), discriminated retention somewhat better than age-normed performance measured in the same window (which added complementary information; OR = 1.75 per SD), was robust to structural controls, club random effects, and club-grouped validation, and was reproduced in two adjacent birth cohorts (an internal replication). Competition participation declined within athletes before exit: relative to their own earlier seasons, dropouts competed 12% less two seasons and 23% less one season before their final season, and among athletes still active at 16, declining volume across ages 15–16 predicted lower senior retention (OR = 0.54 per SD of decline). Within-sport event concentration was not robustly associated with retention. A register-based candidate flag at the end of the age-14 season (&lt; 10 meets) identifies the 27% of athletes whose senior retention is 5.5%, versus 20% among the unflagged (the lowest-volume quartile gave this cut-off in each birth cohort, and it held when applied to the other): a testable targeting rule for retention-supporting outreach in open-entry systems.</w:t>
       </w:r>
     </w:p>
     <w:p>
@@ -165,7 +165,7 @@
         <w:t xml:space="preserve"> </w:t>
       </w:r>
       <w:r>
-        <w:t xml:space="preserve">and in the broad-participation cohort studied here, fewer than half of those competing at ages 13–14 were still competing at 17 (Section 3).</w:t>
+        <w:t xml:space="preserve">and in the cohort studied here, fewer than half of those competing at ages 13–14 were still competing at 17 (Section 3).</w:t>
       </w:r>
     </w:p>
     <w:p>
@@ -833,7 +833,7 @@
         <w:pStyle w:val="FirstParagraph"/>
       </w:pPr>
       <w:r>
-        <w:t xml:space="preserve">For every athlete-year we counted the event categories entered (sprint, middle-distance, long-distance, hurdles, jumps, throws, combined events, race walking, relay) and computed a Herfindahl-Hirschman concentration index,</w:t>
+        <w:t xml:space="preserve">For every athlete-year we counted the event categories entered as registered (sprint, middle distance, long distance, steeplechase, hurdles, jumps, throws, ball throws, race walking) and computed a Herfindahl-Hirschman concentration index,</w:t>
       </w:r>
       <w:r>
         <w:t xml:space="preserve"> </w:t>
@@ -1045,7 +1045,7 @@
         <w:pStyle w:val="FirstParagraph"/>
       </w:pPr>
       <w:r>
-        <w:t xml:space="preserve">To disentangle early behavioral heterogeneity from within-athlete decline, we fit a logistic regression on athletes still active at age 14 (1,926; complete-case model n = 1,925) including both the volume level at age 14 and the change from 14 to 15 (Table 4; change = later minus earlier volume, so OR &gt; 1 per SD means that decline predicts lower retention). Because a change score can span the exit itself, three analyses probe the within-athlete claim directly: exit-aligned trajectories (volume one to three seasons before each dropout’s own final active season), a contamination-free change model among athletes still active at 16 (level at 15 plus change 15→16 predicting senior status; Supplementary Table S19), and an athlete fixed-effects model of log(1 + meets) at ages 13–19, with age fixed effects and indicators for the final active season and the three preceding seasons, which estimates each athlete’s decline relative to their own earlier volume (Supplementary Methods S-M6). Prospective early-warning thresholds on pre-milestone volume (classification performance at candidate cut-offs at the end of the age-14 season, with bootstrap CIs) are reported in Table 6, with cut-offs also derived in one birth cohort and tested in the other (Supplementary Table S29).</w:t>
+        <w:t xml:space="preserve">To disentangle early behavioral heterogeneity from within-athlete decline, we fit a logistic regression on athletes still competing at age 14 (≥1 result; 1,926; complete-case model n = 1,925) including both the volume level at age 14 and the change from 14 to 15 (Table 4; change = later minus earlier volume, so OR &gt; 1 per SD means that decline predicts lower retention). Because a change score can span the exit itself, three analyses probe the within-athlete claim directly: exit-aligned trajectories (volume one to three seasons before each dropout’s own final active season), a contamination-free change model among athletes still active at 16 (level at 15 plus change 15→16 predicting senior status; Supplementary Table S19), and an athlete fixed-effects model of log(1 + meets) at ages 13–19, with age fixed effects and indicators for the final active season and the three preceding seasons, which estimates each athlete’s decline relative to their own earlier volume (Supplementary Methods S-M6). Prospective early-warning thresholds on pre-milestone volume (classification performance at candidate cut-offs at the end of the age-14 season, with bootstrap CIs) are reported in Table 6, with cut-offs also derived in one birth cohort and tested in the other (Supplementary Table S29).</w:t>
       </w:r>
     </w:p>
     <w:bookmarkEnd w:id="26"/>
@@ -1117,7 +1117,7 @@
         <w:pStyle w:val="FirstParagraph"/>
       </w:pPr>
       <w:r>
-        <w:t xml:space="preserve">Because the full eligible population is observed, a detection-capacity analysis replaces a-priori power: the design could detect hazard ratios ≥1.07 and odds ratios ≥1.20 per SD (Supplementary Table S4), below typical effects in prior dropout research.</w:t>
+        <w:t xml:space="preserve">Because the full eligible population is observed, a detection-capacity analysis replaces a-priori power: the design could detect hazard ratios ≥1.07 and odds ratios ≥1.18 per SD (Supplementary Table S4), below typical effects in prior dropout research.</w:t>
       </w:r>
       <w:r>
         <w:rPr>
@@ -1320,7 +1320,7 @@
         <w:pStyle w:val="BodyText"/>
       </w:pPr>
       <w:r>
-        <w:t xml:space="preserve">Kaplan–Meier curves summarize the attrition: half the cohort had its final active season within 2 years of baseline and 79% within 5; the annual exit rate was 22–24% at ages 14–17 and peaked at 18–19 (28%), the first junior years (Supplementary Figure S2); sex-stratified curves overlap (log-rank</w:t>
+        <w:t xml:space="preserve">Kaplan–Meier curves summarize the attrition (Supplementary Figure S2): half the cohort had its final active season within 2 years of baseline and 79% within 5, and sex-stratified curves overlap (log-rank</w:t>
       </w:r>
       <w:r>
         <w:t xml:space="preserve"> </w:t>
@@ -1336,7 +1336,7 @@
         <w:t xml:space="preserve"> </w:t>
       </w:r>
       <w:r>
-        <w:t xml:space="preserve">= .42). Descriptively, curves by ages-15–16 volume separate monotonically (50% senior retention with ≥31 meets vs. 0.8% with none; Figure 3), as do curves by pre-17 championship types (Supplementary Figure S3).</w:t>
+        <w:t xml:space="preserve">= .42). By age, the annual exit rate was 22–24% at 14–17 and peaked at 18–19 (28%), the first junior years. Descriptively, curves by ages-15–16 volume separate monotonically (50% senior retention with ≥31 meets vs. 0.8% with none; Figure 3), as do curves by pre-17 championship types (Supplementary Figure S3).</w:t>
       </w:r>
     </w:p>
     <w:p>
@@ -1484,7 +1484,7 @@
         <w:pStyle w:val="FirstParagraph"/>
       </w:pPr>
       <w:r>
-        <w:t xml:space="preserve">Adding region, birth quarter (Q1/Q4), and club size left the volume coefficient essentially unchanged (OR = 2.07 vs. 2.04). Of these covariates only birth quarter was associated with retention: conditional on performance and volume, relatively younger athletes were retained somewhat more often (linear trend OR = 1.16 per quarter, 95% CI [1.03, 1.31]; Supplementary Table S13). A quarter of volume variance lies between clubs (ICC = 0.27, 287 clubs), but with club random intercepts the coefficient was, if anything, larger (OR = 2.10, 95% CI [1.88, 2.34]; club-clustered standard errors and a population-averaged model gave the same estimate with wider intervals, OR = 2.04 [1.75, 2.39]; Supplementary Table S22), and folds grouped by club gave the same cross-validated AUC (0.766 [0.735, 0.797]; Supplementary Table S26): the association holds within clubs and carries over to clubs not used for fitting.</w:t>
+        <w:t xml:space="preserve">Adding region, birth quarter (Q1/Q4), and club size left the volume coefficient essentially unchanged (OR = 2.07 vs. 2.04). Of these covariates only birth quarter was associated with retention: conditional on performance and volume, relatively younger athletes were retained somewhat more often (linear trend OR = 1.16 per quarter, 95% CI [1.03, 1.31]; Supplementary Table S13). A quarter of volume variance lies between clubs (ICC = 0.27, 287 clubs), but with club random intercepts the coefficient was, if anything, larger (OR = 2.10, 95% CI [1.88, 2.34]; club-clustered standard errors, OR = 2.04 [1.75, 2.39], and a population-averaged model, 2.03 [1.74, 2.38], gave the same estimate with wider intervals; Supplementary Table S22), and folds grouped by club gave the same cross-validated AUC (0.766 [0.735, 0.797]; Supplementary Table S26): the association holds within clubs and carries over to clubs not used for fitting.</w:t>
       </w:r>
     </w:p>
     <w:bookmarkEnd w:id="37"/>
@@ -1520,7 +1520,7 @@
         <w:pStyle w:val="BodyText"/>
       </w:pPr>
       <w:r>
-        <w:t xml:space="preserve">First, level and change. Among athletes still active at age 14 (1,926; complete-case model n = 1,925), the age-14 volume level (OR = 2.51 per SD, 95% CI [2.17, 2.89]) and the change from age 14 to 15 (OR = 2.29 per SD increase, 95% CI [2.00, 2.62]; i.e., OR = 0.44 per SD, about 6.4 meets, of decline) contributed independently (both</w:t>
+        <w:t xml:space="preserve">First, level and change. Among athletes still competing at age 14 (≥1 result; 1,926; complete-case model n = 1,925), the age-14 volume level (OR = 2.51 per SD, 95% CI [2.17, 2.89]) and the change from age 14 to 15 (OR = 2.29 per SD increase, 95% CI [2.00, 2.62]; i.e., OR = 0.44 per SD, about 6.4 meets, of decline) contributed independently (both</w:t>
       </w:r>
       <w:r>
         <w:t xml:space="preserve"> </w:t>
@@ -1651,7 +1651,7 @@
         <w:pStyle w:val="FirstParagraph"/>
       </w:pPr>
       <w:r>
-        <w:t xml:space="preserve">In a fully time-aligned comparison, with behavior and performance both measured at ages 13–14 to remove any temporal advantage, volume discriminated somewhat better than baseline performance: CV-AUC = 0.700 for sex + baseline Tyrving and 0.740 for sex + volume (difference 0.040, 95% CI 0.006–0.074; Supplementary Table S27). The two were complementary: adding Tyrving to volume raised the AUC by 0.023 (0.007–0.038). With its within-baseline trajectory (change from 13 to 14), performance matched volume (0.737 vs. 0.736; n = 1,721). Because Tyrving norms are unequally demanding across event groups (mean baseline-meet points 798 in sprints, 501 in throws), we also ranked athletes within event, sex and age at the baseline meet; this rank discriminated less well (0.689).</w:t>
+        <w:t xml:space="preserve">In a fully time-aligned comparison, with behavior and performance both measured at ages 13–14 to remove any temporal advantage, volume discriminated somewhat better than baseline performance: CV-AUC = 0.700 for sex + baseline Tyrving and 0.740 for sex + volume (difference 0.040, 95% CI 0.006–0.074; Supplementary Table S27). The two were complementary: adding Tyrving to volume raised the AUC by 0.023 (0.007–0.038). With its within-baseline trajectory (change from 13 to 14), performance matched volume (0.737 vs. 0.736; n = 1,721). Because Tyrving norms are unequally demanding across event groups (mean baseline-meet points 798 in sprints, 501 in throws), we also ranked athletes within event, sex and age at the baseline meet; this rank did no better than Tyrving (0.689 vs. 0.700; difference 0.011 [−0.007, 0.028]).</w:t>
       </w:r>
     </w:p>
     <w:p>
@@ -1677,7 +1677,7 @@
         <w:pStyle w:val="FirstParagraph"/>
       </w:pPr>
       <w:r>
-        <w:t xml:space="preserve">Conditioning on athletes still in their career at age 16 (final active season at 16 or later; n = 1,148), volume across ages 15–16 was the largest contributor to subsequent cessation risk (HR = 0.68 per SD, 95% CI [0.62, 0.74], C-index = 0.695; complete-case n = 1,147; Supplementary Table S8). The baseline-only Cox model, with its clock starting at the end of the age-14 season (volume HR = 0.65 per SD, 95% CI [0.62, 0.69]; Supplementary Tables S10 and S16), a period-specific decomposition (Table 5), and diagnostics (Supplementary Tables S1, S6, S11, S17; Supplementary Figure S4) are descriptive companions; post-baseline Cox estimates are not primary (predictor and at-risk window overlap), and their contamination-free analogue is the change model in Section 3.5.</w:t>
+        <w:t xml:space="preserve">Conditioning on athletes still in their career at age 16 (final active season at 16 or later; n = 1,148), volume across ages 15–16 was the largest contributor to subsequent cessation risk (HR = 0.68 per SD, 95% CI [0.62, 0.74], C-index = 0.695; complete-case n = 1,147; Supplementary Table S8). The baseline-only Cox model, with its clock starting at the end of the age-14 season (volume HR = 0.65 per SD, 95% CI [0.62, 0.69], Supplementary Table S10; 0.65 with structural controls, Supplementary Table S16), a period-specific decomposition (Table 5), diagnostics (Supplementary Tables S1, S6, S11; Supplementary Figure S4), and nested-predictor AUCs (Supplementary Table S17) are descriptive companions; post-baseline Cox estimates are not primary (predictor and at-risk window overlap), and their contamination-free analogue is the change model in Section 3.5.</w:t>
       </w:r>
     </w:p>
     <w:p>
@@ -1768,7 +1768,7 @@
         <w:pStyle w:val="FirstParagraph"/>
       </w:pPr>
       <w:r>
-        <w:t xml:space="preserve">Higher baseline HHI (more event-category concentration at ages 13–14) was associated with higher senior retention only once volume was in the model (OR = 1.18 per SD, 95% CI [1.04, 1.34]; without volume, 1.00), only in Cohort B (1.32; Cohort A 1.07 [0.90, 1.28]), without gain in discrimination (ΔAUC = −0.002), and not once performance in the athlete’s main event category was controlled (1.07 [0.94, 1.23]; Supplementary Table S18). Because HHI is bounded below by 1/(result count), we stress-tested for count-dependence; the association was unchanged under restriction to ≥5 and ≥8 results at ages 13–14 (OR = 1.17, 1.17) and a finite-sample-corrected index (OR = 1.20, 95% CI [1.05, 1.35]; Supplementary Table S20). The index captures concentration</w:t>
+        <w:t xml:space="preserve">Higher baseline HHI (more event-category concentration at ages 13–14) was associated with higher senior retention only once volume was in the model (OR = 1.18 per SD, 95% CI [1.04, 1.34]; without volume, 1.00), only in Cohort B (1.32; Cohort A 1.07 [0.90, 1.28]), without gain in discrimination (ΔAUC = −0.002 without volume and 0.004 [−0.003, 0.010] with it), and not once performance in the athlete’s main event category was controlled (1.07 [0.94, 1.23]; Supplementary Table S18). Because HHI is bounded below by 1/(result count), we stress-tested for count-dependence; the association was unchanged under restriction to ≥5 and ≥8 results at ages 13–14 (OR = 1.17, 1.17) and a finite-sample-corrected index (OR = 1.20, 95% CI [1.05, 1.35]; Supplementary Table S20). The index captures concentration</w:t>
       </w:r>
       <w:r>
         <w:t xml:space="preserve"> </w:t>
@@ -2641,7 +2641,7 @@
         <w:t xml:space="preserve"> </w:t>
       </w:r>
       <w:r>
-        <w:t xml:space="preserve">volume declines. Third, the target population is the engaged core, athletes entered for the national 13–14 meet (29% of register athletes with a result at 13–14, but 80% of eventual seniors), not all young athletes; among casual participants outside the cohort, volume was also associated with retention (OR = 2.17 per 10 meets; Supplementary Table S31), but the thresholds and absolute rates apply to the engaged core. The three venues cover eastern, western, and mid Norway, with northern districts served by the mid-Norway venue. Fourth, predictor and outcome share a measurement scale; despite the baseline-only model, the change models, the exit-aligned and fixed-effects analyses, and the landmark analysis, structural overlap remains a conceptual limitation of register-only designs. Fifth, the post-baseline Cox specification violated proportional hazards (Schoenfeld χ² = 293.2); its estimates are descriptive only. Sixth, Tyrving norms are not equally demanding across event groups (throws and race walking score lower), and the HHI treats event categories symmetrically although they co-occur unevenly (98% of hurdlers also sprinted), so identical values can represent different combination patterns. Seventh, the youngest cohort has at most four post-senior years of observation, though the fixed-window outcome gives near-identical results. Eighth, the thresholds are candidates calibrated to a complete-register, open-entry, club-pays system; they do not transfer to coach-gated or pay-to-play systems without re-derivation, and no intervention effect has been demonstrated: §4.8 is targeting logic, not evaluated policy.</w:t>
+        <w:t xml:space="preserve">volume declines. Third, the target population is the engaged core, athletes entered for the regional 13–14 meet (29% of register athletes with a result at 13–14, but 80% of eventual seniors), not all young athletes; among casual participants outside the cohort, volume was also associated with retention (OR = 2.17 per 10 meets; Supplementary Table S31), but the thresholds and absolute rates apply to the engaged core. The three venues cover eastern, western, and mid Norway, with northern districts served by the mid-Norway venue. Fourth, predictor and outcome share a measurement scale; despite the baseline-only model, the change models, the exit-aligned and fixed-effects analyses, and the landmark analysis, structural overlap remains a conceptual limitation of register-only designs. Fifth, the post-baseline Cox specification violated proportional hazards (Schoenfeld χ² = 293.2); its estimates are descriptive only. Sixth, Tyrving norms are not equally demanding across event groups (throws and race walking score lower), and the HHI treats event categories symmetrically although they co-occur unevenly (98% of hurdlers also sprinted), so identical values can represent different combination patterns. Seventh, athletes born in 2002 have four senior seasons of observation (2022–2025), though the fixed-window outcome gives near-identical results. Eighth, the thresholds are candidates calibrated to a complete-register, open-entry, club-pays system; they do not transfer to coach-gated or pay-to-play systems without re-derivation, and no intervention effect has been demonstrated: §4.8 is targeting logic, not evaluated policy.</w:t>
       </w:r>
     </w:p>
     <w:bookmarkEnd w:id="53"/>
@@ -6178,7 +6178,7 @@
         <w:t xml:space="preserve"> </w:t>
       </w:r>
       <w:r>
-        <w:t xml:space="preserve">Change = volume at 15 minus volume at 14 (positive = increase; mean −2.2, SD 6.4 meets). The OR of 2.29 per SD increase is equivalent to OR = 0.44 [0.38, 0.50] per SD of greater decline (about 6.4 fewer meets), conditional on the level at age 14; per 5 fewer meets, OR = 0.52. Because the model is linear in the logit, it is identical to one with volume at 14 and volume at 15 as separate levels (the per-meet OR for change equals the per-meet OR for volume at 15). Pseudo-R² (McFadden) rose from 0.150 (M1) to 0.245 (M2); CV-AUC 0.763 → 0.833. 1 of the 1,926 athletes active at 14 lacks registered sex or a Tyrving score (sample n = 1,925). Both baseline level and within-athlete decline contribute substantially and independently.</w:t>
+        <w:t xml:space="preserve">Change = volume at 15 minus volume at 14 (positive = increase; mean −2.2, SD 6.4 meets). The OR of 2.29 per SD increase is equivalent to OR = 0.44 [0.38, 0.50] per SD of greater decline (about 6.4 fewer meets), conditional on the level at age 14; per 5 fewer meets, OR = 0.52. Because the model is linear in the logit, it is identical to one with volume at 14 and volume at 15 as separate levels (the per-meet OR for change equals the per-meet OR for volume at 15). Pseudo-R² (McFadden) rose from 0.150 (M1) to 0.245 (M2); CV-AUC 0.763 → 0.833. 1 of the 1,926 athletes with a result at 14 lacks registered sex or a Tyrving score (sample n = 1,925). Both baseline level and within-athlete decline contribute substantially and independently.</w:t>
       </w:r>
     </w:p>
     <w:p>

</xml_diff>

<commit_message>
IJSSC R1: shorten main text to about 6,200 words
Introduction and Discussion tightened, repetitions with tables and Results
removed; data-correction details kept to a short list in S-M12 and one
paragraph in the response letter. Two citations that the shortening had
broken for the Vancouver conversion are fixed (references again cited 1-37
in order); Supplementary Tables S14 and S15 now cited in the text.

Co-Authored-By: Claude Opus 5.5 <noreply@anthropic.com>
</commit_message>
<xml_diff>
--- a/forskning/ncc-kohort/revision_r1/submission_r1/MANUSCRIPT_R1_clean.docx
+++ b/forskning/ncc-kohort/revision_r1/submission_r1/MANUSCRIPT_R1_clean.docx
@@ -173,7 +173,7 @@
         <w:pStyle w:val="BodyText"/>
       </w:pPr>
       <w:r>
-        <w:t xml:space="preserve">Terminology in this literature is often ambiguous, so we fix ours at the outset. Following Battaglia et al.,</w:t>
+        <w:t xml:space="preserve">Following Battaglia et al.,</w:t>
       </w:r>
       <w:r>
         <w:rPr>
@@ -211,7 +211,7 @@
         <w:t xml:space="preserve">dropout</w:t>
       </w:r>
       <w:r>
-        <w:t xml:space="preserve">, the state of no longer participating. Our outcome is dropout from organized track and field competition specifically, not from sport or physical activity in general: an athlete who leaves track and field for another sport is, from the register’s perspective, a dropout, a boundary we return to in the limitations. When and how these withdrawals unfold has been difficult to determine with existing methods.</w:t>
+        <w:t xml:space="preserve">, the state of no longer participating. Our outcome is dropout from organized track and field competition, not from sport in general: an athlete who leaves for another sport is, from the register’s perspective, a dropout (see the limitations).</w:t>
       </w:r>
     </w:p>
     <w:bookmarkEnd w:id="10"/>
@@ -289,7 +289,7 @@
         <w:pStyle w:val="BodyText"/>
       </w:pPr>
       <w:r>
-        <w:t xml:space="preserve">The most developed account of this process view comes from sociology. Eliasson and Johansson</w:t>
+        <w:t xml:space="preserve">In sociology, Eliasson and Johansson</w:t>
       </w:r>
       <w:r>
         <w:rPr>
@@ -313,7 +313,7 @@
         <w:t xml:space="preserve"> </w:t>
       </w:r>
       <w:r>
-        <w:t xml:space="preserve">role-exit framework, in which leaving a social role proceeds through stages of first doubts, seeking and weighing alternatives, a turning point, and the construction of an ex-role identity, to youth sport, interviewing adolescent girls and their parents. Withdrawal resulted from interacting changes in the sport organization, the athletes’ broader lives, and the expectations attached to the young-athlete role; the process could be long, emotionally demanding, and decreasingly reversible. Survey evidence from Norwegian youth complements this picture: stated reasons for leaving organized sport are diverse and patterned by social background, with sport expenses cited more often by minority youth from less-resourced families.</w:t>
+        <w:t xml:space="preserve">role-exit framework, in which leaving a social role proceeds through stages of first doubts, seeking and weighing alternatives, a turning point, and the construction of an ex-role identity, to youth sport, interviewing adolescent girls and their parents. Withdrawal resulted from interacting changes in the sport organization, the athletes’ broader lives, and the expectations attached to the young-athlete role; the process could be long, emotionally demanding, and decreasingly reversible. Norwegian survey evidence adds that reasons for leaving are diverse and socially patterned, with sport expenses cited more often by minority youth from less-resourced families.</w:t>
       </w:r>
       <w:r>
         <w:rPr>
@@ -327,7 +327,7 @@
         <w:pStyle w:val="BodyText"/>
       </w:pPr>
       <w:r>
-        <w:t xml:space="preserve">Groups of athletes also appear to differ in how they respond when competitive demands increase. Norwegian participation research documents strong variation in involvement: training investment varies widely,</w:t>
+        <w:t xml:space="preserve">Athletes also differ in how they respond when competitive demands increase. Norwegian research documents strong variation in involvement</w:t>
       </w:r>
       <w:r>
         <w:rPr>
@@ -336,10 +336,7 @@
         <w:t xml:space="preserve">11</w:t>
       </w:r>
       <w:r>
-        <w:t xml:space="preserve"> </w:t>
-      </w:r>
-      <w:r>
-        <w:t xml:space="preserve">and a significant minority hold</w:t>
+        <w:t xml:space="preserve">: a minority hold</w:t>
       </w:r>
       <w:r>
         <w:t xml:space="preserve"> </w:t>
@@ -351,7 +348,7 @@
         <w:t xml:space="preserve"> </w:t>
       </w:r>
       <w:r>
-        <w:t xml:space="preserve">involvement motives (intense love of the game or career pursuits), while the larger group appreciate</w:t>
+        <w:t xml:space="preserve">involvement motives, while the larger group prefer</w:t>
       </w:r>
       <w:r>
         <w:t xml:space="preserve"> </w:t>
@@ -363,7 +360,7 @@
         <w:t xml:space="preserve"> </w:t>
       </w:r>
       <w:r>
-        <w:t xml:space="preserve">involvement built on fun, exercise, and belonging, quitting more readily when sport becomes too demanding alongside everything else.</w:t>
+        <w:t xml:space="preserve">involvement and quit more readily when sport becomes too demanding alongside everything else.</w:t>
       </w:r>
       <w:r>
         <w:rPr>
@@ -375,7 +372,7 @@
         <w:t xml:space="preserve"> </w:t>
       </w:r>
       <w:r>
-        <w:t xml:space="preserve">The Sport Commitment Model’s distinction between enthusiastic and constrained commitment gives such divergent responses a theoretical basis.</w:t>
+        <w:t xml:space="preserve">The Sport Commitment Model’s distinction between enthusiastic and constrained commitment gives such divergent responses a theoretical basis</w:t>
       </w:r>
       <w:r>
         <w:rPr>
@@ -384,10 +381,7 @@
         <w:t xml:space="preserve">7</w:t>
       </w:r>
       <w:r>
-        <w:t xml:space="preserve"> </w:t>
-      </w:r>
-      <w:r>
-        <w:t xml:space="preserve">Consistent with the idea that such differences leave behavioral traces well before exit, retrospective comparisons of developmental activities show that youth ice-hockey players who later dropped out already differed from persisting peers in their earlier training patterns, for example taking up intense sport-specific off-ice training at younger ages.</w:t>
+        <w:t xml:space="preserve">, and such differences can leave behavioral traces well before exit: youth ice-hockey players who later dropped out already differed from persisting peers in their earlier training patterns.</w:t>
       </w:r>
       <w:r>
         <w:rPr>
@@ -417,7 +411,7 @@
         <w:pStyle w:val="FirstParagraph"/>
       </w:pPr>
       <w:r>
-        <w:t xml:space="preserve">These theories indicate what might happen over time as participants continue or withdraw from their sport(s), but none provides direct longitudinal behavioral evidence. Withdrawn athletes are systematically harder to recruit into surveys,</w:t>
+        <w:t xml:space="preserve">These accounts describe a process, but none provides direct longitudinal behavioral evidence. Withdrawn athletes are systematically harder to recruit into surveys,</w:t>
       </w:r>
       <w:r>
         <w:rPr>
@@ -588,7 +582,7 @@
         <w:t xml:space="preserve"> </w:t>
       </w:r>
       <w:r>
-        <w:t xml:space="preserve">of future retainers and future dropouts would diverge before the final registered season, in two separable forms that we test separately: early between-athlete differences in level, and within-athlete decline. Second, because the determinants of sport commitment are experiential and volitional (enjoyment, investment, alternatives, constraint) rather than ability-based,</w:t>
+        <w:t xml:space="preserve">of future retainers and future dropouts would diverge before the final registered season, in two separable forms: early between-athlete differences in level, and within-athlete decline. Second, because the determinants of sport commitment are experiential and volitional (enjoyment, investment, alternatives, constraint) rather than ability-based,</w:t>
       </w:r>
       <w:r>
         <w:rPr>
@@ -648,23 +642,7 @@
         <w:t xml:space="preserve"> </w:t>
       </w:r>
       <w:r>
-        <w:t xml:space="preserve">in two adjacent birth-year cohorts of the same register (an internal replication). Throughout,</w:t>
-      </w:r>
-      <w:r>
-        <w:t xml:space="preserve"> </w:t>
-      </w:r>
-      <w:r>
-        <w:rPr>
-          <w:i/>
-          <w:iCs/>
-        </w:rPr>
-        <w:t xml:space="preserve">competition behavior</w:t>
-      </w:r>
-      <w:r>
-        <w:t xml:space="preserve"> </w:t>
-      </w:r>
-      <w:r>
-        <w:t xml:space="preserve">is an observable behavioral indicator, not a direct measure of motivation, whose temporal structure can be compared with process accounts: declining competition participation is treated as a behavioral marker of disengagement, not as disengagement itself; convergence between register patterns and the qualitative literature strengthens both.</w:t>
+        <w:t xml:space="preserve">in two adjacent birth-year cohorts of the same register (an internal replication). Throughout, declining competition participation is treated as a behavioral marker of disengagement, not as disengagement itself or a measure of motivation; convergence between register patterns and the qualitative literature strengthens both.</w:t>
       </w:r>
     </w:p>
     <w:p>
@@ -735,7 +713,7 @@
         <w:t xml:space="preserve"> </w:t>
       </w:r>
       <w:r>
-        <w:t xml:space="preserve">(The exception, occasional invitational regional-team matches for 14–15-year-olds, does not gate ordinary competition.) Athletes and their families decide which meets and events to enter; entry fees are ordinarily paid by the club, participation is actively encouraged, and travel distances are typically short. The first genuinely selective competition is the national youth championship (Ungdomsmesterskapet, UM), open from the calendar year athletes turn 15, with event-specific qualifying standards. Two design consequences follow: before age 15, meet counts primarily express the athlete’s own choice rather than selection or entry costs, which licenses interpreting ages-13–14 volume as a behavioral indicator of engagement; and the ages-15–16 window coincides with the first selective gate (UM), which is why the pre-milestone (13–14) and milestone (15–16) windows are analyzed separately.</w:t>
+        <w:t xml:space="preserve">Athletes and families choose meets and events; entry fees are ordinarily club-paid and travel distances short. The first genuinely selective competition is the national youth championship (Ungdomsmesterskapet, UM), open from the calendar year athletes turn 15, with event-specific qualifying standards. Two design consequences follow: before age 15, meet counts mainly express the athlete’s own choice rather than selection or entry costs, which licenses interpreting ages-13–14 volume as a behavioral indicator of engagement; and the ages-15–16 window coincides with the first selective gate, so the pre-milestone (13–14) and milestone (15–16) windows are analyzed separately.</w:t>
       </w:r>
     </w:p>
     <w:p>
@@ -743,7 +721,7 @@
         <w:pStyle w:val="BodyText"/>
       </w:pPr>
       <w:r>
-        <w:t xml:space="preserve">The cohort comprises all athletes who competed in any of six consecutive autumn editions (2011–2016) of a regional grassroots youth meet held simultaneously at three venues in eastern, western, and mid Norway (the last also serving the northern districts). Athletes were 13–14 and were entered by their district federations under district quotas, with no qualifying performance standard and no entry fee; this soft selection into the baseline meet is a design feature: disengagement trajectories arise from a baseline of demonstrable engagement. The target population is thus the engaged core of the age group, not every athlete with a registered result (Section 3.1). Birth years were restricted to 1998–2002 (boundary years 1997 and 2003 had only one eligible edition), and athletes appearing in both a 13- and a 14-year-old edition were de-duplicated to the earlier one (Supplementary Figure S0). Participation was identified by venue and date, because some venue-days are filed under other meet names (Supplementary Methods S-M12). For an internal cohort replication, participants were partitioned into Cohort A (births 1998–2000, baseline meets 2011–2014; n = 1,309) and Cohort B (births 2001–2002, baseline meets 2014–2016; n = 829). Athletes were retained regardless of club transfers (27.6% recorded results for two or more clubs), so changing club does not register as dropout. The total cohort comprised 2,138 athletes (1,006 male, 1,130 female, 2 with no registered sex), generating 231,144 competition entries through 2025 (register extract of May 2026; corrections made after a data audit during revision are listed in Supplementary Methods S-M12).</w:t>
+        <w:t xml:space="preserve">The cohort comprises all athletes who competed in any of six consecutive autumn editions (2011–2016) of a regional grassroots youth meet held simultaneously at three venues in eastern, western, and mid Norway. Athletes were 13–14 and were entered by their district federations under district quotas, with no qualifying performance standard and no entry fee; this soft selection into the baseline meet is a design feature: disengagement trajectories arise from a baseline of demonstrable engagement. The target population is thus the engaged core of the age group, not every athlete with a registered result (Section 3.1). Birth years were restricted to 1998–2002 (boundary years 1997 and 2003 had only one eligible edition), and athletes appearing in both a 13- and a 14-year-old edition were de-duplicated to the earlier one (Supplementary Figure S0). For an internal cohort replication, participants were partitioned into Cohort A (births 1998–2000, baseline meets 2011–2014; n = 1,309) and Cohort B (births 2001–2002, baseline meets 2014–2016; n = 829). Athletes were retained regardless of club transfers (27.6% recorded results for two or more clubs), so changing club does not register as dropout. The total cohort comprised 2,138 athletes (1,006 male, 1,130 female, 2 with no registered sex), generating 231,144 competition entries through 2025 (register extract of May 2026; data preparation in Supplementary Methods S-M12).</w:t>
       </w:r>
     </w:p>
     <w:bookmarkEnd w:id="16"/>
@@ -788,7 +766,7 @@
         <w:pStyle w:val="FirstParagraph"/>
       </w:pPr>
       <w:r>
-        <w:t xml:space="preserve">Active senior status was coded 1 if the athlete had ≥2 registered results in any calendar year at age 20+ (the senior age), and 0 otherwise; two results exclude sporadic returners while capturing athletes entering separate events at one meet. Sensitivity to this definition was tested with two alternatives (≥1 senior-age result; ≥2 results in each of two distinct senior-age years; Supplementary Table S9). A secondary time-to-event outcome (time to last active season, right-censoring athletes active in 2024+) supports Kaplan–Meier and Cox analyses (Section 2.5.4). Both outcomes refer to the final active season observed through 2025, so a temporary break followed by a return is not an exit.</w:t>
+        <w:t xml:space="preserve">Active senior status was coded 1 if the athlete had ≥2 registered results in any calendar year at age 20+, and 0 otherwise; two results exclude sporadic returners while capturing athletes entering separate events at one meet. Sensitivity to this definition was tested with two alternatives (≥1 senior-age result; ≥2 results in each of two distinct senior-age years; Supplementary Table S9). A secondary time-to-event outcome (time to last active season, right-censoring athletes active in 2024+) supports Kaplan–Meier and Cox analyses (Section 2.5.4). Both outcomes refer to the final active season observed through 2025, so a temporary break followed by a return is not an exit.</w:t>
       </w:r>
     </w:p>
     <w:bookmarkEnd w:id="18"/>
@@ -815,7 +793,7 @@
         <w:t xml:space="preserve">27</w:t>
       </w:r>
       <w:r>
-        <w:t xml:space="preserve">: a published table gives, per event × sex × age, a reference performance worth 1,000 points and a per-unit quotient (values capped at 1,500 to suppress data-entry errors). All events at the baseline meet were scored with the implement- and hurdle-specific norms for the athlete’s sex and age and the table’s own formulas (Supplementary Methods S-M3). We computed tyrving_best (baseline maximum), tyrving_peak_pre15, and per-age scores (yielding a baseline performance trajectory, age-14 minus age-13).</w:t>
+        <w:t xml:space="preserve">: a published table gives, per event × sex × age, a reference performance worth 1,000 points and a per-unit quotient (values capped at 1,500 to suppress data-entry errors). All events at the baseline meet were scored with the implement- and hurdle-specific norms for the athlete’s sex and age (Supplementary Methods S-M3). We computed tyrving_best (baseline maximum), tyrving_peak_pre15, and per-age scores (yielding a baseline performance trajectory, age-14 minus age-13).</w:t>
       </w:r>
     </w:p>
     <w:bookmarkEnd w:id="19"/>
@@ -936,7 +914,7 @@
         </m:r>
       </m:oMath>
       <w:r>
-        <w:t xml:space="preserve">. HHI ranges from 1/k (fully diversified) to 1 (single category). The baseline index is computed from results at ages 13–14 only, the window of the volume predictor (combined-event handling: Supplementary Methods S-M8). Categories co-occur unevenly (sprints and hurdles share training demands; throws transfer little); the HHI treats them symmetrically (see the limitations).</w:t>
+        <w:t xml:space="preserve">. HHI ranges from 1/k (fully diversified) to 1 (single category). The baseline index is computed from results at ages 13–14 only, the window of the volume predictor (combined-event handling: Supplementary Methods S-M8).</w:t>
       </w:r>
     </w:p>
     <w:bookmarkEnd w:id="20"/>
@@ -972,7 +950,7 @@
         <w:pStyle w:val="FirstParagraph"/>
       </w:pPr>
       <w:r>
-        <w:t xml:space="preserve">Sex (M/F as registered), birth quarter (Q1–Q4; Q1 = January–March, the relatively oldest in the calendar-year age group; unknown for 90 athletes registered without birth date), baseline region (eastern, mid, or western Norway, by venue; Supplementary Methods S-M12), and club size in the baseline year (the number of cohort athletes registered for the athlete’s baseline club that year). The 2 athletes without registered sex are excluded from all regression models, which condition on sex (Supplementary Methods S-M3).</w:t>
+        <w:t xml:space="preserve">Sex (M/F as registered), birth quarter (Q1–Q4; Q1 = January–March, the relatively oldest in the calendar-year age group; unknown for 90 athletes registered without birth date), baseline region (eastern, mid, or western Norway, by venue), and club size in the baseline year (the number of cohort athletes registered for the athlete’s baseline club that year). The 2 athletes without registered sex are excluded from all regression models, which condition on sex (Supplementary Methods S-M3).</w:t>
       </w:r>
     </w:p>
     <w:bookmarkEnd w:id="22"/>
@@ -1000,7 +978,7 @@
         <w:pStyle w:val="FirstParagraph"/>
       </w:pPr>
       <w:r>
-        <w:t xml:space="preserve">The principal inferential model is a logistic regression for active senior status using only baseline-window predictors (ages 13–14): sex, baseline Tyrving, HHI, and pre-milestone volume, fitted in a nested sequence (L1: sex; L2: + Tyrving; L3: + HHI; L4: + volume) to characterize each variable class’s unique contribution. Continuous covariates were z-standardized (per-SD effects; re-estimated within each training fold during cross-validation), and all nested models were fitted on the fixed L4 complete-case sample. Discrimination was assessed by stratified 5-fold cross-validation repeated 20 times (CV-AUC with 95% CI; model differences on identical folds), and again with folds grouped by baseline club; calibration slope, calibration-in-the-large, and Brier score used out-of-fold predictions (Supplementary Methods S-M4). Restricting predictors to ages 13–14 keeps the primary estimate unambiguously prospective, avoiding the mechanical zero-volume overlap that post-baseline predictors carry.</w:t>
+        <w:t xml:space="preserve">The principal inferential model is a logistic regression for active senior status using only baseline-window predictors (ages 13–14): sex, baseline Tyrving, HHI, and pre-milestone volume, fitted in a nested sequence (L1: sex; L2: + Tyrving; L3: + HHI; L4: + volume). Continuous covariates were z-standardized (per-SD effects; re-estimated within each training fold during cross-validation), and all nested models were fitted on the fixed L4 complete-case sample. Discrimination was assessed by stratified 5-fold cross-validation repeated 20 times (CV-AUC with 95% CI; model differences on identical folds), and again with folds grouped by baseline club; calibration slope, calibration-in-the-large, and Brier score used out-of-fold predictions (Supplementary Methods S-M4). Restricting predictors to ages 13–14 keeps the primary estimate unambiguously prospective, avoiding the mechanical zero-volume overlap that post-baseline predictors carry.</w:t>
       </w:r>
     </w:p>
     <w:bookmarkEnd w:id="24"/>
@@ -1045,7 +1023,7 @@
         <w:pStyle w:val="FirstParagraph"/>
       </w:pPr>
       <w:r>
-        <w:t xml:space="preserve">To disentangle early behavioral heterogeneity from within-athlete decline, we fit a logistic regression on athletes still competing at age 14 (≥1 result; 1,926; complete-case model n = 1,925) including both the volume level at age 14 and the change from 14 to 15 (Table 4; change = later minus earlier volume, so OR &gt; 1 per SD means that decline predicts lower retention). Because a change score can span the exit itself, three analyses probe the within-athlete claim directly: exit-aligned trajectories (volume one to three seasons before each dropout’s own final active season), a contamination-free change model among athletes still active at 16 (level at 15 plus change 15→16 predicting senior status; Supplementary Table S19), and an athlete fixed-effects model of log(1 + meets) at ages 13–19, with age fixed effects and indicators for the final active season and the three preceding seasons, which estimates each athlete’s decline relative to their own earlier volume (Supplementary Methods S-M6). Prospective early-warning thresholds on pre-milestone volume (classification performance at candidate cut-offs at the end of the age-14 season, with bootstrap CIs) are reported in Table 6, with cut-offs also derived in one birth cohort and tested in the other (Supplementary Table S29).</w:t>
+        <w:t xml:space="preserve">To disentangle early behavioral heterogeneity from within-athlete decline, we fit a logistic regression on athletes still competing at age 14 (≥1 result; 1,926; complete-case model n = 1,925) including both the volume level at age 14 and the change from 14 to 15 (Table 4; change = later minus earlier volume, so OR &gt; 1 per SD means that decline predicts lower retention). Because a change score can span the exit itself, three analyses probe the within-athlete claim directly: exit-aligned trajectories (volume one to three seasons before each dropout’s own final active season), a contamination-free change model among athletes still active at 16 (level at 15 plus change 15→16 predicting senior status; Supplementary Table S19), and an athlete fixed-effects model of log(1 + meets) at ages 13–19 that estimates each athlete’s decline relative to their own earlier volume (Supplementary Methods S-M6). Prospective early-warning thresholds on pre-milestone volume (candidate cut-offs applied at the end of the age-14 season, with bootstrap CIs) are reported in Table 6, with cut-offs also derived in one birth cohort and tested in the other (Supplementary Table S29).</w:t>
       </w:r>
     </w:p>
     <w:bookmarkEnd w:id="26"/>
@@ -1075,7 +1053,7 @@
         <w:t xml:space="preserve"> </w:t>
       </w:r>
       <w:r>
-        <w:t xml:space="preserve">with a baseline-only primary specification whose clock starts at the end of the age-14 season, when the predictor window closes (Supplementary Tables S10 and S16), a landmark analysis</w:t>
+        <w:t xml:space="preserve">with a baseline-only primary specification whose clock starts at the end of the age-14 season (Supplementary Tables S10 and S16), a landmark analysis</w:t>
       </w:r>
       <w:r>
         <w:rPr>
@@ -1276,7 +1254,7 @@
         <w:pStyle w:val="FirstParagraph"/>
       </w:pPr>
       <w:r>
-        <w:t xml:space="preserve">The cohort comprised 2,138 athletes (52.9% female): 1,309 in Cohort A and 829 in Cohort B, closely matched at baseline (mean Tyrving 816 and 836 and ~41% active at 17 in each; Table 1). Senior retention (≥1 season with ≥2 results at age 20+) was 15.8% in Cohort A and 17.0% in Cohort B (combined 16.3%). The proportion still active in 2024+ was 5.7% (A) and 10.5% (B), reflecting Cohort B’s shorter follow-up (fixed-window outcome at ages 20–22: 15.3% vs 16.5%; Supplementary Table S24). Of all 7,266 register athletes born 1998–2002 with a result at ages 13–14, the cohort is 29%, but it contains 80% of those with ten or more meets at those ages and 80% of all who later competed as seniors; the others had a median of 2 meets and 1.7% senior retention (Supplementary Table S31).</w:t>
+        <w:t xml:space="preserve">The cohort comprised 2,138 athletes (52.9% female): 1,309 in Cohort A and 829 in Cohort B, closely matched at baseline (mean Tyrving 816 and 836 and ~41% active at 17 in each; Table 1). Senior retention (≥1 season with ≥2 results at age 20+) was 15.8% in Cohort A and 17.0% in Cohort B (combined 16.3%). The proportion still active in 2024+ was 5.7% (A) and 10.5% (B), reflecting Cohort B’s shorter follow-up (fixed-window outcome at ages 20–22: 15.3% vs 16.5%; Supplementary Table S24). Of all 7,266 register athletes born 1998–2002 with a result at ages 13–14, the cohort is 29% but contains 80% of those with ten or more meets at those ages and 80% of later seniors; the others had a median of 2 meets and 1.7% senior retention (Supplementary Table S31).</w:t>
       </w:r>
     </w:p>
     <w:p>
@@ -1312,7 +1290,7 @@
         <w:pStyle w:val="FirstParagraph"/>
       </w:pPr>
       <w:r>
-        <w:t xml:space="preserve">Figure 2 presents the central behavioral observation (Figure 1 shows the conceptual model): median competitions per year by age (Table 2), plotted separately for eventual retainers (n = 348) and non-retainers (n = 1,790). The groups already differ at baseline (medians of 13 vs. 8 meets at age 13, and 16.5 vs. 8 at age 14), and from age 15 they diverge sharply: retainers peak at 19 meets and sustain that level through 17, while future dropouts fall from 8 to 3 to 0. Baseline differences and within-athlete decline are separated formally in Section 3.5.</w:t>
+        <w:t xml:space="preserve">Figure 2 presents the central behavioral observation (Figure 1 shows the conceptual model): median competitions per year by age (Table 2), plotted separately for eventual retainers (n = 348) and non-retainers (n = 1,790). The groups already differ at baseline (medians of 13 vs. 8 meets at age 13, and 16.5 vs. 8 at age 14), and from age 15 they diverge sharply: retainers peak at 19 meets and sustain that level through 17, while future dropouts fall from 8 to 3 to 0.</w:t>
       </w:r>
     </w:p>
     <w:p>
@@ -1336,7 +1314,7 @@
         <w:t xml:space="preserve"> </w:t>
       </w:r>
       <w:r>
-        <w:t xml:space="preserve">= .42). By age, the annual exit rate was 22–24% at 14–17 and peaked at 18–19 (28%), the first junior years. Descriptively, curves by ages-15–16 volume separate monotonically (50% senior retention with ≥31 meets vs. 0.8% with none; Figure 3), as do curves by pre-17 championship types (Supplementary Figure S3).</w:t>
+        <w:t xml:space="preserve">= .42). The annual exit rate peaked at ages 18–19 (28%), the first junior years. Descriptively, curves by ages-15–16 volume separate monotonically (50% senior retention with ≥31 meets vs. 0.8% with none; Figure 3), as do curves by pre-17 championship types (Supplementary Figure S3).</w:t>
       </w:r>
     </w:p>
     <w:p>
@@ -1484,7 +1462,7 @@
         <w:pStyle w:val="FirstParagraph"/>
       </w:pPr>
       <w:r>
-        <w:t xml:space="preserve">Adding region, birth quarter (Q1/Q4), and club size left the volume coefficient essentially unchanged (OR = 2.07 vs. 2.04). Of these covariates only birth quarter was associated with retention: conditional on performance and volume, relatively younger athletes were retained somewhat more often (linear trend OR = 1.16 per quarter, 95% CI [1.03, 1.31]; Supplementary Table S13). A quarter of volume variance lies between clubs (ICC = 0.27, 287 clubs), but with club random intercepts the coefficient was, if anything, larger (OR = 2.10, 95% CI [1.88, 2.34]; club-clustered standard errors, OR = 2.04 [1.75, 2.39], and a population-averaged model, 2.03 [1.74, 2.38], gave the same estimate with wider intervals; Supplementary Table S22), and folds grouped by club gave the same cross-validated AUC (0.766 [0.735, 0.797]; Supplementary Table S26): the association holds within clubs and carries over to clubs not used for fitting.</w:t>
+        <w:t xml:space="preserve">Adding region, birth quarter (Q1/Q4), and club size left the volume coefficient essentially unchanged (OR = 2.07 vs. 2.04). Of these covariates only birth quarter was associated with retention: conditional on performance and volume, relatively younger athletes were retained somewhat more often (linear trend OR = 1.16 per quarter, 95% CI [1.03, 1.31]; Supplementary Table S13). A quarter of volume variance lies between clubs (ICC = 0.27, 287 clubs), but club random intercepts, club-clustered standard errors and a population-averaged model gave similar volume estimates (OR = 2.10, 2.04 [1.75, 2.39] and 2.03; Supplementary Table S22), and folds grouped by club gave the same cross-validated AUC (0.766; Supplementary Table S26): the association holds within clubs and carries over to clubs not used for fitting.</w:t>
       </w:r>
     </w:p>
     <w:bookmarkEnd w:id="37"/>
@@ -1546,7 +1524,7 @@
         <w:t xml:space="preserve">R</w:t>
       </w:r>
       <w:r>
-        <w:t xml:space="preserve">² from 0.150 to 0.245 (Table 4).</w:t>
+        <w:t xml:space="preserve">² from 0.150 to 0.245 (Table 4; Supplementary Table S14).</w:t>
       </w:r>
     </w:p>
     <w:p>
@@ -1570,7 +1548,7 @@
         <w:t xml:space="preserve"> </w:t>
       </w:r>
       <w:r>
-        <w:t xml:space="preserve">&lt; .001) predicted senior status four or more years later (CV-AUC = 0.762): decline predicts exit among athletes who are all, at measurement, still active.</w:t>
+        <w:t xml:space="preserve">&lt; .001) predicted senior status four or more years later: decline predicts exit among athletes who are all, at measurement, still active.</w:t>
       </w:r>
     </w:p>
     <w:p>
@@ -1651,7 +1629,7 @@
         <w:pStyle w:val="FirstParagraph"/>
       </w:pPr>
       <w:r>
-        <w:t xml:space="preserve">In a fully time-aligned comparison, with behavior and performance both measured at ages 13–14 to remove any temporal advantage, volume discriminated somewhat better than baseline performance: CV-AUC = 0.700 for sex + baseline Tyrving and 0.740 for sex + volume (difference 0.040, 95% CI 0.006–0.074; Supplementary Table S27). The two were complementary: adding Tyrving to volume raised the AUC by 0.023 (0.007–0.038). With its within-baseline trajectory (change from 13 to 14), performance matched volume (0.737 vs. 0.736; n = 1,721). Because Tyrving norms are unequally demanding across event groups (mean baseline-meet points 798 in sprints, 501 in throws), we also ranked athletes within event, sex and age at the baseline meet; this rank did no better than Tyrving (0.689 vs. 0.700; difference 0.011 [−0.007, 0.028]).</w:t>
+        <w:t xml:space="preserve">With behavior and performance both measured at ages 13–14, volume discriminated somewhat better than baseline performance: CV-AUC = 0.700 for sex + baseline Tyrving and 0.740 for sex + volume (difference 0.040, 95% CI 0.006–0.074; Supplementary Tables S15 and S27). The two were complementary: adding Tyrving to volume raised the AUC by 0.023 (0.007–0.038). With its within-baseline trajectory (change from 13 to 14), performance matched volume (0.737 vs. 0.736; n = 1,721). A within-event rank at the baseline meet, which removes Tyrving’s unequal demands across event groups (mean baseline-meet points 798 in sprints, 501 in throws), did no better than Tyrving (0.689).</w:t>
       </w:r>
     </w:p>
     <w:p>
@@ -1659,7 +1637,7 @@
         <w:pStyle w:val="BodyText"/>
       </w:pPr>
       <w:r>
-        <w:t xml:space="preserve">Volume and performance were moderately correlated (Spearman ρ = .35 with baseline Tyrving; .52 with pre-15 peak; .63 for milestone volume vs. age-15 Tyrving), but above-median volume was associated with higher senior retention within every baseline-Tyrving quartile, from 15.8% vs. 3.9% in the lowest to 38.1% vs. 13.5% in the highest (Supplementary Table S32). Volume is related to, but clearly not reducible to, performance level.</w:t>
+        <w:t xml:space="preserve">Volume and performance were moderately correlated (Spearman ρ = .35 with baseline Tyrving), but above-median volume was associated with higher senior retention within every baseline-Tyrving quartile, from 15.8% vs. 3.9% in the lowest to 38.1% vs. 13.5% in the highest (Supplementary Table S32). Volume is related to, but clearly not reducible to, performance level.</w:t>
       </w:r>
     </w:p>
     <w:bookmarkEnd w:id="39"/>
@@ -1677,7 +1655,7 @@
         <w:pStyle w:val="FirstParagraph"/>
       </w:pPr>
       <w:r>
-        <w:t xml:space="preserve">Conditioning on athletes still in their career at age 16 (final active season at 16 or later; n = 1,148), volume across ages 15–16 was the largest contributor to subsequent cessation risk (HR = 0.68 per SD, 95% CI [0.62, 0.74], C-index = 0.695; complete-case n = 1,147; Supplementary Table S8). The baseline-only Cox model, with its clock starting at the end of the age-14 season (volume HR = 0.65 per SD, 95% CI [0.62, 0.69], Supplementary Table S10; 0.65 with structural controls, Supplementary Table S16), a period-specific decomposition (Table 5), diagnostics (Supplementary Tables S1, S6, S11; Supplementary Figure S4), and nested-predictor AUCs (Supplementary Table S17) are descriptive companions; post-baseline Cox estimates are not primary (predictor and at-risk window overlap), and their contamination-free analogue is the change model in Section 3.5.</w:t>
+        <w:t xml:space="preserve">Conditioning on athletes still in their career at age 16 (final active season at 16 or later; n = 1,148), volume across ages 15–16 was the largest contributor to subsequent cessation risk (HR = 0.68 per SD, 95% CI [0.62, 0.74], C-index = 0.695; complete-case n = 1,147; Supplementary Table S8). The baseline-only Cox model (volume HR = 0.65 per SD, 95% CI [0.62, 0.69]; Supplementary Tables S10 and S16), the period-specific decomposition (Table 5), and the remaining descriptive analyses (Supplementary Tables S1, S6, S11, S17; Supplementary Figure S4) are companions; post-baseline Cox estimates are not primary (predictor and at-risk window overlap), and their contamination-free analogue is the change model in Section 3.5.</w:t>
       </w:r>
     </w:p>
     <w:p>
@@ -1713,7 +1691,7 @@
         <w:pStyle w:val="FirstParagraph"/>
       </w:pPr>
       <w:r>
-        <w:t xml:space="preserve">Because the primary analysis uses only baseline-window data, a prospective rule can be evaluated at the end of the age-14 season (Table 6, with bootstrap CIs). At a moderate candidate threshold (vol &lt; 10 meets across ages 13–14, flagging 27.3%), senior retention was 5.5% among flagged athletes versus 20.3% among unflagged, a 3.7-fold difference in retention prospects (PPV = 0.95, sensitivity = 0.31); lower (&lt; 5) and higher (&lt; 15) thresholds narrow or broaden the screen. Two properties discipline use: PPV partly reflects the 84% base rate (~11-point precision gain), and NPV = 0.20 means unflagged athletes are</w:t>
+        <w:t xml:space="preserve">A prospective rule can be evaluated at the end of the age-14 season (Table 6). At a moderate candidate threshold (vol &lt; 10 meets across ages 13–14, flagging 27.3%), senior retention was 5.5% among flagged athletes versus 20.3% among unflagged, a 3.7-fold difference in retention prospects (PPV = 0.95, sensitivity = 0.31); lower (&lt; 5) and higher (&lt; 15) thresholds narrow or broaden the screen. Two properties discipline use: PPV partly reflects the 84% base rate (~11-point precision gain), and NPV = 0.20 means unflagged athletes are</w:t>
       </w:r>
       <w:r>
         <w:t xml:space="preserve"> </w:t>
@@ -1844,7 +1822,7 @@
         <w:pStyle w:val="BodyText"/>
       </w:pPr>
       <w:r>
-        <w:t xml:space="preserve">On the primary specification, the effect was robust to outcome definition (OR = 1.95, 2.04, 1.87 across the three definitions; Supplementary Table S9), to the fixed-window outcome (ages 20–22: OR = 2.08; Supplementary Table S24), to multiple imputation (Supplementary Table S21), to treating temporary gaps as exits (Cox HR 0.65, 0.62, 0.62; Supplementary Table S30; only 4.4% of athletes who missed two consecutive seasons ever returned), and to club-clustered standard errors (Supplementary Table S22). For unmeasured confounding, the E-value is 2.2 (confidence limit 2.0; Supplementary Table S3): a confounder would need risk-ratio associations of ≈2.2 with both early volume and retention, stronger than any measured covariate, to explain the association away.</w:t>
+        <w:t xml:space="preserve">On the primary specification, the effect was robust to outcome definition (OR = 1.95, 2.04, 1.87 across the three definitions; Supplementary Table S9), to the fixed-window outcome (ages 20–22: OR = 2.08; Supplementary Table S24), to multiple imputation (Supplementary Table S21), to treating temporary gaps as exits (Cox HR 0.65, 0.62, 0.62; Supplementary Table S30; only 4.4% of athletes who missed two consecutive seasons ever returned), and to club-clustered standard errors (Supplementary Table S22). The E-value for unmeasured confounding is 2.2 (confidence limit 2.0; Supplementary Table S3): a confounder would need risk-ratio associations of ≈2.2 with both early volume and retention, stronger than any measured covariate.</w:t>
       </w:r>
     </w:p>
     <w:p>
@@ -1879,7 +1857,7 @@
         <w:pStyle w:val="FirstParagraph"/>
       </w:pPr>
       <w:r>
-        <w:t xml:space="preserve">Four findings emerge from this 14-year follow-up of 2,138 young athletes. First, competition volume at ages 13–14 was strongly and prospectively associated with retaining senior competition, more strongly than performance measured in the same window, which nonetheless added complementary information. Second, the association was reproduced in both birth cohorts and withstood structural controls, club random effects, club-clustered and club-grouped validation, and multiple imputation. Third, the dropout signal decomposed into two components: early behavioral heterogeneity visible at 13–14, and a within-athlete decline in competition participation before exit. Exit-aligned trajectories showed most dropouts tapering (median 12 → 10 → 9 → 4 meets across their last four seasons), each athlete’s volume fell below their own earlier level in the two seasons before exit, and decline predicted exit even among athletes all still active at 16. Fourth, event-category concentration within track and field was not robustly associated with retention once performance in the athlete’s main event was taken into account; this is a different construct from, not a contradiction of, multisport diversification (§4.6).</w:t>
+        <w:t xml:space="preserve">Four findings emerge from this 14-year follow-up of 2,138 young athletes. First, competition volume at ages 13–14 was strongly and prospectively associated with retaining senior competition, more strongly than performance measured in the same window, which nonetheless added complementary information. Second, the association was reproduced in both birth cohorts and withstood structural controls, club random effects, club-clustered and club-grouped validation, and multiple imputation. Third, the dropout signal decomposed into two components: early behavioral heterogeneity visible at 13–14, and a within-athlete decline in competition participation before exit. Most dropouts tapered (median 12 → 10 → 9 → 4 meets across their last four seasons), falling below their own earlier level before exit, and decline predicted exit even among athletes all still active at 16. Fourth, event-category concentration within track and field was not robustly associated with retention once performance in the athlete’s main event was taken into account.</w:t>
       </w:r>
     </w:p>
     <w:bookmarkEnd w:id="45"/>
@@ -1897,7 +1875,7 @@
         <w:pStyle w:val="FirstParagraph"/>
       </w:pPr>
       <w:r>
-        <w:t xml:space="preserve">Competition volume discriminated senior retention somewhat better than performance (Tyrving score) measured in the same window (AUC difference 0.040, 95% CI 0.006–0.074), but the two were complementary, and with its within-baseline trajectory performance matched volume (Section 3.6): Hypothesis 2 holds in a weak form, behavior discriminating at least as well as performance, not instead of it. Performance reflects capability; volume reflects the athlete’s own choices about taking part (licensed by the open-entry structure of Section 2.2), and those choices carry at least as much information about later retention as capability does, and partly different information. Two caveats: volume is a near-noiseless count while Tyrving is a scored maximum whose norms are not equally demanding across event groups, so part of the gap could be measurement precision (a within-event rank did not close it, and the within-stratum effects argue not all of it); and predictor and outcome both index registered activity, so volume’s advantage describes when disengagement becomes observable, not a causal mechanism.</w:t>
+        <w:t xml:space="preserve">Competition volume discriminated senior retention somewhat better than performance (Tyrving score) measured in the same window (AUC difference 0.040, 95% CI 0.006–0.074), but the two were complementary, and with its within-baseline trajectory performance matched volume (Section 3.6): Hypothesis 2 holds in a weak form, behavior discriminating at least as well as performance, not instead of it. Performance reflects capability; volume reflects the athlete’s own choices about taking part, and those choices carry at least as much information about later retention as capability does, and partly different information. Two caveats: volume is a near-noiseless count while Tyrving is a scored maximum whose norms are not equally demanding across event groups, so part of the gap could be measurement precision (a within-event rank did not close it, and the within-stratum effects argue not all of it); and predictor and outcome both index registered activity, so volume’s advantage describes when disengagement becomes observable, not a causal mechanism.</w:t>
       </w:r>
     </w:p>
     <w:p>
@@ -1905,7 +1883,28 @@
         <w:pStyle w:val="BodyText"/>
       </w:pPr>
       <w:r>
-        <w:t xml:space="preserve">Low or declining volume can also have causes unrelated to waning engagement.</w:t>
+        <w:t xml:space="preserve">Low or declining volume can also have causes unrelated to waning engagement: cost, cited more often by youth from less-resourced families</w:t>
+      </w:r>
+      <w:r>
+        <w:rPr>
+          <w:vertAlign w:val="superscript"/>
+        </w:rPr>
+        <w:t xml:space="preserve">10</w:t>
+      </w:r>
+      <w:r>
+        <w:t xml:space="preserve"> </w:t>
+      </w:r>
+      <w:r>
+        <w:t xml:space="preserve">but attenuated here (clubs pay entry fees, travel is short); injury, the most frequently mentioned dropout reason in the 25-year Norwegian track-and-field follow-up (24.3%)</w:t>
+      </w:r>
+      <w:r>
+        <w:rPr>
+          <w:vertAlign w:val="superscript"/>
+        </w:rPr>
+        <w:t xml:space="preserve">3</w:t>
+      </w:r>
+      <w:r>
+        <w:t xml:space="preserve">; a move to another sport (§4.4); or school constraints. All leave the same register signature, hence we call declining participation a marker of disengagement, not a measure of it.</w:t>
       </w:r>
       <w:r>
         <w:t xml:space="preserve"> </w:t>
@@ -1915,22 +1914,58 @@
           <w:i/>
           <w:iCs/>
         </w:rPr>
-        <w:t xml:space="preserve">Cost:</w:t>
-      </w:r>
-      <w:r>
-        <w:t xml:space="preserve"> </w:t>
-      </w:r>
-      <w:r>
-        <w:t xml:space="preserve">sport expenses are cited as a dropout reason more often by Norwegian minority youth from less-resourced families</w:t>
+        <w:t xml:space="preserve">Periodization</w:t>
+      </w:r>
+      <w:r>
+        <w:t xml:space="preserve">, competing less in order to peak later, is unlikely: the decline spans successive calendar years and ends in exit, not a peak.</w:t>
+      </w:r>
+    </w:p>
+    <w:bookmarkEnd w:id="46"/>
+    <w:bookmarkStart w:id="47" w:name="Xce800bc90eb95f6422002b91edf8d025ee41a4b"/>
+    <w:p>
+      <w:pPr>
+        <w:pStyle w:val="Heading2"/>
+      </w:pPr>
+      <w:r>
+        <w:t xml:space="preserve">4.3 Decline is visible within athletes, and so is early heterogeneity</w:t>
+      </w:r>
+    </w:p>
+    <w:p>
+      <w:pPr>
+        <w:pStyle w:val="FirstParagraph"/>
+      </w:pPr>
+      <w:r>
+        <w:t xml:space="preserve">Is the divergence in Figure 2 a within-athlete decline, or early differentiation only, or an artifact of averaging abrupt exits at heterogeneous ages? The exit-aligned and fixed-effects analyses answer at the individual level: 95% of dropouts were still competing in their penultimate season, only 20% exited directly from peak volume, and volume fell below each athlete’s own earlier level in the two seasons before exit. The typical exit is preceded by declining participation, not a cliff, although the register shows the timing of this decline, not its reasons. Both components are nonetheless present: level and change carried independent information, also in the contamination-free window (Section 3.5), and future dropouts already differed at 13–14, consistent with retrospective evidence that dropouts’ developmental activities differ years before exit.</w:t>
       </w:r>
       <w:r>
         <w:rPr>
           <w:vertAlign w:val="superscript"/>
         </w:rPr>
-        <w:t xml:space="preserve">10</w:t>
-      </w:r>
-      <w:r>
-        <w:t xml:space="preserve">; the channel is attenuated here (clubs pay entry fees, travel is short) but not eliminated, and the register holds no socioeconomic data.</w:t>
+        <w:t xml:space="preserve">13</w:t>
+      </w:r>
+    </w:p>
+    <w:bookmarkEnd w:id="47"/>
+    <w:bookmarkStart w:id="48" w:name="Xe78cd062346b33a8c4f007b530df92eb1d95dc1"/>
+    <w:p>
+      <w:pPr>
+        <w:pStyle w:val="Heading2"/>
+      </w:pPr>
+      <w:r>
+        <w:t xml:space="preserve">4.4 Consistent with process accounts of withdrawal</w:t>
+      </w:r>
+    </w:p>
+    <w:p>
+      <w:pPr>
+        <w:pStyle w:val="FirstParagraph"/>
+      </w:pPr>
+      <w:r>
+        <w:t xml:space="preserve">We assess behavior, not motivational processes, so no single framework is confirmed; but the footprint is consistent with the main process accounts. In the Sport Commitment Model,</w:t>
+      </w:r>
+      <w:r>
+        <w:rPr>
+          <w:vertAlign w:val="superscript"/>
+        </w:rPr>
+        <w:t xml:space="preserve">6,7</w:t>
       </w:r>
       <w:r>
         <w:t xml:space="preserve"> </w:t>
@@ -1940,25 +1975,13 @@
           <w:i/>
           <w:iCs/>
         </w:rPr>
-        <w:t xml:space="preserve">Injury:</w:t>
-      </w:r>
-      <w:r>
-        <w:t xml:space="preserve"> </w:t>
-      </w:r>
-      <w:r>
-        <w:t xml:space="preserve">injuries were the most frequently mentioned dropout reason in the 25-year Norwegian track-and-field follow-up (24.3%),</w:t>
-      </w:r>
-      <w:r>
-        <w:rPr>
-          <w:vertAlign w:val="superscript"/>
-        </w:rPr>
-        <w:t xml:space="preserve">3</w:t>
-      </w:r>
-      <w:r>
-        <w:t xml:space="preserve"> </w:t>
-      </w:r>
-      <w:r>
-        <w:t xml:space="preserve">and an injured 14-year-old produces the same register signature as a disengaging one, so part of the decline is plausibly enforced rather than chosen.</w:t>
+        <w:t xml:space="preserve">enthusiastic</w:t>
+      </w:r>
+      <w:r>
+        <w:t xml:space="preserve"> </w:t>
+      </w:r>
+      <w:r>
+        <w:t xml:space="preserve">commitment is distinguished from</w:t>
       </w:r>
       <w:r>
         <w:t xml:space="preserve"> </w:t>
@@ -1968,13 +1991,75 @@
           <w:i/>
           <w:iCs/>
         </w:rPr>
-        <w:t xml:space="preserve">Other sports and school:</w:t>
-      </w:r>
-      <w:r>
-        <w:t xml:space="preserve"> </w:t>
-      </w:r>
-      <w:r>
-        <w:t xml:space="preserve">a move to another sport (§4.4) or school constraints leave the same signature; hence we call declining participation a marker of disengagement, not a measure of it.</w:t>
+        <w:t xml:space="preserve">constrained</w:t>
+      </w:r>
+      <w:r>
+        <w:t xml:space="preserve"> </w:t>
+      </w:r>
+      <w:r>
+        <w:t xml:space="preserve">commitment, the latter less sustainable and linked to burnout</w:t>
+      </w:r>
+      <w:r>
+        <w:rPr>
+          <w:vertAlign w:val="superscript"/>
+        </w:rPr>
+        <w:t xml:space="preserve">35</w:t>
+      </w:r>
+      <w:r>
+        <w:t xml:space="preserve">; declining volume before exit fits an eroding commitment balance, though the register cannot distinguish waning enthusiasm from accumulating constraint. Withdrawal-as-process accounts</w:t>
+      </w:r>
+      <w:r>
+        <w:rPr>
+          <w:vertAlign w:val="superscript"/>
+        </w:rPr>
+        <w:t xml:space="preserve">5,9</w:t>
+      </w:r>
+      <w:r>
+        <w:t xml:space="preserve"> </w:t>
+      </w:r>
+      <w:r>
+        <w:t xml:space="preserve">describe leaving as a gradual deliberative passage among athletes who remain formally involved: precisely what the exit-aligned trajectories show, a typical future dropout still competing, at reduced volume, for one or two seasons before the final exit. The register cannot observe the deliberation, but it can now observe its behavioral shape, thinning participation before exit, at the individual level.</w:t>
+      </w:r>
+    </w:p>
+    <w:p>
+      <w:pPr>
+        <w:pStyle w:val="BodyText"/>
+      </w:pPr>
+      <w:r>
+        <w:t xml:space="preserve">Two readings of the same footprint deserve equal standing: disengagement from sport (commitment erosion), or engagement reallocation, since ages 14–16 are when Norwegian multi-sport youth consolidate into one sport, the developmentally appropriate transitions that Battaglia et al.</w:t>
+      </w:r>
+      <w:r>
+        <w:rPr>
+          <w:vertAlign w:val="superscript"/>
+        </w:rPr>
+        <w:t xml:space="preserve">4</w:t>
+      </w:r>
+      <w:r>
+        <w:t xml:space="preserve"> </w:t>
+      </w:r>
+      <w:r>
+        <w:t xml:space="preserve">argue the dropout-as-crisis framing wrongly pathologizes. The register cannot separate them; Norwegian research is compatible with both, since involvement is strongly stratified</w:t>
+      </w:r>
+      <w:r>
+        <w:rPr>
+          <w:vertAlign w:val="superscript"/>
+        </w:rPr>
+        <w:t xml:space="preserve">11,12</w:t>
+      </w:r>
+      <w:r>
+        <w:t xml:space="preserve"> </w:t>
+      </w:r>
+      <w:r>
+        <w:t xml:space="preserve">and exit from organized sport can reclaim time and autonomy rather than mark a loss</w:t>
+      </w:r>
+      <w:r>
+        <w:rPr>
+          <w:vertAlign w:val="superscript"/>
+        </w:rPr>
+        <w:t xml:space="preserve">12</w:t>
+      </w:r>
+      <w:r>
+        <w:t xml:space="preserve">. What the register shows is that</w:t>
       </w:r>
       <w:r>
         <w:t xml:space="preserve"> </w:t>
@@ -1984,20 +2069,23 @@
           <w:i/>
           <w:iCs/>
         </w:rPr>
-        <w:t xml:space="preserve">Periodization</w:t>
-      </w:r>
-      <w:r>
-        <w:t xml:space="preserve">, competing less in order to peak later, is unlikely: the decline spans successive calendar years and ends in exit, not a peak.</w:t>
-      </w:r>
-    </w:p>
-    <w:bookmarkEnd w:id="46"/>
-    <w:bookmarkStart w:id="47" w:name="Xce800bc90eb95f6422002b91edf8d025ee41a4b"/>
+        <w:t xml:space="preserve">some</w:t>
+      </w:r>
+      <w:r>
+        <w:t xml:space="preserve"> </w:t>
+      </w:r>
+      <w:r>
+        <w:t xml:space="preserve">mechanism (erosion, reallocation, or constraint) leaves a footprint in registered activity before exit.</w:t>
+      </w:r>
+    </w:p>
+    <w:bookmarkEnd w:id="48"/>
+    <w:bookmarkStart w:id="49" w:name="sex-effect"/>
     <w:p>
       <w:pPr>
         <w:pStyle w:val="Heading2"/>
       </w:pPr>
       <w:r>
-        <w:t xml:space="preserve">4.3 Decline is visible within athletes, and so is early heterogeneity</w:t>
+        <w:t xml:space="preserve">4.5 Sex effect</w:t>
       </w:r>
     </w:p>
     <w:p>
@@ -2005,37 +2093,7 @@
         <w:pStyle w:val="FirstParagraph"/>
       </w:pPr>
       <w:r>
-        <w:t xml:space="preserve">Is the divergence in Figure 2 a within-athlete decline, or early differentiation only, or an artifact of averaging abrupt exits at heterogeneous ages? The exit-aligned and fixed-effects analyses answer at the individual level: 95% of dropouts were still competing in their penultimate season, only 20% exited directly from peak volume, and athletes competed 12% and 23% less than their own earlier level two seasons and one season before their final season. The typical exit is preceded by declining participation, not a cliff, although the register shows the timing of this decline, not its reasons (§4.2). Both components are nonetheless present: level and change carried independent information (Table 4), the pattern held in the contamination-free window (level OR = 3.04; change OR = 1.87 per SD increase), and future dropouts already differed at 13–14, consistent with retrospective evidence that dropouts’ developmental activities differ years before exit.</w:t>
-      </w:r>
-      <w:r>
-        <w:rPr>
-          <w:vertAlign w:val="superscript"/>
-        </w:rPr>
-        <w:t xml:space="preserve">13</w:t>
-      </w:r>
-    </w:p>
-    <w:bookmarkEnd w:id="47"/>
-    <w:bookmarkStart w:id="48" w:name="Xe78cd062346b33a8c4f007b530df92eb1d95dc1"/>
-    <w:p>
-      <w:pPr>
-        <w:pStyle w:val="Heading2"/>
-      </w:pPr>
-      <w:r>
-        <w:t xml:space="preserve">4.4 Consistent with process accounts of withdrawal</w:t>
-      </w:r>
-    </w:p>
-    <w:p>
-      <w:pPr>
-        <w:pStyle w:val="FirstParagraph"/>
-      </w:pPr>
-      <w:r>
-        <w:t xml:space="preserve">We assess behavior, not motivational processes, so no single framework is confirmed; but the footprint is consistent with the main process accounts. In the Sport Commitment Model,</w:t>
-      </w:r>
-      <w:r>
-        <w:rPr>
-          <w:vertAlign w:val="superscript"/>
-        </w:rPr>
-        <w:t xml:space="preserve">6,7</w:t>
+        <w:t xml:space="preserve">Unadjusted, Kaplan–Meier curves showed no clear sex difference (log-rank</w:t>
       </w:r>
       <w:r>
         <w:t xml:space="preserve"> </w:t>
@@ -2045,13 +2103,13 @@
           <w:i/>
           <w:iCs/>
         </w:rPr>
-        <w:t xml:space="preserve">enthusiastic</w:t>
-      </w:r>
-      <w:r>
-        <w:t xml:space="preserve"> </w:t>
-      </w:r>
-      <w:r>
-        <w:t xml:space="preserve">commitment is distinguished from</w:t>
+        <w:t xml:space="preserve">p</w:t>
+      </w:r>
+      <w:r>
+        <w:t xml:space="preserve"> </w:t>
+      </w:r>
+      <w:r>
+        <w:t xml:space="preserve">= .42); adjusted, females retained at significantly lower odds in every layer of the primary model (OR = 0.75 sex-only, 0.56 full model; Table 3) and in both cohorts:</w:t>
       </w:r>
       <w:r>
         <w:t xml:space="preserve"> </w:t>
@@ -2061,42 +2119,10 @@
           <w:i/>
           <w:iCs/>
         </w:rPr>
-        <w:t xml:space="preserve">constrained</w:t>
-      </w:r>
-      <w:r>
-        <w:t xml:space="preserve"> </w:t>
-      </w:r>
-      <w:r>
-        <w:t xml:space="preserve">commitment, the latter less sustainable and linked to burnout</w:t>
-      </w:r>
-      <w:r>
-        <w:rPr>
-          <w:vertAlign w:val="superscript"/>
-        </w:rPr>
-        <w:t xml:space="preserve">35</w:t>
-      </w:r>
-      <w:r>
-        <w:t xml:space="preserve">; declining volume before exit fits an eroding commitment balance, though the register cannot distinguish waning enthusiasm from accumulating constraint. Withdrawal-as-process accounts</w:t>
-      </w:r>
-      <w:r>
-        <w:rPr>
-          <w:vertAlign w:val="superscript"/>
-        </w:rPr>
-        <w:t xml:space="preserve">5,9</w:t>
-      </w:r>
-      <w:r>
-        <w:t xml:space="preserve"> </w:t>
-      </w:r>
-      <w:r>
-        <w:t xml:space="preserve">describe leaving as a gradual deliberative passage (first doubts, weighing of alternatives, a turning point) among athletes who remain formally involved: precisely what the exit-aligned trajectories show, a typical future dropout still competing, at reduced volume, for one or two seasons before the final exit. The register cannot observe the deliberation, but it can now observe its behavioral shape, thinning participation before exit, at the individual level.</w:t>
-      </w:r>
-    </w:p>
-    <w:p>
-      <w:pPr>
-        <w:pStyle w:val="BodyText"/>
-      </w:pPr>
-      <w:r>
-        <w:t xml:space="preserve">Two readings of the same footprint deserve equal standing. Declining volume may mark</w:t>
+        <w:t xml:space="preserve">conditional on the same early volume, concentration, and performance</w:t>
+      </w:r>
+      <w:r>
+        <w:t xml:space="preserve">, girls were less likely to remain, their higher early volumes partially masking the gap. The behavioral mechanism itself was similar across sexes (milestone-window volume HR = 0.46 for males and 0.45 for females; Supplementary Table S7), so the residual sex effect operates</w:t>
       </w:r>
       <w:r>
         <w:t xml:space="preserve"> </w:t>
@@ -2106,10 +2132,10 @@
           <w:i/>
           <w:iCs/>
         </w:rPr>
-        <w:t xml:space="preserve">disengagement from sport</w:t>
-      </w:r>
-      <w:r>
-        <w:t xml:space="preserve">, the commitment-erosion reading. It may also mark</w:t>
+        <w:t xml:space="preserve">above</w:t>
+      </w:r>
+      <w:r>
+        <w:t xml:space="preserve">, not</w:t>
       </w:r>
       <w:r>
         <w:t xml:space="preserve"> </w:t>
@@ -2119,46 +2145,52 @@
           <w:i/>
           <w:iCs/>
         </w:rPr>
-        <w:t xml:space="preserve">engagement reallocation</w:t>
-      </w:r>
-      <w:r>
-        <w:t xml:space="preserve">: ages 14–16 are precisely when Norwegian multi-sport youth consolidate into one sport, so for some athletes declining track-and-field volume signals rising commitment to handball or football rather than to nothing: the developmentally appropriate transitions that Battaglia et al.</w:t>
+        <w:t xml:space="preserve">through</w:t>
+      </w:r>
+      <w:r>
+        <w:t xml:space="preserve">, the behavioral pathway. This complements survey reports of higher female dropout</w:t>
       </w:r>
       <w:r>
         <w:rPr>
           <w:vertAlign w:val="superscript"/>
         </w:rPr>
-        <w:t xml:space="preserve">4</w:t>
-      </w:r>
-      <w:r>
-        <w:t xml:space="preserve"> </w:t>
-      </w:r>
-      <w:r>
-        <w:t xml:space="preserve">argue the dropout-as-crisis framing wrongly pathologizes. The register cannot separate the two; Norwegian participation research is compatible with both, since involvement is strongly stratified, from heavy to light,</w:t>
+        <w:t xml:space="preserve">11</w:t>
+      </w:r>
+      <w:r>
+        <w:t xml:space="preserve"> </w:t>
+      </w:r>
+      <w:r>
+        <w:t xml:space="preserve">and the clearly higher female attrition in Enoksen’s</w:t>
       </w:r>
       <w:r>
         <w:rPr>
           <w:vertAlign w:val="superscript"/>
         </w:rPr>
-        <w:t xml:space="preserve">11,12</w:t>
-      </w:r>
-      <w:r>
-        <w:t xml:space="preserve"> </w:t>
-      </w:r>
-      <w:r>
-        <w:t xml:space="preserve">and exit from organized sport can itself reclaim time and autonomy rather than mark a loss.</w:t>
-      </w:r>
-      <w:r>
-        <w:rPr>
-          <w:vertAlign w:val="superscript"/>
-        </w:rPr>
-        <w:t xml:space="preserve">12</w:t>
-      </w:r>
-      <w:r>
-        <w:t xml:space="preserve"> </w:t>
-      </w:r>
-      <w:r>
-        <w:t xml:space="preserve">What the register demonstrates is that</w:t>
+        <w:t xml:space="preserve">3</w:t>
+      </w:r>
+      <w:r>
+        <w:t xml:space="preserve"> </w:t>
+      </w:r>
+      <w:r>
+        <w:t xml:space="preserve">historical cohort.</w:t>
+      </w:r>
+    </w:p>
+    <w:bookmarkEnd w:id="49"/>
+    <w:bookmarkStart w:id="50" w:name="Xd8ded050b43dd1860dfb50ea2f396f3b413cf9a"/>
+    <w:p>
+      <w:pPr>
+        <w:pStyle w:val="Heading2"/>
+      </w:pPr>
+      <w:r>
+        <w:t xml:space="preserve">4.6 Within-sport event concentration is a different construct from multisport diversification</w:t>
+      </w:r>
+    </w:p>
+    <w:p>
+      <w:pPr>
+        <w:pStyle w:val="FirstParagraph"/>
+      </w:pPr>
+      <w:r>
+        <w:t xml:space="preserve">Event-category concentration at ages 13–14 was associated with greater senior retention only conditional on volume, only in the younger cohort, without discriminative value, and not once performance in the athlete’s main event was controlled (Section 3.9): concentrated athletes tend to be those who do well in their main event, and concentration itself adds little. Neither the association nor its absence speaks to the diversification literature, which concerns diversification</w:t>
       </w:r>
       <w:r>
         <w:t xml:space="preserve"> </w:t>
@@ -2168,31 +2200,22 @@
           <w:i/>
           <w:iCs/>
         </w:rPr>
-        <w:t xml:space="preserve">some</w:t>
-      </w:r>
-      <w:r>
-        <w:t xml:space="preserve"> </w:t>
-      </w:r>
-      <w:r>
-        <w:t xml:space="preserve">mechanism (erosion, reallocation, or constraint) leaves a footprint readable in registered activity before exit.</w:t>
-      </w:r>
-    </w:p>
-    <w:bookmarkEnd w:id="48"/>
-    <w:bookmarkStart w:id="49" w:name="sex-effect"/>
-    <w:p>
-      <w:pPr>
-        <w:pStyle w:val="Heading2"/>
-      </w:pPr>
-      <w:r>
-        <w:t xml:space="preserve">4.5 Sex effect</w:t>
-      </w:r>
-    </w:p>
-    <w:p>
-      <w:pPr>
-        <w:pStyle w:val="FirstParagraph"/>
-      </w:pPr>
-      <w:r>
-        <w:t xml:space="preserve">The sex pattern differs by specification, informatively. Unadjusted, Kaplan–Meier curves showed no clear sex difference (log-rank</w:t>
+        <w:t xml:space="preserve">across sports</w:t>
+      </w:r>
+      <w:r>
+        <w:t xml:space="preserve">: sampling versus single-sport specialization and its consequences for elite performance and health.</w:t>
+      </w:r>
+      <w:r>
+        <w:rPr>
+          <w:vertAlign w:val="superscript"/>
+        </w:rPr>
+        <w:t xml:space="preserve">18,19</w:t>
+      </w:r>
+      <w:r>
+        <w:t xml:space="preserve"> </w:t>
+      </w:r>
+      <w:r>
+        <w:t xml:space="preserve">Our HHI measures concentration</w:t>
       </w:r>
       <w:r>
         <w:t xml:space="preserve"> </w:t>
@@ -2202,13 +2225,55 @@
           <w:i/>
           <w:iCs/>
         </w:rPr>
-        <w:t xml:space="preserve">p</w:t>
-      </w:r>
-      <w:r>
-        <w:t xml:space="preserve"> </w:t>
-      </w:r>
-      <w:r>
-        <w:t xml:space="preserve">= .42); adjusted, females retained at significantly lower odds in every layer of the primary model (OR = 0.75 sex-only, 0.56 full model; Table 3) and in both cohorts:</w:t>
+        <w:t xml:space="preserve">within</w:t>
+      </w:r>
+      <w:r>
+        <w:t xml:space="preserve"> </w:t>
+      </w:r>
+      <w:r>
+        <w:t xml:space="preserve">one sport, and an athlete concentrated within track and field may simultaneously be a multisport sampler. The across-sport evidence is in any case less settled than often assumed.</w:t>
+      </w:r>
+      <w:r>
+        <w:rPr>
+          <w:vertAlign w:val="superscript"/>
+        </w:rPr>
+        <w:t xml:space="preserve">36,37</w:t>
+      </w:r>
+    </w:p>
+    <w:bookmarkEnd w:id="50"/>
+    <w:bookmarkStart w:id="51" w:name="what-registers-bring"/>
+    <w:p>
+      <w:pPr>
+        <w:pStyle w:val="Heading2"/>
+      </w:pPr>
+      <w:r>
+        <w:t xml:space="preserve">4.7 What registers bring</w:t>
+      </w:r>
+    </w:p>
+    <w:p>
+      <w:pPr>
+        <w:pStyle w:val="FirstParagraph"/>
+      </w:pPr>
+      <w:r>
+        <w:t xml:space="preserve">Registers address two structural problems in dropout research: withdrawn athletes are hard to recruit, and retrospective accounts compress a continuous process into a remembered decision. They bring no new theory, but a longitudinal behavioral test of theories built largely on cross-sectional or short-prospective evidence: here a well-calibrated baseline-only signal (AUC = 0.767, unchanged under club-grouped validation), an internal cohort replication, and an E-value of ≈2.2.</w:t>
+      </w:r>
+    </w:p>
+    <w:bookmarkEnd w:id="51"/>
+    <w:bookmarkStart w:id="52" w:name="implications-for-practitioners"/>
+    <w:p>
+      <w:pPr>
+        <w:pStyle w:val="Heading2"/>
+      </w:pPr>
+      <w:r>
+        <w:t xml:space="preserve">4.8 Implications for practitioners</w:t>
+      </w:r>
+    </w:p>
+    <w:p>
+      <w:pPr>
+        <w:pStyle w:val="FirstParagraph"/>
+      </w:pPr>
+      <w:r>
+        <w:t xml:space="preserve">The practical deliverable is a</w:t>
       </w:r>
       <w:r>
         <w:t xml:space="preserve"> </w:t>
@@ -2218,10 +2283,10 @@
           <w:i/>
           <w:iCs/>
         </w:rPr>
-        <w:t xml:space="preserve">conditional on the same early volume, concentration, and performance</w:t>
-      </w:r>
-      <w:r>
-        <w:t xml:space="preserve">, girls were less likely to remain, their higher early volumes partially masking the gap. The behavioral mechanism itself was similar across sexes (milestone-window volume HR = 0.46 for males and 0.45 for females; Supplementary Table S7), so the residual sex effect operates</w:t>
+        <w:t xml:space="preserve">testable targeting rule</w:t>
+      </w:r>
+      <w:r>
+        <w:t xml:space="preserve">, not a finished intervention: the register can say precisely</w:t>
       </w:r>
       <w:r>
         <w:t xml:space="preserve"> </w:t>
@@ -2231,10 +2296,31 @@
           <w:i/>
           <w:iCs/>
         </w:rPr>
-        <w:t xml:space="preserve">above</w:t>
-      </w:r>
-      <w:r>
-        <w:t xml:space="preserve">, not</w:t>
+        <w:t xml:space="preserve">whom</w:t>
+      </w:r>
+      <w:r>
+        <w:t xml:space="preserve"> </w:t>
+      </w:r>
+      <w:r>
+        <w:t xml:space="preserve">retention support would reach and how early; whether such support works is the pilot question in §4.10.</w:t>
+      </w:r>
+    </w:p>
+    <w:p>
+      <w:pPr>
+        <w:pStyle w:val="BodyText"/>
+      </w:pPr>
+      <w:r>
+        <w:rPr>
+          <w:b/>
+          <w:bCs/>
+        </w:rPr>
+        <w:t xml:space="preserve">(1) Register-based flagging at the end of the age-14 season.</w:t>
+      </w:r>
+      <w:r>
+        <w:t xml:space="preserve"> </w:t>
+      </w:r>
+      <w:r>
+        <w:t xml:space="preserve">Flag athletes whose ages-13–14 competition count falls below a candidate threshold. At &lt; 10 meets, the flag captures 27% of the cohort whose senior retention is 5.5%, versus 20.3% among the unflagged, a 3.7-fold difference computed automatically from data the federation already holds (Table 6; similar when derived in one birth cohort and applied to the other, Supplementary Table S29). Every flagged athlete is low-but-active (cohort entry guarantees a baseline meet), so the flag list is an outreach list. Sensitivity is 0.31, so most future dropouts are</w:t>
       </w:r>
       <w:r>
         <w:t xml:space="preserve"> </w:t>
@@ -2244,52 +2330,13 @@
           <w:i/>
           <w:iCs/>
         </w:rPr>
-        <w:t xml:space="preserve">through</w:t>
-      </w:r>
-      <w:r>
-        <w:t xml:space="preserve">, the behavioral pathway. This complements survey reports of higher female dropout</w:t>
-      </w:r>
-      <w:r>
-        <w:rPr>
-          <w:vertAlign w:val="superscript"/>
-        </w:rPr>
-        <w:t xml:space="preserve">11</w:t>
-      </w:r>
-      <w:r>
-        <w:t xml:space="preserve"> </w:t>
-      </w:r>
-      <w:r>
-        <w:t xml:space="preserve">and the clearly higher female attrition in Enoksen’s</w:t>
-      </w:r>
-      <w:r>
-        <w:rPr>
-          <w:vertAlign w:val="superscript"/>
-        </w:rPr>
-        <w:t xml:space="preserve">3</w:t>
-      </w:r>
-      <w:r>
-        <w:t xml:space="preserve"> </w:t>
-      </w:r>
-      <w:r>
-        <w:t xml:space="preserve">historical cohort.</w:t>
-      </w:r>
-    </w:p>
-    <w:bookmarkEnd w:id="49"/>
-    <w:bookmarkStart w:id="50" w:name="Xd8ded050b43dd1860dfb50ea2f396f3b413cf9a"/>
-    <w:p>
-      <w:pPr>
-        <w:pStyle w:val="Heading2"/>
-      </w:pPr>
-      <w:r>
-        <w:t xml:space="preserve">4.6 Within-sport event concentration is a different construct from multisport diversification</w:t>
-      </w:r>
-    </w:p>
-    <w:p>
-      <w:pPr>
-        <w:pStyle w:val="FirstParagraph"/>
-      </w:pPr>
-      <w:r>
-        <w:t xml:space="preserve">Event-category concentration at ages 13–14 was associated with greater senior retention only conditional on volume, only in the younger cohort, without discriminative value, and not once performance in the athlete’s main event was controlled (Section 3.9): concentrated athletes tend to be those who do well in their main event, and concentration itself adds little. That finding should not be read against the diversification literature, which concerns diversification</w:t>
+        <w:t xml:space="preserve">not</w:t>
+      </w:r>
+      <w:r>
+        <w:t xml:space="preserve"> </w:t>
+      </w:r>
+      <w:r>
+        <w:t xml:space="preserve">flagged: a flag concentrates risk; its absence reassures no one, so flagging should</w:t>
       </w:r>
       <w:r>
         <w:t xml:space="preserve"> </w:t>
@@ -2299,22 +2346,61 @@
           <w:i/>
           <w:iCs/>
         </w:rPr>
-        <w:t xml:space="preserve">across sports</w:t>
-      </w:r>
-      <w:r>
-        <w:t xml:space="preserve">: sampling versus single-sport specialization and its consequences for elite performance and health.</w:t>
+        <w:t xml:space="preserve">prioritize</w:t>
+      </w:r>
+      <w:r>
+        <w:t xml:space="preserve"> </w:t>
+      </w:r>
+      <w:r>
+        <w:t xml:space="preserve">outreach, not substitute for population-wide provision.</w:t>
+      </w:r>
+    </w:p>
+    <w:p>
+      <w:pPr>
+        <w:pStyle w:val="BodyText"/>
+      </w:pPr>
+      <w:r>
+        <w:rPr>
+          <w:b/>
+          <w:bCs/>
+        </w:rPr>
+        <w:t xml:space="preserve">(2) Flag again after age 15 using within-athlete change.</w:t>
+      </w:r>
+      <w:r>
+        <w:t xml:space="preserve"> </w:t>
+      </w:r>
+      <w:r>
+        <w:t xml:space="preserve">Level and change carry independent information (Section 3.5): screen on level at end of age 14 and on change at end of age 15, the latter just after the first selective gate and ahead of the junior years, when the annual exit rate peaks.</w:t>
+      </w:r>
+    </w:p>
+    <w:p>
+      <w:pPr>
+        <w:pStyle w:val="BodyText"/>
+      </w:pPr>
+      <w:r>
+        <w:rPr>
+          <w:b/>
+          <w:bCs/>
+        </w:rPr>
+        <w:t xml:space="preserve">(3) Lower the cost side of the next competition cycle, as an offer and never as pressure.</w:t>
+      </w:r>
+      <w:r>
+        <w:t xml:space="preserve"> </w:t>
+      </w:r>
+      <w:r>
+        <w:t xml:space="preserve">The remaining levers are residual and psychological costs: membership and equipment support, transport, low-stakes practice meets, and an explicit signal that participation is welcome regardless of performance.</w:t>
       </w:r>
       <w:r>
         <w:rPr>
           <w:vertAlign w:val="superscript"/>
         </w:rPr>
-        <w:t xml:space="preserve">18,19</w:t>
-      </w:r>
-      <w:r>
-        <w:t xml:space="preserve"> </w:t>
-      </w:r>
-      <w:r>
-        <w:t xml:space="preserve">Our HHI measures concentration</w:t>
+        <w:t xml:space="preserve">6,7</w:t>
+      </w:r>
+      <w:r>
+        <w:t xml:space="preserve"> </w:t>
+      </w:r>
+      <w:r>
+        <w:t xml:space="preserve">The register cannot distinguish athletes who are blocked from those choosing other priorities, for whom retention pressure would be misplaced; understanding</w:t>
       </w:r>
       <w:r>
         <w:t xml:space="preserve"> </w:t>
@@ -2324,13 +2410,67 @@
           <w:i/>
           <w:iCs/>
         </w:rPr>
-        <w:t xml:space="preserve">within</w:t>
-      </w:r>
-      <w:r>
-        <w:t xml:space="preserve"> </w:t>
-      </w:r>
-      <w:r>
-        <w:t xml:space="preserve">one sport, conditional on already participating in it, and the register says nothing about other sports: an athlete concentrated within track and field may simultaneously be a multisport sampler. The across-sport evidence is also less settled than often assumed: in youth swimming, early-specialization markers were</w:t>
+        <w:t xml:space="preserve">why</w:t>
+      </w:r>
+      <w:r>
+        <w:t xml:space="preserve"> </w:t>
+      </w:r>
+      <w:r>
+        <w:t xml:space="preserve">requires conversation, supported by commitment instruments such as the SCQ-2.</w:t>
+      </w:r>
+    </w:p>
+    <w:p>
+      <w:pPr>
+        <w:pStyle w:val="BodyText"/>
+      </w:pPr>
+      <w:r>
+        <w:rPr>
+          <w:b/>
+          <w:bCs/>
+        </w:rPr>
+        <w:t xml:space="preserve">(4) Be cautious about prescribing event diversification for retention.</w:t>
+      </w:r>
+      <w:r>
+        <w:t xml:space="preserve"> </w:t>
+      </w:r>
+      <w:r>
+        <w:t xml:space="preserve">Within-sport concentration was not associated with lower retention (§4.6); federations should not assume diversification pressure aids retention in this age group.</w:t>
+      </w:r>
+    </w:p>
+    <w:p>
+      <w:pPr>
+        <w:pStyle w:val="BodyText"/>
+      </w:pPr>
+      <w:r>
+        <w:rPr>
+          <w:b/>
+          <w:bCs/>
+        </w:rPr>
+        <w:t xml:space="preserve">Governance preconditions.</w:t>
+      </w:r>
+      <w:r>
+        <w:t xml:space="preserve"> </w:t>
+      </w:r>
+      <w:r>
+        <w:t xml:space="preserve">Operational flagging means algorithmic risk-profiling of minors, which the research-ethics exemption of Section 2.7 does not cover. Deployment would require a federation’s own legal basis and a data-protection impact assessment; flags visible to a designated officer rather than routinely to coaches; informed families with an opt-out; a retention limit for flag data; and attention to equity. The flag must be support-only: the same list that identifies whom to help could identify whom a stretched club quietly deprioritizes. These preconditions, and the untested intervention effect, are why the next step is a pilot (§4.10) rather than adoption.</w:t>
+      </w:r>
+    </w:p>
+    <w:bookmarkEnd w:id="52"/>
+    <w:bookmarkStart w:id="53" w:name="limitations"/>
+    <w:p>
+      <w:pPr>
+        <w:pStyle w:val="Heading2"/>
+      </w:pPr>
+      <w:r>
+        <w:t xml:space="preserve">4.9 Limitations</w:t>
+      </w:r>
+    </w:p>
+    <w:p>
+      <w:pPr>
+        <w:pStyle w:val="FirstParagraph"/>
+      </w:pPr>
+      <w:r>
+        <w:t xml:space="preserve">First, the outcome indexes</w:t>
       </w:r>
       <w:r>
         <w:t xml:space="preserve"> </w:t>
@@ -2340,73 +2480,19 @@
           <w:i/>
           <w:iCs/>
         </w:rPr>
-        <w:t xml:space="preserve">not</w:t>
-      </w:r>
-      <w:r>
-        <w:t xml:space="preserve"> </w:t>
-      </w:r>
-      <w:r>
-        <w:t xml:space="preserve">positively related to burnout and dropout,</w:t>
+        <w:t xml:space="preserve">attrition from track-and-field competition</w:t>
+      </w:r>
+      <w:r>
+        <w:t xml:space="preserve">, not from sport: a sport-switcher counts as a dropout, and the reallocation share is unbounded (§4.4). Second, the register records official results, not subjective experience, nor injury, a leading cause of attrition in this sport</w:t>
       </w:r>
       <w:r>
         <w:rPr>
           <w:vertAlign w:val="superscript"/>
         </w:rPr>
-        <w:t xml:space="preserve">36</w:t>
-      </w:r>
-      <w:r>
-        <w:t xml:space="preserve"> </w:t>
-      </w:r>
-      <w:r>
-        <w:t xml:space="preserve">and blanket condemnation of early specialization has been argued to outrun the evidence.</w:t>
-      </w:r>
-      <w:r>
-        <w:rPr>
-          <w:vertAlign w:val="superscript"/>
-        </w:rPr>
-        <w:t xml:space="preserve">37</w:t>
-      </w:r>
-      <w:r>
-        <w:t xml:space="preserve"> </w:t>
-      </w:r>
-      <w:r>
-        <w:t xml:space="preserve">The outcome also differs (retention at 20, not elite performance), and the association that remains is largely accounted for by main-event performance (OR = 1.07 [0.94, 1.23] when primary-category Tyrving is added; Supplementary Table S18). Governing bodies should read this neither as a license to push early specialization nor as grounds for forced diversification among motivated adolescents.</w:t>
-      </w:r>
-    </w:p>
-    <w:bookmarkEnd w:id="50"/>
-    <w:bookmarkStart w:id="51" w:name="what-registers-bring"/>
-    <w:p>
-      <w:pPr>
-        <w:pStyle w:val="Heading2"/>
-      </w:pPr>
-      <w:r>
-        <w:t xml:space="preserve">4.7 What registers bring</w:t>
-      </w:r>
-    </w:p>
-    <w:p>
-      <w:pPr>
-        <w:pStyle w:val="FirstParagraph"/>
-      </w:pPr>
-      <w:r>
-        <w:t xml:space="preserve">Registers address two structural problems in dropout research: withdrawn athletes are hard to recruit, and retrospective accounts compress a continuous process into a remembered decision. They bring no new theory, but a longitudinal behavioral test of theories built largely on cross-sectional or short-prospective evidence: here a well-calibrated baseline-only signal (AUC = 0.767, unchanged under club-grouped validation), an internal cohort replication, and an E-value of ≈2.2.</w:t>
-      </w:r>
-    </w:p>
-    <w:bookmarkEnd w:id="51"/>
-    <w:bookmarkStart w:id="52" w:name="implications-for-practitioners"/>
-    <w:p>
-      <w:pPr>
-        <w:pStyle w:val="Heading2"/>
-      </w:pPr>
-      <w:r>
-        <w:t xml:space="preserve">4.8 Implications for practitioners</w:t>
-      </w:r>
-    </w:p>
-    <w:p>
-      <w:pPr>
-        <w:pStyle w:val="FirstParagraph"/>
-      </w:pPr>
-      <w:r>
-        <w:t xml:space="preserve">The practical deliverable is a</w:t>
+        <w:t xml:space="preserve">3</w:t>
+      </w:r>
+      <w:r>
+        <w:t xml:space="preserve">; part of the decline is therefore plausibly non-volitional, and the qualitative literature remains essential for</w:t>
       </w:r>
       <w:r>
         <w:t xml:space="preserve"> </w:t>
@@ -2416,232 +2502,13 @@
           <w:i/>
           <w:iCs/>
         </w:rPr>
-        <w:t xml:space="preserve">testable targeting rule</w:t>
-      </w:r>
-      <w:r>
-        <w:t xml:space="preserve">, not a finished intervention: the register can say precisely</w:t>
-      </w:r>
-      <w:r>
-        <w:t xml:space="preserve"> </w:t>
-      </w:r>
-      <w:r>
-        <w:rPr>
-          <w:i/>
-          <w:iCs/>
-        </w:rPr>
-        <w:t xml:space="preserve">whom</w:t>
-      </w:r>
-      <w:r>
-        <w:t xml:space="preserve"> </w:t>
-      </w:r>
-      <w:r>
-        <w:t xml:space="preserve">retention support would reach and how early; whether such support works is the pilot question in §4.10. Four implications follow.</w:t>
-      </w:r>
-    </w:p>
-    <w:p>
-      <w:pPr>
-        <w:pStyle w:val="BodyText"/>
-      </w:pPr>
-      <w:r>
-        <w:rPr>
-          <w:b/>
-          <w:bCs/>
-        </w:rPr>
-        <w:t xml:space="preserve">(1) Register-based flagging at the end of the age-14 season.</w:t>
-      </w:r>
-      <w:r>
-        <w:t xml:space="preserve"> </w:t>
-      </w:r>
-      <w:r>
-        <w:t xml:space="preserve">Flag athletes whose ages-13–14 competition count falls below a candidate threshold. At &lt; 10 meets, the flag captures 27% of the cohort whose senior retention is 5.5%, versus 20.3% among the unflagged, a 3.7-fold difference computed automatically from data the federation already holds (Table 6; similar when derived in one birth cohort and applied to the other, Supplementary Table S29). Every flagged athlete is low-but-active (cohort entry guarantees a baseline meet), so the flag list is an outreach list, and the threshold behaves similarly against an activity-at-17 outcome (14% vs 51% still active). Two numbers discipline its use: sensitivity is 0.31, so most future dropouts are</w:t>
-      </w:r>
-      <w:r>
-        <w:t xml:space="preserve"> </w:t>
-      </w:r>
-      <w:r>
-        <w:rPr>
-          <w:i/>
-          <w:iCs/>
-        </w:rPr>
-        <w:t xml:space="preserve">not</w:t>
-      </w:r>
-      <w:r>
-        <w:t xml:space="preserve"> </w:t>
-      </w:r>
-      <w:r>
-        <w:t xml:space="preserve">flagged, and unflagged athletes’ own retention is only ~20%. A flag concentrates risk; its absence reassures no one, so flagging should</w:t>
-      </w:r>
-      <w:r>
-        <w:t xml:space="preserve"> </w:t>
-      </w:r>
-      <w:r>
-        <w:rPr>
-          <w:i/>
-          <w:iCs/>
-        </w:rPr>
-        <w:t xml:space="preserve">prioritize</w:t>
-      </w:r>
-      <w:r>
-        <w:t xml:space="preserve"> </w:t>
-      </w:r>
-      <w:r>
-        <w:t xml:space="preserve">outreach, not substitute for population-wide provision.</w:t>
-      </w:r>
-    </w:p>
-    <w:p>
-      <w:pPr>
-        <w:pStyle w:val="BodyText"/>
-      </w:pPr>
-      <w:r>
-        <w:rPr>
-          <w:b/>
-          <w:bCs/>
-        </w:rPr>
-        <w:t xml:space="preserve">(2) Flag again after age 15 using within-athlete change.</w:t>
-      </w:r>
-      <w:r>
-        <w:t xml:space="preserve"> </w:t>
-      </w:r>
-      <w:r>
-        <w:t xml:space="preserve">Level and change carry independent information (Section 3.5): screen on level at end of age 14 and on change at end of age 15, the latter just after the first selective gate and ahead of the junior years, when the annual exit rate peaks.</w:t>
-      </w:r>
-    </w:p>
-    <w:p>
-      <w:pPr>
-        <w:pStyle w:val="BodyText"/>
-      </w:pPr>
-      <w:r>
-        <w:rPr>
-          <w:b/>
-          <w:bCs/>
-        </w:rPr>
-        <w:t xml:space="preserve">(3) Lower the cost side of the next competition cycle, as an offer and never as pressure.</w:t>
-      </w:r>
-      <w:r>
-        <w:t xml:space="preserve"> </w:t>
-      </w:r>
-      <w:r>
-        <w:t xml:space="preserve">With entry fees club-paid and travel short (Section 2.2), the remaining levers are residual and psychological costs: membership and equipment support, coach-accompanied transport, low-stakes practice meets, and an explicit signal that participation is welcome regardless of performance.</w:t>
-      </w:r>
-      <w:r>
-        <w:rPr>
-          <w:vertAlign w:val="superscript"/>
-        </w:rPr>
-        <w:t xml:space="preserve">6,7</w:t>
-      </w:r>
-      <w:r>
-        <w:t xml:space="preserve"> </w:t>
-      </w:r>
-      <w:r>
-        <w:t xml:space="preserve">The register cannot distinguish athletes who are blocked from athletes choosing other priorities, for whom retention pressure would be misplaced; understanding</w:t>
-      </w:r>
-      <w:r>
-        <w:t xml:space="preserve"> </w:t>
-      </w:r>
-      <w:r>
-        <w:rPr>
-          <w:i/>
-          <w:iCs/>
-        </w:rPr>
         <w:t xml:space="preserve">why</w:t>
       </w:r>
       <w:r>
         <w:t xml:space="preserve"> </w:t>
       </w:r>
       <w:r>
-        <w:t xml:space="preserve">still requires conversation, for which commitment instruments such as the SCQ-2 complement the register.</w:t>
-      </w:r>
-    </w:p>
-    <w:p>
-      <w:pPr>
-        <w:pStyle w:val="BodyText"/>
-      </w:pPr>
-      <w:r>
-        <w:rPr>
-          <w:b/>
-          <w:bCs/>
-        </w:rPr>
-        <w:t xml:space="preserve">(4) Be cautious about prescribing event diversification for retention.</w:t>
-      </w:r>
-      <w:r>
-        <w:t xml:space="preserve"> </w:t>
-      </w:r>
-      <w:r>
-        <w:t xml:space="preserve">Within-sport concentration was not associated with lower retention (§4.6); federations should not assume diversification pressure aids retention in this age group.</w:t>
-      </w:r>
-    </w:p>
-    <w:p>
-      <w:pPr>
-        <w:pStyle w:val="BodyText"/>
-      </w:pPr>
-      <w:r>
-        <w:rPr>
-          <w:b/>
-          <w:bCs/>
-        </w:rPr>
-        <w:t xml:space="preserve">Governance preconditions.</w:t>
-      </w:r>
-      <w:r>
-        <w:t xml:space="preserve"> </w:t>
-      </w:r>
-      <w:r>
-        <w:t xml:space="preserve">Operational flagging means algorithmic risk-profiling of minors, and the research-ethics exemption this study relies on (Section 2.7) licenses none of it. Deployment would require a federation’s own legal basis and a data-protection impact assessment; flags visible to a designated officer rather than routinely to coaches (avoiding expectancy and labeling effects); informed families with an opt-out; a retention limit for flag data; and attention to equity, which the register cannot audit. That the screen runs without athlete contact is a transparency problem to solve, not a feature, and the flag must be support-only: the same list that identifies whom to help could identify whom a stretched club quietly deprioritizes. These preconditions, and the untested intervention effect, are why the next step is the pilot of §4.10 rather than adoption.</w:t>
-      </w:r>
-    </w:p>
-    <w:bookmarkEnd w:id="52"/>
-    <w:bookmarkStart w:id="53" w:name="limitations"/>
-    <w:p>
-      <w:pPr>
-        <w:pStyle w:val="Heading2"/>
-      </w:pPr>
-      <w:r>
-        <w:t xml:space="preserve">4.9 Limitations</w:t>
-      </w:r>
-    </w:p>
-    <w:p>
-      <w:pPr>
-        <w:pStyle w:val="FirstParagraph"/>
-      </w:pPr>
-      <w:r>
-        <w:t xml:space="preserve">First, the outcome indexes</w:t>
-      </w:r>
-      <w:r>
-        <w:t xml:space="preserve"> </w:t>
-      </w:r>
-      <w:r>
-        <w:rPr>
-          <w:i/>
-          <w:iCs/>
-        </w:rPr>
-        <w:t xml:space="preserve">attrition from track-and-field competition</w:t>
-      </w:r>
-      <w:r>
-        <w:t xml:space="preserve">, not from sport: a sport-switcher counts as a dropout, and the reallocation share is unbounded (§4.4). Second, the register records official results, not subjective experience, nor injury, a leading cause of attrition in this sport</w:t>
-      </w:r>
-      <w:r>
-        <w:rPr>
-          <w:vertAlign w:val="superscript"/>
-        </w:rPr>
-        <w:t xml:space="preserve">3</w:t>
-      </w:r>
-      <w:r>
-        <w:t xml:space="preserve">; part of the decline is therefore plausibly non-volitional, and the qualitative literature remains essential for</w:t>
-      </w:r>
-      <w:r>
-        <w:t xml:space="preserve"> </w:t>
-      </w:r>
-      <w:r>
-        <w:rPr>
-          <w:i/>
-          <w:iCs/>
-        </w:rPr>
-        <w:t xml:space="preserve">why</w:t>
-      </w:r>
-      <w:r>
-        <w:t xml:space="preserve"> </w:t>
-      </w:r>
-      <w:r>
-        <w:t xml:space="preserve">volume declines. Third, the target population is the engaged core, athletes entered for the regional 13–14 meet (29% of register athletes with a result at 13–14, but 80% of eventual seniors), not all young athletes; among casual participants outside the cohort, volume was also associated with retention (OR = 2.17 per 10 meets; Supplementary Table S31), but the thresholds and absolute rates apply to the engaged core. The three venues cover eastern, western, and mid Norway, with northern districts served by the mid-Norway venue. Fourth, predictor and outcome share a measurement scale; despite the baseline-only model, the change models, the exit-aligned and fixed-effects analyses, and the landmark analysis, structural overlap remains a conceptual limitation of register-only designs. Fifth, the post-baseline Cox specification violated proportional hazards (Schoenfeld χ² = 293.2); its estimates are descriptive only. Sixth, Tyrving norms are not equally demanding across event groups (throws and race walking score lower), and the HHI treats event categories symmetrically although they co-occur unevenly (98% of hurdlers also sprinted), so identical values can represent different combination patterns. Seventh, athletes born in 2002 have four senior seasons of observation (2022–2025), though the fixed-window outcome gives near-identical results. Eighth, the thresholds are candidates calibrated to a complete-register, open-entry, club-pays system; they do not transfer to coach-gated or pay-to-play systems without re-derivation, and no intervention effect has been demonstrated: §4.8 is targeting logic, not evaluated policy.</w:t>
+        <w:t xml:space="preserve">volume declines. Third, the target population is the engaged core, athletes entered for the regional 13–14 meet, not all young athletes; among casual participants outside the cohort, volume was also associated with retention (OR = 2.17 per 10 meets; Supplementary Table S31), but the thresholds and absolute rates apply to the engaged core. The three venues cover eastern, western, and mid Norway, with northern districts served by the mid-Norway venue. Fourth, predictor and outcome share a measurement scale; despite the baseline-only model, the change models, the exit-aligned and fixed-effects analyses, and the landmark analysis, structural overlap remains a conceptual limitation of register-only designs. Fifth, the post-baseline Cox specification violated proportional hazards (Schoenfeld χ² = 293.2); its estimates are descriptive only. Sixth, Tyrving norms are not equally demanding across event groups (throws and race walking score lower), and the HHI treats event categories symmetrically although they co-occur unevenly (98% of hurdlers also sprinted), so identical values can represent different combination patterns. Seventh, athletes born in 2002 have four senior seasons of observation (2022–2025), though the fixed-window outcome gives near-identical results. Eighth, the thresholds are candidates calibrated to a complete-register, open-entry, club-pays system; they do not transfer to coach-gated or pay-to-play systems without re-derivation, and no intervention effect has been demonstrated: §4.8 is targeting logic, not evaluated policy.</w:t>
       </w:r>
     </w:p>
     <w:bookmarkEnd w:id="53"/>
@@ -2677,7 +2544,7 @@
         <w:pStyle w:val="FirstParagraph"/>
       </w:pPr>
       <w:r>
-        <w:t xml:space="preserve">Senior retention in Norwegian youth track and field is prospectively associated with baseline-window competition behavior: athletes who already compete more at ages 13–14 retain at substantially higher rates, and those who decline retain at substantially lower rates. The decline is visible within athletes in the seasons before exit, and is no averaging artifact. The effect withstands structural, club-level, missing-data, and outcome-definition checks and is reproduced in both birth cohorts; early heterogeneity and within-athlete decline contribute independently, and baseline performance adds complementary information. The findings are consistent with, though do not by themselves confirm, accounts of withdrawal as a gradual deliberative process, and they yield a register-implementable targeting rule whose intervention value, under the governance preconditions above, is now a testable question.</w:t>
+        <w:t xml:space="preserve">Senior retention in Norwegian youth track and field is prospectively associated with baseline-window competition behavior: athletes who already compete more at ages 13–14 retain at substantially higher rates, and those who decline retain at substantially lower rates. The decline is visible within athletes in the seasons before exit, and is no averaging artifact. The effect withstands structural, club-level, missing-data, and outcome-definition checks and is reproduced in both birth cohorts; early heterogeneity and within-athlete decline contribute independently, and baseline performance adds complementary information. The findings are consistent with, though do not by themselves confirm, accounts of withdrawal as a gradual deliberative process, and they yield a register-implementable targeting rule whose intervention value is now a testable question.</w:t>
       </w:r>
     </w:p>
     <w:p>

</xml_diff>

<commit_message>
IJSSC R1: author's claim decisions applied; freeze set
- Level and change "both predict retention" (volume at 14 adds nothing once
  volume at 15 is known, OR 0.98 per meet [0.95, 1.00], computed in r1_03 and
  shown in the Table 4 note); the change model at 16 is no longer called
  contamination-free (269 of 1,088 had 16 as final active season);
  performance is "at the baseline meet"; Cox models with volume agree on HHI.
- New text numbers stored in r1_04 (flagged athletes without a result at 14;
  HHI cohort difference p = .11).
- Word count from the build stated in both letters (6,339) and checked by
  RUN_ALL; precise author-year citation check.
- FREEZE.md and hash files; RUN_ALL.sh green twice, outputs byte-identical.

Co-Authored-By: Claude Opus 5.5 <noreply@anthropic.com>
</commit_message>
<xml_diff>
--- a/forskning/ncc-kohort/revision_r1/submission_r1/MANUSCRIPT_R1_clean.docx
+++ b/forskning/ncc-kohort/revision_r1/submission_r1/MANUSCRIPT_R1_clean.docx
@@ -104,7 +104,7 @@
         <w:pStyle w:val="FirstParagraph"/>
       </w:pPr>
       <w:r>
-        <w:t xml:space="preserve">Withdrawal from youth sport is theorized as a gradual process, but its longitudinal behavioral signature has been hard to observe directly. We used Norway’s national competition register to follow 2,138 athletes who competed as 13–14-year-olds in a regional youth track-and-field meet (birth years 1998–2002) for up to 14 years. In a prospective logistic regression for active senior status (≥2 registered results in a calendar year at age 20+) using only ages-13–14 predictors, competition volume was the strongest predictor (OR = 2.04 per SD, 95% CI [1.80, 2.32]; cross-validated AUC = 0.767; calibration slope 0.98), discriminated retention somewhat better than age-normed performance measured in the same window (which added complementary information; OR = 1.75 per SD), was robust to structural controls, club random effects, and club-grouped validation, and was reproduced in two adjacent birth cohorts (an internal replication). Competition participation declined within athletes before exit: relative to their own earlier seasons and net of the common age profile, competition volume (1 + meets) was 12% lower two seasons and 23% lower one season before athletes’ final active season, and among athletes still active at 16, declining volume across ages 15–16 predicted lower senior retention (OR = 0.54 per SD of decline). Within-sport event concentration was not robustly associated with retention. A register-based candidate flag at the end of the age-14 season (&lt; 10 meets) identifies the 27% of athletes whose senior retention is 5.5%, versus 20% among the unflagged (the lowest-volume quartile gave this cut-off in each birth cohort, and it held when applied to the other): a testable targeting rule for retention-supporting outreach in open-entry systems.</w:t>
+        <w:t xml:space="preserve">Withdrawal from youth sport is theorized as a gradual process, but its longitudinal behavioral signature has been hard to observe directly. We used Norway’s national competition register to follow 2,138 athletes who competed as 13–14-year-olds in a regional youth track-and-field meet (birth years 1998–2002) for up to 14 years. In a prospective logistic regression for active senior status (≥2 registered results in a calendar year at age 20+) using only ages-13–14 predictors, competition volume was the strongest predictor (OR = 2.04 per SD, 95% CI [1.80, 2.32]; cross-validated AUC = 0.767; calibration slope 0.98), discriminated retention somewhat better than age-normed performance at the baseline meet (which added complementary information; OR = 1.75 per SD), was robust to structural controls, club random effects, and club-grouped validation, and was reproduced in two adjacent birth cohorts (an internal replication). Competition participation declined within athletes before exit: relative to their own earlier seasons and net of the common age profile, competition volume (1 + meets) was 12% lower two seasons and 23% lower one season before athletes’ final active season, and among athletes still active at 16, declining volume across ages 15–16 predicted lower senior retention (OR = 0.54 per SD of decline). Within-sport event concentration was not robustly associated with retention. A register-based candidate flag at the end of the age-14 season (&lt; 10 meets) identifies the 27% of athletes whose senior retention is 5.5%, versus 20% among the unflagged (the lowest-volume quartile gave this cut-off in each birth cohort, and it held when applied to the other): a testable targeting rule for retention-supporting outreach in open-entry systems.</w:t>
       </w:r>
     </w:p>
     <w:p>
@@ -1023,7 +1023,7 @@
         <w:pStyle w:val="FirstParagraph"/>
       </w:pPr>
       <w:r>
-        <w:t xml:space="preserve">To disentangle early behavioral heterogeneity from within-athlete decline, we fit a logistic regression on athletes still competing at age 14 (≥1 result; 1,926; complete-case model n = 1,925) including both the volume level at age 14 and the change from 14 to 15 (Table 4; change = later minus earlier volume, so OR &gt; 1 per SD means that decline predicts lower retention). Because a change score can span the exit itself, three analyses probe the within-athlete claim directly: exit-aligned trajectories (volume one to three seasons before each dropout’s own final active season), a contamination-free change model among athletes still active at 16 (level at 15 plus change 15→16 predicting senior status; Supplementary Table S19), and an athlete fixed-effects model of log(1 + meets) at ages 13–19 that estimates each athlete’s decline relative to their own earlier volume (Supplementary Methods S-M6). Prospective early-warning thresholds on pre-milestone volume (candidate cut-offs applied at the end of the age-14 season, with bootstrap CIs) are reported in Table 6, with cut-offs also derived in one birth cohort and tested in the other (Supplementary Table S29).</w:t>
+        <w:t xml:space="preserve">To disentangle early behavioral heterogeneity from within-athlete decline, we fit a logistic regression on athletes still competing at age 14 (≥1 result; 1,926; complete-case model n = 1,925) including both the volume level at age 14 and the change from 14 to 15 (Table 4; change = later minus earlier volume, so OR &gt; 1 per SD means that decline predicts lower retention). Because a change score can span the exit itself, three analyses probe the within-athlete claim directly: exit-aligned trajectories (volume one to three seasons before each dropout’s own final active season), a change model among athletes still active at 16 (level at 15 plus change 15→16 predicting senior status; Supplementary Table S19), and an athlete fixed-effects model of log(1 + meets) at ages 13–19 that estimates each athlete’s decline relative to their own earlier volume (Supplementary Methods S-M6). Prospective early-warning thresholds on pre-milestone volume (candidate cut-offs applied at the end of the age-14 season, with bootstrap CIs) are reported in Table 6, with cut-offs also derived in one birth cohort and tested in the other (Supplementary Table S29).</w:t>
       </w:r>
     </w:p>
     <w:bookmarkEnd w:id="26"/>
@@ -1484,7 +1484,7 @@
           <w:b/>
           <w:bCs/>
         </w:rPr>
-        <w:t xml:space="preserve">Early behavioral heterogeneity and within-athlete decline contribute independently; they are not substitutes.</w:t>
+        <w:t xml:space="preserve">Early behavioral heterogeneity and within-athlete decline both predict retention.</w:t>
       </w:r>
       <w:r>
         <w:t xml:space="preserve"> </w:t>
@@ -1498,7 +1498,7 @@
         <w:pStyle w:val="BodyText"/>
       </w:pPr>
       <w:r>
-        <w:t xml:space="preserve">First, level and change. Among athletes still competing at age 14 (≥1 result; 1,926; complete-case model n = 1,925), the age-14 volume level (OR = 2.51 per SD, 95% CI [2.17, 2.89]) and the change from age 14 to 15 (OR = 2.29 per SD increase, 95% CI [2.00, 2.62]; i.e., OR = 0.44 per SD, about 6.4 meets, of decline) contributed independently (both</w:t>
+        <w:t xml:space="preserve">First, level and change. Among athletes still competing at age 14 (≥1 result; 1,926; complete-case model n = 1,925), the age-14 volume level (OR = 2.51 per SD, 95% CI [2.17, 2.89]) and the change from age 14 to 15 (OR = 2.29 per SD increase, 95% CI [2.00, 2.62]; i.e., OR = 0.44 per SD, about 6.4 meets, of decline) both predicted retention (both</w:t>
       </w:r>
       <w:r>
         <w:t xml:space="preserve"> </w:t>
@@ -1524,7 +1524,7 @@
         <w:t xml:space="preserve">R</w:t>
       </w:r>
       <w:r>
-        <w:t xml:space="preserve">² from 0.150 to 0.245 (Table 4; Supplementary Table S14).</w:t>
+        <w:t xml:space="preserve">² from 0.150 to 0.245 (Table 4; Supplementary Table S14). Equivalently, volume at 14 added nothing once volume at 15 was known (OR = 0.98 per meet, 95% CI 0.95–1.00; Table 4 note).</w:t>
       </w:r>
     </w:p>
     <w:p>
@@ -1532,7 +1532,7 @@
         <w:pStyle w:val="BodyText"/>
       </w:pPr>
       <w:r>
-        <w:t xml:space="preserve">Second, because a change score spanning the exit could conflate decline with the exit itself, we repeated the test where no exit can contaminate it: among athletes still competing at age 16 (≥2 results; n = 1,088), volume at 15 (OR = 3.04, 95% CI [2.56, 3.62]) and change from 15 to 16 (OR = 1.87 per SD increase, 95% CI [1.60, 2.19]; 0.54 per SD of decline; both</w:t>
+        <w:t xml:space="preserve">Second, because a change score spanning the exit could conflate decline with the exit itself, we repeated the test among athletes still competing at age 16 (≥2 results; n = 1,088, of whom 269 had their final active season at 16), volume at 15 (OR = 3.04, 95% CI [2.56, 3.62]) and change from 15 to 16 (OR = 1.87 per SD increase, 95% CI [1.60, 2.19]; 0.54 per SD of decline; both</w:t>
       </w:r>
       <w:r>
         <w:t xml:space="preserve"> </w:t>
@@ -1629,7 +1629,7 @@
         <w:pStyle w:val="FirstParagraph"/>
       </w:pPr>
       <w:r>
-        <w:t xml:space="preserve">With behavior and performance both measured at ages 13–14, volume discriminated somewhat better than baseline performance: CV-AUC = 0.700 for sex + baseline Tyrving and 0.740 for sex + volume (difference 0.040, 95% CI 0.006–0.074; Supplementary Tables S15 and S27). The two were complementary: adding Tyrving to volume raised the AUC by 0.023 (0.007–0.038). With its within-baseline trajectory (change from 13 to 14), performance did not differ from volume (0.737 vs. 0.736; 95% CI for the difference −0.04 to 0.04; n = 1,721). A within-event rank at the baseline meet, which removes Tyrving’s unequal demands across event groups (mean baseline-meet points 798 in sprints, 501 in throws), did no better than Tyrving (0.689).</w:t>
+        <w:t xml:space="preserve">With volume over ages 13–14 and performance at the baseline meet, volume discriminated somewhat better than baseline performance: CV-AUC = 0.700 for sex + baseline Tyrving and 0.740 for sex + volume (difference 0.040, 95% CI 0.006–0.074; Supplementary Tables S15 and S27). The two were complementary: adding Tyrving to volume raised the AUC by 0.023 (0.007–0.038). With its within-baseline trajectory (change from 13 to 14), performance did not differ from volume (0.737 vs. 0.736; 95% CI for the difference −0.04 to 0.04; n = 1,721). A within-event rank at the baseline meet, which removes Tyrving’s unequal demands across event groups (mean baseline-meet points 798 in sprints, 501 in throws), did no better than Tyrving (0.689).</w:t>
       </w:r>
     </w:p>
     <w:p>
@@ -1655,7 +1655,7 @@
         <w:pStyle w:val="FirstParagraph"/>
       </w:pPr>
       <w:r>
-        <w:t xml:space="preserve">Conditioning on athletes still in their career at age 16 (final active season at 16 or later; n = 1,148), volume across ages 15–16 was the largest contributor to subsequent cessation risk (HR = 0.71 per SD, 95% CI [0.65, 0.78], C-index = 0.696; complete-case n = 1,147; Supplementary Table S8). The baseline-only Cox model (volume HR = 0.65 per SD, 95% CI [0.62, 0.69], Supplementary Table S10; with structural controls, Supplementary Table S16), the period-specific decomposition (Table 5), and the remaining descriptive analyses (Supplementary Tables S1, S6, S11, S17; Supplementary Figure S4) are companions; post-baseline Cox estimates are not primary (predictor and at-risk window overlap), and their contamination-free analogue is the change model in Section 3.5.</w:t>
+        <w:t xml:space="preserve">Conditioning on athletes still in their career at age 16 (final active season at 16 or later; n = 1,148), volume across ages 15–16 was the largest contributor to subsequent cessation risk (HR = 0.71 per SD, 95% CI [0.65, 0.78], C-index = 0.696; complete-case n = 1,147; Supplementary Table S8). The baseline-only Cox model (volume HR = 0.65 per SD, 95% CI [0.62, 0.69], Supplementary Table S10; with structural controls, Supplementary Table S16), the period-specific decomposition (Table 5), and the remaining descriptive analyses (Supplementary Tables S1, S6, S11, S17; Supplementary Figure S4) are companions; post-baseline Cox estimates are not primary (predictor and at-risk window overlap), and their analogue among athletes still active at 16 is the change model in Section 3.5.</w:t>
       </w:r>
     </w:p>
     <w:p>
@@ -1762,7 +1762,7 @@
         <w:t xml:space="preserve"> </w:t>
       </w:r>
       <w:r>
-        <w:t xml:space="preserve">= .11), without gain in discrimination (ΔAUC = −0.002 without volume and 0.004 [−0.003, 0.010] with it), and not once performance in the athlete’s main event category was controlled (1.07 [0.94, 1.23]; Supplementary Table S18). Because HHI is bounded below by 1/(result count), we stress-tested for count-dependence; the association was unchanged under restriction to ≥5 and ≥8 results at ages 13–14 (OR = 1.17, 1.17) and a finite-sample-corrected index (OR = 1.20, 95% CI [1.05, 1.35]; Supplementary Table S20). The index captures concentration</w:t>
+        <w:t xml:space="preserve">= .11), without gain in discrimination (ΔAUC = −0.002 without volume and 0.004 [−0.003, 0.010] with it), and not once performance in the athlete’s main event category was controlled (1.07 [0.94, 1.23]; Supplementary Table S18); Cox models with volume agree (HR = 0.91 per SD; Supplementary Tables S10, S16). Because HHI is bounded below by 1/(result count), we stress-tested for count-dependence; the association was unchanged under restriction to ≥5 and ≥8 results at ages 13–14 (OR = 1.17, 1.17) and a finite-sample-corrected index (OR = 1.20, 95% CI [1.05, 1.35]; Supplementary Table S20). The index captures concentration</w:t>
       </w:r>
       <w:r>
         <w:t xml:space="preserve"> </w:t>
@@ -1873,7 +1873,7 @@
         <w:pStyle w:val="FirstParagraph"/>
       </w:pPr>
       <w:r>
-        <w:t xml:space="preserve">Four findings emerge from this 14-year follow-up of 2,138 young athletes. First, competition volume at ages 13–14 was strongly and prospectively associated with retaining senior competition, more strongly than performance measured in the same window, which nonetheless added complementary information. Second, the association was reproduced in both birth cohorts and withstood structural controls, club random effects, club-clustered and club-grouped validation, and multiple imputation. Third, the dropout signal decomposed into two components: early behavioral heterogeneity visible at 13–14, and a within-athlete decline in competition participation before exit. Dropouts typically tapered (median 12 → 10 → 9 → 4 meets across their last four seasons), falling below their own earlier level before exit, and decline predicted exit even among athletes all still active at 16. Fourth, event-category concentration within track and field was not robustly associated with retention once performance in the athlete’s main event was taken into account.</w:t>
+        <w:t xml:space="preserve">Four findings emerge from this 14-year follow-up of 2,138 young athletes. First, competition volume at ages 13–14 was strongly and prospectively associated with retaining senior competition, more strongly than performance at the baseline meet, which nonetheless added complementary information. Second, the association was reproduced in both birth cohorts and withstood structural controls, club random effects, club-clustered and club-grouped validation, and multiple imputation. Third, the dropout signal decomposed into two components: early behavioral heterogeneity visible at 13–14, and a within-athlete decline in competition participation before exit. Dropouts typically tapered (median 12 → 10 → 9 → 4 meets across their last four seasons), falling below their own earlier level before exit, and decline predicted exit even among athletes all still active at 16. Fourth, event-category concentration within track and field was not robustly associated with retention once performance in the athlete’s main event was taken into account.</w:t>
       </w:r>
     </w:p>
     <w:bookmarkEnd w:id="45"/>
@@ -1891,7 +1891,7 @@
         <w:pStyle w:val="FirstParagraph"/>
       </w:pPr>
       <w:r>
-        <w:t xml:space="preserve">Competition volume discriminated senior retention somewhat better than performance (Tyrving score) measured in the same window (AUC difference 0.040, 95% CI 0.006–0.074), but the two were complementary, and with its within-baseline trajectory performance did not differ from volume (Section 3.6). Hypothesis 2 is thus partially supported: behavior discriminates at least as well as performance, not instead of it. Performance reflects capability; volume reflects the athlete’s own choices about taking part, and those choices carry at least as much information about later retention as capability does, and partly different information. Two caveats: volume is a near-noiseless count while Tyrving is a scored maximum whose norms are not equally demanding across event groups, so part of the gap could be measurement precision (a within-event rank did not close it, and the within-stratum effects argue not all of it); and predictor and outcome both index registered activity, so volume’s advantage describes when disengagement becomes observable, not a causal mechanism.</w:t>
+        <w:t xml:space="preserve">Competition volume discriminated senior retention somewhat better than performance (Tyrving score) at the baseline meet (AUC difference 0.040, 95% CI 0.006–0.074), but the two were complementary, and with its within-baseline trajectory performance did not differ from volume (Section 3.6). Hypothesis 2 is thus partially supported: behavior discriminates at least as well as performance, not instead of it. Performance reflects capability; volume reflects the athlete’s own choices about taking part, and those choices carry at least as much information about later retention as capability does, and partly different information. Two caveats: volume is a near-noiseless count over two seasons while Tyrving is a scored maximum from a single meet, with norms that are not equally demanding across event groups, so part of the gap could be measurement precision (a within-event rank did not close it, and the within-stratum effects argue not all of it); and predictor and outcome both index registered activity, so volume’s advantage describes when disengagement becomes observable, not a causal mechanism.</w:t>
       </w:r>
     </w:p>
     <w:p>
@@ -1951,7 +1951,7 @@
         <w:pStyle w:val="FirstParagraph"/>
       </w:pPr>
       <w:r>
-        <w:t xml:space="preserve">Is the divergence in Figure 2 a within-athlete decline, or early differentiation only, or an artifact of averaging abrupt exits at heterogeneous ages? The exit-aligned and fixed-effects analyses answer at the individual level: 95% of dropouts were still competing in their penultimate season, only 20% exited directly from peak volume, and volume fell below each athlete’s own earlier level in the two seasons before exit. The typical exit is preceded by declining participation, not a cliff, although the register shows the timing of this decline, not its reasons. Both components are nonetheless present: level and change carried independent information, also in the contamination-free window (Section 3.5), and future dropouts already differed at 13–14, consistent with retrospective evidence that dropouts’ developmental activities differ years before exit.</w:t>
+        <w:t xml:space="preserve">Is the divergence in Figure 2 a within-athlete decline, or early differentiation only, or an artifact of averaging abrupt exits at heterogeneous ages? The exit-aligned and fixed-effects analyses answer at the individual level: 95% of dropouts were still competing in their penultimate season, only 20% exited directly from peak volume, and volume fell below each athlete’s own earlier level in the two seasons before exit. The typical exit is preceded by declining participation, not a cliff, although the register shows the timing of this decline, not its reasons. Both components are nonetheless present: early level and later change both predicted retention, also among athletes still active at 16 (Section 3.5), and future dropouts already differed at 13–14, consistent with retrospective evidence that dropouts’ developmental activities differ years before exit.</w:t>
       </w:r>
       <w:r>
         <w:rPr>
@@ -2354,13 +2354,13 @@
           <w:b/>
           <w:bCs/>
         </w:rPr>
-        <w:t xml:space="preserve">(2) Flag again after age 15 using within-athlete change.</w:t>
-      </w:r>
-      <w:r>
-        <w:t xml:space="preserve"> </w:t>
-      </w:r>
-      <w:r>
-        <w:t xml:space="preserve">Level and change carry independent information (Section 3.5): screen on level at end of age 14 and on change at end of age 15, the latter just after the first selective gate and ahead of the junior years, when the annual exit rate peaks.</w:t>
+        <w:t xml:space="preserve">(2) Flag again after age 15.</w:t>
+      </w:r>
+      <w:r>
+        <w:t xml:space="preserve"> </w:t>
+      </w:r>
+      <w:r>
+        <w:t xml:space="preserve">A decline shows as lower later volume (Section 3.5): screen at the end of age 14 and again at the end of age 15, the latter just after the first selective gate and ahead of the junior years, when the annual exit rate peaks.</w:t>
       </w:r>
     </w:p>
     <w:p>
@@ -2534,7 +2534,7 @@
         <w:pStyle w:val="FirstParagraph"/>
       </w:pPr>
       <w:r>
-        <w:t xml:space="preserve">Senior retention in Norwegian youth track and field is prospectively associated with baseline-window competition behavior: athletes who already compete more at ages 13–14 retain at substantially higher rates, and those who decline retain at substantially lower rates. The decline is visible within athletes in the seasons before exit, and is no averaging artifact. The effect withstands structural, club-level, missing-data, and outcome-definition checks and is reproduced in both birth cohorts; early heterogeneity and within-athlete decline contribute independently, and baseline performance adds complementary information. The findings are consistent with, though do not by themselves confirm, accounts of withdrawal as a gradual deliberative process, and they yield a register-implementable targeting rule whose intervention value is now a testable question.</w:t>
+        <w:t xml:space="preserve">Senior retention in Norwegian youth track and field is prospectively associated with baseline-window competition behavior: athletes who already compete more at ages 13–14 retain at substantially higher rates, and those who decline retain at substantially lower rates. The decline is visible within athletes in the seasons before exit, and is no averaging artifact. The effect withstands structural, club-level, missing-data, and outcome-definition checks and is reproduced in both birth cohorts; early heterogeneity and within-athlete decline both carry information, and baseline performance adds complementary information. The findings are consistent with, though do not by themselves confirm, accounts of withdrawal as a gradual deliberative process, and they yield a register-implementable targeting rule whose intervention value is now a testable question.</w:t>
       </w:r>
     </w:p>
     <w:p>
@@ -6035,7 +6035,7 @@
         <w:t xml:space="preserve"> </w:t>
       </w:r>
       <w:r>
-        <w:t xml:space="preserve">Change = volume at 15 minus volume at 14 (positive = increase; mean −2.2, SD 6.4 meets). The OR of 2.29 per SD increase is equivalent to OR = 0.44 [0.38, 0.50] per SD of greater decline (about 6.4 fewer meets), conditional on the level at age 14; per 5 fewer meets, OR = 0.52. Because the model is linear in the logit, it is identical to one with volume at 14 and volume at 15 as separate levels (the per-meet OR for change equals the per-meet OR for volume at 15). Pseudo-R² (McFadden) rose from 0.150 (M1) to 0.245 (M2); CV-AUC 0.763 → 0.833. 1 of the 1,926 athletes with a result at 14 lacks registered sex or a Tyrving score (sample n = 1,925). Both baseline level and within-athlete decline contribute substantially and independently.</w:t>
+        <w:t xml:space="preserve">Change = volume at 15 minus volume at 14 (positive = increase; mean −2.2, SD 6.4 meets). The OR of 2.29 per SD increase is equivalent to OR = 0.44 [0.38, 0.50] per SD of greater decline (about 6.4 fewer meets), conditional on the level at age 14; per 5 fewer meets, OR = 0.52. Because the model is linear in the logit, it is identical to one with volume at 14 and volume at 15 as separate levels (the per-meet OR for change equals the per-meet OR for volume at 15). Pseudo-R² (McFadden) rose from 0.150 (M1) to 0.245 (M2); CV-AUC 0.763 → 0.833. 1 of the 1,926 athletes with a result at 14 lacks registered sex or a Tyrving score (sample n = 1,925). In the level form, volume at 14 added nothing once volume at 15 was known (OR = 0.98 per meet [0.95, 1.00]): the change term carries the information in the later season’s volume.</w:t>
       </w:r>
     </w:p>
     <w:p>

</xml_diff>

<commit_message>
IJSSC R1: fixes from the final narrow review; freeze renewed
- Championship types: Finnmark FM and Norwegian DM counted as district;
  NM relay meets (100 m side events) excluded; national combined events are
  youth classes for under-17s; age-restricted district championships count
  only for those ages; meets abroad excluded (361 athletes changed in all;
  the R implementation agrees for all 2,138). S-M12 states the rule.
- Table S22: club fixed effects (conditional logit) OR 2.28 [1.93, 2.69],
  supporting the within-club statement in the note and the letter.
- Letter no longer says "only in Cohort B"; "added little (p = .06)";
  baseline-only Cox models in 3.9; 4.5 sex sentence; S19/S6 notes;
  "baseline window" labels; Comment 10 CI statement.
- Main text 6,352 words, stated in both letters; RUN_ALL green.

Co-Authored-By: Claude Opus 5.5 <noreply@anthropic.com>
</commit_message>
<xml_diff>
--- a/forskning/ncc-kohort/revision_r1/submission_r1/MANUSCRIPT_R1_clean.docx
+++ b/forskning/ncc-kohort/revision_r1/submission_r1/MANUSCRIPT_R1_clean.docx
@@ -1524,15 +1524,7 @@
         <w:t xml:space="preserve">R</w:t>
       </w:r>
       <w:r>
-        <w:t xml:space="preserve">² from 0.150 to 0.245 (Table 4; Supplementary Table S14). Equivalently, volume at 14 added nothing once volume at 15 was known (OR = 0.98 per meet, 95% CI 0.95–1.00; Table 4 note).</w:t>
-      </w:r>
-    </w:p>
-    <w:p>
-      <w:pPr>
-        <w:pStyle w:val="BodyText"/>
-      </w:pPr>
-      <w:r>
-        <w:t xml:space="preserve">Second, because a change score spanning the exit could conflate decline with the exit itself, we repeated the test among athletes still competing at age 16 (≥2 results; n = 1,088, of whom 269 had their final active season at 16), volume at 15 (OR = 3.04, 95% CI [2.56, 3.62]) and change from 15 to 16 (OR = 1.87 per SD increase, 95% CI [1.60, 2.19]; 0.54 per SD of decline; both</w:t>
+        <w:t xml:space="preserve">² from 0.150 to 0.245 (Table 4; Supplementary Table S14). Equivalently, volume at 14 added little once volume at 15 was known (OR = 0.98 per meet, 95% CI 0.95–1.00,</w:t>
       </w:r>
       <w:r>
         <w:t xml:space="preserve"> </w:t>
@@ -1548,7 +1540,7 @@
         <w:t xml:space="preserve"> </w:t>
       </w:r>
       <w:r>
-        <w:t xml:space="preserve">&lt; .001) predicted senior status four or more years later: decline predicts exit among athletes who are all, at measurement, still active.</w:t>
+        <w:t xml:space="preserve">= .06; Table 4 note).</w:t>
       </w:r>
     </w:p>
     <w:p>
@@ -1556,7 +1548,7 @@
         <w:pStyle w:val="BodyText"/>
       </w:pPr>
       <w:r>
-        <w:t xml:space="preserve">Third, exit-aligned trajectories. Aligned to each dropout’s own final active season (n = 1,146 with final seasons at ages 15–19), median volumes at T−3, T−2, T−1, and T were 12, 10, 9, and 4 meets; 95% were still competing in their penultimate season, and among final seasons at 16+ (n = 800), 74% had a</w:t>
+        <w:t xml:space="preserve">Second, because a change score spanning the exit could conflate decline with the exit itself, we repeated the test among athletes still competing at age 16 (≥2 results; n = 1,088, of whom 269 had their final active season at 16), volume at 15 (OR = 3.04, 95% CI [2.56, 3.62]) and change from 15 to 16 (OR = 1.87 per SD increase, 95% CI [1.60, 2.19]; 0.54 per SD of decline; both</w:t>
       </w:r>
       <w:r>
         <w:t xml:space="preserve"> </w:t>
@@ -1566,13 +1558,13 @@
           <w:i/>
           <w:iCs/>
         </w:rPr>
-        <w:t xml:space="preserve">reduced-but-nonzero</w:t>
-      </w:r>
-      <w:r>
-        <w:t xml:space="preserve"> </w:t>
-      </w:r>
-      <w:r>
-        <w:t xml:space="preserve">penultimate season relative to their earlier peak, 6.5% a gap year, and 20% exited from peak volume (Supplementary Table S19).</w:t>
+        <w:t xml:space="preserve">p</w:t>
+      </w:r>
+      <w:r>
+        <w:t xml:space="preserve"> </w:t>
+      </w:r>
+      <w:r>
+        <w:t xml:space="preserve">&lt; .001) predicted senior status four or more years later: decline predicts exit among athletes who are all, at measurement, still active.</w:t>
       </w:r>
     </w:p>
     <w:p>
@@ -1580,13 +1572,37 @@
         <w:pStyle w:val="BodyText"/>
       </w:pPr>
       <w:r>
-        <w:t xml:space="preserve">Fourth, the athlete fixed-effects model (1,909 athletes; Supplementary Table S28, Supplementary Figure S5) placed volume, measured as 1 + meets, 7% (95% CI 0–13%), 12% (5–19%), and 23% (16–31%) below each athlete’s own earlier level three, two, and one season(s) before the final active season, net of the common age profile; the decline steepened towards exit (</w:t>
+        <w:t xml:space="preserve">Third, exit-aligned trajectories. Aligned to each dropout’s own final active season (n = 1,146 with final seasons at ages 15–19), median volumes at T−3, T−2, T−1, and T were 12, 10, 9, and 4 meets; 95% were still competing in their penultimate season, and among final seasons at 16+ (n = 800), 74% had a</w:t>
+      </w:r>
+      <w:r>
+        <w:t xml:space="preserve"> </w:t>
       </w:r>
       <w:r>
         <w:rPr>
           <w:i/>
           <w:iCs/>
         </w:rPr>
+        <w:t xml:space="preserve">reduced-but-nonzero</w:t>
+      </w:r>
+      <w:r>
+        <w:t xml:space="preserve"> </w:t>
+      </w:r>
+      <w:r>
+        <w:t xml:space="preserve">penultimate season relative to their earlier peak, 6.5% a gap year, and 20% exited from peak volume (Supplementary Table S19).</w:t>
+      </w:r>
+    </w:p>
+    <w:p>
+      <w:pPr>
+        <w:pStyle w:val="BodyText"/>
+      </w:pPr>
+      <w:r>
+        <w:t xml:space="preserve">Fourth, the athlete fixed-effects model (1,909 athletes; Supplementary Table S28, Supplementary Figure S5) placed volume, measured as 1 + meets, 7% (95% CI 0–13%), 12% (5–19%), and 23% (16–31%) below each athlete’s own earlier level three, two, and one season(s) before the final active season, net of the common age profile; the decline steepened towards exit (</w:t>
+      </w:r>
+      <w:r>
+        <w:rPr>
+          <w:i/>
+          <w:iCs/>
+        </w:rPr>
         <w:t xml:space="preserve">p</w:t>
       </w:r>
       <w:r>
@@ -1615,13 +1631,13 @@
       </w:r>
     </w:p>
     <w:bookmarkEnd w:id="38"/>
-    <w:bookmarkStart w:id="39" w:name="time-aligned-behavior-vs.-performance"/>
+    <w:bookmarkStart w:id="39" w:name="baseline-window-behavior-vs.-performance"/>
     <w:p>
       <w:pPr>
         <w:pStyle w:val="Heading2"/>
       </w:pPr>
       <w:r>
-        <w:t xml:space="preserve">3.6 Time-aligned behavior vs. performance</w:t>
+        <w:t xml:space="preserve">3.6 Baseline-window behavior vs. performance</w:t>
       </w:r>
     </w:p>
     <w:p>
@@ -1655,7 +1671,7 @@
         <w:pStyle w:val="FirstParagraph"/>
       </w:pPr>
       <w:r>
-        <w:t xml:space="preserve">Conditioning on athletes still in their career at age 16 (final active season at 16 or later; n = 1,148), volume across ages 15–16 was the largest contributor to subsequent cessation risk (HR = 0.71 per SD, 95% CI [0.65, 0.78], C-index = 0.696; complete-case n = 1,147; Supplementary Table S8). The baseline-only Cox model (volume HR = 0.65 per SD, 95% CI [0.62, 0.69], Supplementary Table S10; with structural controls, Supplementary Table S16), the period-specific decomposition (Table 5), and the remaining descriptive analyses (Supplementary Tables S1, S6, S11, S17; Supplementary Figure S4) are companions; post-baseline Cox estimates are not primary (predictor and at-risk window overlap), and their analogue among athletes still active at 16 is the change model in Section 3.5.</w:t>
+        <w:t xml:space="preserve">Conditioning on athletes still in their career at age 16 (final active season at 16 or later; n = 1,148), volume across ages 15–16 was the largest contributor to subsequent cessation risk (HR = 0.71 per SD, 95% CI [0.65, 0.77], C-index = 0.696; complete-case n = 1,147; Supplementary Table S8). The baseline-only Cox model (volume HR = 0.65 per SD, 95% CI [0.62, 0.69], Supplementary Table S10; with structural controls, Supplementary Table S16), the period-specific decomposition (Table 5), and the remaining descriptive analyses (Supplementary Tables S1, S6, S11, S17; Supplementary Figure S4) are companions; post-baseline Cox estimates are not primary (predictor and at-risk window overlap), and their analogue among athletes still active at 16 is the change model in Section 3.5.</w:t>
       </w:r>
     </w:p>
     <w:p>
@@ -1746,7 +1762,7 @@
         <w:pStyle w:val="FirstParagraph"/>
       </w:pPr>
       <w:r>
-        <w:t xml:space="preserve">Higher baseline HHI (more event-category concentration at ages 13–14) was associated with higher senior retention only once volume was in the model (OR = 1.18 per SD, 95% CI [1.04, 1.34]; without volume, 1.00), more clearly in Cohort B (1.32 [1.10, 1.60]) than in Cohort A (1.07 [0.90, 1.28]; cohort difference</w:t>
+        <w:t xml:space="preserve">Higher baseline HHI (more event-category concentration at ages 13–14) was associated with higher senior retention only once volume was in the model (OR = 1.18 per SD, 95% CI [1.04, 1.34]; without volume, 1.00; the baseline-only Cox models, which include volume, agree: HR = 0.91 per SD, Supplementary Tables S10, S16), more clearly in Cohort B (1.32 [1.10, 1.60]) than in Cohort A (1.07 [0.90, 1.28]; cohort difference</w:t>
       </w:r>
       <w:r>
         <w:t xml:space="preserve"> </w:t>
@@ -1762,7 +1778,7 @@
         <w:t xml:space="preserve"> </w:t>
       </w:r>
       <w:r>
-        <w:t xml:space="preserve">= .11), without gain in discrimination (ΔAUC = −0.002 without volume and 0.004 [−0.003, 0.010] with it), and not once performance in the athlete’s main event category was controlled (1.07 [0.94, 1.23]; Supplementary Table S18); Cox models with volume agree (HR = 0.91 per SD; Supplementary Tables S10, S16). Because HHI is bounded below by 1/(result count), we stress-tested for count-dependence; the association was unchanged under restriction to ≥5 and ≥8 results at ages 13–14 (OR = 1.17, 1.17) and a finite-sample-corrected index (OR = 1.20, 95% CI [1.05, 1.35]; Supplementary Table S20). The index captures concentration</w:t>
+        <w:t xml:space="preserve">= .11), without gain in discrimination (ΔAUC = −0.002 without volume and 0.004 [−0.003, 0.010] with it), and not once performance in the athlete’s main event category was controlled (1.07 [0.94, 1.23]; Supplementary Table S18). Because HHI is bounded below by 1/(result count), we stress-tested for count-dependence; the association was unchanged under restriction to ≥5 and ≥8 results at ages 13–14 (OR = 1.17, 1.17) and a finite-sample-corrected index (OR = 1.20, 95% CI [1.05, 1.35]; Supplementary Table S20). The index captures concentration</w:t>
       </w:r>
       <w:r>
         <w:t xml:space="preserve"> </w:t>
@@ -1873,7 +1889,7 @@
         <w:pStyle w:val="FirstParagraph"/>
       </w:pPr>
       <w:r>
-        <w:t xml:space="preserve">Four findings emerge from this 14-year follow-up of 2,138 young athletes. First, competition volume at ages 13–14 was strongly and prospectively associated with retaining senior competition, more strongly than performance at the baseline meet, which nonetheless added complementary information. Second, the association was reproduced in both birth cohorts and withstood structural controls, club random effects, club-clustered and club-grouped validation, and multiple imputation. Third, the dropout signal decomposed into two components: early behavioral heterogeneity visible at 13–14, and a within-athlete decline in competition participation before exit. Dropouts typically tapered (median 12 → 10 → 9 → 4 meets across their last four seasons), falling below their own earlier level before exit, and decline predicted exit even among athletes all still active at 16. Fourth, event-category concentration within track and field was not robustly associated with retention once performance in the athlete’s main event was taken into account.</w:t>
+        <w:t xml:space="preserve">Four findings emerge from this 14-year follow-up of 2,138 young athletes. First, competition volume at ages 13–14 was strongly and prospectively associated with retaining senior competition, more strongly than performance at the baseline meet, which nonetheless added complementary information. Second, the association was reproduced in both birth cohorts and withstood structural controls, club random effects, club-clustered and club-grouped validation, and multiple imputation. Third, the dropout signal had two components: early behavioral heterogeneity visible at 13–14, and a within-athlete decline in competition participation before exit. Dropouts’ participation typically declined (median 12 → 10 → 9 → 4 meets across their last four seasons), falling below their own earlier level before exit, and decline predicted exit even among athletes all still active at 16. Fourth, event-category concentration within track and field was not robustly associated with retention once performance in the athlete’s main event was taken into account.</w:t>
       </w:r>
     </w:p>
     <w:bookmarkEnd w:id="45"/>
@@ -2109,7 +2125,7 @@
         <w:pStyle w:val="FirstParagraph"/>
       </w:pPr>
       <w:r>
-        <w:t xml:space="preserve">Unadjusted, Kaplan–Meier curves showed no clear sex difference (log-rank</w:t>
+        <w:t xml:space="preserve">Kaplan–Meier curves of time to the last active season showed no clear sex difference (log-rank</w:t>
       </w:r>
       <w:r>
         <w:t xml:space="preserve"> </w:t>
@@ -2125,7 +2141,7 @@
         <w:t xml:space="preserve"> </w:t>
       </w:r>
       <w:r>
-        <w:t xml:space="preserve">= .42); adjusted, females retained at significantly lower odds in every layer of the primary model (OR = 0.75 sex-only, 0.56 full model; Table 3) and in both cohorts:</w:t>
+        <w:t xml:space="preserve">= .42), but females retained senior status at significantly lower odds in every layer of the primary model (OR = 0.75 sex-only, 0.56 full model; Table 3) and in both cohorts:</w:t>
       </w:r>
       <w:r>
         <w:t xml:space="preserve"> </w:t>
@@ -2138,7 +2154,7 @@
         <w:t xml:space="preserve">conditional on the same early volume, concentration, and performance</w:t>
       </w:r>
       <w:r>
-        <w:t xml:space="preserve">, girls were less likely to remain, their higher early volumes partially masking the gap. The volume association itself was similar across sexes (milestone-window volume HR = 0.49 for males and 0.48 for females; Supplementary Table S7), so the residual sex difference lies in the level of retention, not in how volume relates to it. This complements survey reports of higher female dropout</w:t>
+        <w:t xml:space="preserve">, girls were less likely to remain, their higher early volumes partially masking the gap. The volume association itself was similar across sexes (milestone-window volume HR = 0.48 for both males and females; Supplementary Table S7), so the residual sex difference lies in the level of retention, not in how volume relates to it. This complements survey reports of higher female dropout</w:t>
       </w:r>
       <w:r>
         <w:rPr>
@@ -2498,7 +2514,7 @@
         <w:t xml:space="preserve"> </w:t>
       </w:r>
       <w:r>
-        <w:t xml:space="preserve">volume declines. Third, the target population is the engaged core, athletes entered for the regional 13–14 meet, not all young athletes; among casual participants outside the cohort, volume was also associated with retention (OR = 2.17 per 10 meets; Supplementary Table S31), but the thresholds and absolute rates apply to the engaged core. The three venues cover eastern, western, and mid Norway, with northern districts served by the mid-Norway venue. Fourth, predictor and outcome share a measurement scale; despite the baseline-only model, the change models, the exit-aligned and fixed-effects analyses, and the landmark analysis, structural overlap remains a conceptual limitation of register-only designs. Fifth, the post-baseline Cox specification violated proportional hazards (Schoenfeld χ² = 264.3); its estimates are descriptive only. Sixth, Tyrving norms are not equally demanding across event groups (throws and race walking score lower), and the HHI treats event categories symmetrically although they co-occur unevenly (98% of hurdlers also sprinted), so identical values can represent different combination patterns. Seventh, athletes born in 2002 have four senior seasons of observation (2022–2025), though the fixed-window outcome gives near-identical results. Eighth, the thresholds are candidates, checked across two cohorts of one register but not externally validated, and calibrated to a complete-register, open-entry, club-pays system; they do not transfer to coach-gated or pay-to-play systems without re-derivation, and no intervention effect has been demonstrated: §4.8 is targeting logic, not evaluated policy.</w:t>
+        <w:t xml:space="preserve">volume declines. Third, the target population is the engaged core, athletes entered for the regional 13–14 meet, not all young athletes; among casual participants outside the cohort, volume was also associated with retention (OR = 2.17 per 10 meets; Supplementary Table S31), but the thresholds and absolute rates apply to the engaged core. The three venues cover eastern, western, and mid Norway, with northern districts served by the mid-Norway venue. Fourth, predictor and outcome share a measurement scale; despite the baseline-only model, the change models, the exit-aligned and fixed-effects analyses, and the landmark analysis, structural overlap remains a conceptual limitation of register-only designs. Fifth, the post-baseline Cox specification violated proportional hazards (Schoenfeld χ² = 262.8); its estimates are descriptive only. Sixth, Tyrving norms are not equally demanding across event groups (throws and race walking score lower), and the HHI treats event categories symmetrically although they co-occur unevenly (98% of hurdlers also sprinted), so identical values can represent different combination patterns. Seventh, athletes born in 2002 have four senior seasons of observation (2022–2025), though the fixed-window outcome gives near-identical results. Eighth, the thresholds are candidates, checked across two cohorts of one register but not externally validated, and calibrated to a complete-register, open-entry, club-pays system; they do not transfer to coach-gated or pay-to-play systems without re-derivation, and no intervention effect has been demonstrated: §4.8 is targeting logic, not evaluated policy.</w:t>
       </w:r>
     </w:p>
     <w:bookmarkEnd w:id="53"/>
@@ -6035,7 +6051,7 @@
         <w:t xml:space="preserve"> </w:t>
       </w:r>
       <w:r>
-        <w:t xml:space="preserve">Change = volume at 15 minus volume at 14 (positive = increase; mean −2.2, SD 6.4 meets). The OR of 2.29 per SD increase is equivalent to OR = 0.44 [0.38, 0.50] per SD of greater decline (about 6.4 fewer meets), conditional on the level at age 14; per 5 fewer meets, OR = 0.52. Because the model is linear in the logit, it is identical to one with volume at 14 and volume at 15 as separate levels (the per-meet OR for change equals the per-meet OR for volume at 15). Pseudo-R² (McFadden) rose from 0.150 (M1) to 0.245 (M2); CV-AUC 0.763 → 0.833. 1 of the 1,926 athletes with a result at 14 lacks registered sex or a Tyrving score (sample n = 1,925). In the level form, volume at 14 added nothing once volume at 15 was known (OR = 0.98 per meet [0.95, 1.00]): the change term carries the information in the later season’s volume.</w:t>
+        <w:t xml:space="preserve">Change = volume at 15 minus volume at 14 (positive = increase; mean −2.2, SD 6.4 meets). The OR of 2.29 per SD increase is equivalent to OR = 0.44 [0.38, 0.50] per SD of greater decline (about 6.4 fewer meets), conditional on the level at age 14; per 5 fewer meets, OR = 0.52. Because the model is linear in the logit, it is identical to one with volume at 14 and volume at 15 as separate levels (the per-meet OR for change equals the per-meet OR for volume at 15). Pseudo-R² (McFadden) rose from 0.150 (M1) to 0.245 (M2); CV-AUC 0.763 → 0.833. 1 of the 1,926 athletes with a result at 14 lacks registered sex or a Tyrving score (sample n = 1,925). In the level form, volume at 14 added little once volume at 15 was known (OR = 0.98 per meet [0.95, 1.00], p = .056): the information lies mainly in the later season’s volume.</w:t>
       </w:r>
     </w:p>
     <w:p>
@@ -6147,18 +6163,18 @@
               <w:pStyle w:val="Compact"/>
             </w:pPr>
             <w:r>
-              <w:t xml:space="preserve">0.74 [0.66, 0.84]</w:t>
-            </w:r>
-          </w:p>
-        </w:tc>
-        <w:tc>
-          <w:tcPr/>
-          <w:p>
-            <w:pPr>
-              <w:pStyle w:val="Compact"/>
-            </w:pPr>
-            <w:r>
-              <w:t xml:space="preserve">1.01 [0.84, 1.21]</w:t>
+              <w:t xml:space="preserve">0.73 [0.65, 0.83]</w:t>
+            </w:r>
+          </w:p>
+        </w:tc>
+        <w:tc>
+          <w:tcPr/>
+          <w:p>
+            <w:pPr>
+              <w:pStyle w:val="Compact"/>
+            </w:pPr>
+            <w:r>
+              <w:t xml:space="preserve">0.99 [0.82, 1.19]</w:t>
             </w:r>
           </w:p>
         </w:tc>
@@ -6182,29 +6198,29 @@
               <w:pStyle w:val="Compact"/>
             </w:pPr>
             <w:r>
-              <w:t xml:space="preserve">0.78 [0.71, 0.86]</w:t>
-            </w:r>
-          </w:p>
-        </w:tc>
-        <w:tc>
-          <w:tcPr/>
-          <w:p>
-            <w:pPr>
-              <w:pStyle w:val="Compact"/>
-            </w:pPr>
-            <w:r>
-              <w:t xml:space="preserve">0.84 [0.74, 0.96]</w:t>
-            </w:r>
-          </w:p>
-        </w:tc>
-        <w:tc>
-          <w:tcPr/>
-          <w:p>
-            <w:pPr>
-              <w:pStyle w:val="Compact"/>
-            </w:pPr>
-            <w:r>
-              <w:t xml:space="preserve">0.68 [0.54, 0.85]</w:t>
+              <w:t xml:space="preserve">0.77 [0.70, 0.84]</w:t>
+            </w:r>
+          </w:p>
+        </w:tc>
+        <w:tc>
+          <w:tcPr/>
+          <w:p>
+            <w:pPr>
+              <w:pStyle w:val="Compact"/>
+            </w:pPr>
+            <w:r>
+              <w:t xml:space="preserve">0.86 [0.75, 0.98]</w:t>
+            </w:r>
+          </w:p>
+        </w:tc>
+        <w:tc>
+          <w:tcPr/>
+          <w:p>
+            <w:pPr>
+              <w:pStyle w:val="Compact"/>
+            </w:pPr>
+            <w:r>
+              <w:t xml:space="preserve">0.70 [0.56, 0.88]</w:t>
             </w:r>
           </w:p>
         </w:tc>
@@ -6228,29 +6244,29 @@
               <w:pStyle w:val="Compact"/>
             </w:pPr>
             <w:r>
-              <w:t xml:space="preserve">0.93 [0.88, 0.98]</w:t>
-            </w:r>
-          </w:p>
-        </w:tc>
-        <w:tc>
-          <w:tcPr/>
-          <w:p>
-            <w:pPr>
-              <w:pStyle w:val="Compact"/>
-            </w:pPr>
-            <w:r>
-              <w:t xml:space="preserve">0.87 [0.78, 0.96]</w:t>
-            </w:r>
-          </w:p>
-        </w:tc>
-        <w:tc>
-          <w:tcPr/>
-          <w:p>
-            <w:pPr>
-              <w:pStyle w:val="Compact"/>
-            </w:pPr>
-            <w:r>
-              <w:t xml:space="preserve">1.09 [0.89, 1.34]</w:t>
+              <w:t xml:space="preserve">0.93 [0.89, 0.98]</w:t>
+            </w:r>
+          </w:p>
+        </w:tc>
+        <w:tc>
+          <w:tcPr/>
+          <w:p>
+            <w:pPr>
+              <w:pStyle w:val="Compact"/>
+            </w:pPr>
+            <w:r>
+              <w:t xml:space="preserve">0.86 [0.77, 0.96]</w:t>
+            </w:r>
+          </w:p>
+        </w:tc>
+        <w:tc>
+          <w:tcPr/>
+          <w:p>
+            <w:pPr>
+              <w:pStyle w:val="Compact"/>
+            </w:pPr>
+            <w:r>
+              <w:t xml:space="preserve">1.08 [0.88, 1.32]</w:t>
             </w:r>
           </w:p>
         </w:tc>
@@ -6274,29 +6290,29 @@
               <w:pStyle w:val="Compact"/>
             </w:pPr>
             <w:r>
-              <w:t xml:space="preserve">1.03 [0.97, 1.08]</w:t>
-            </w:r>
-          </w:p>
-        </w:tc>
-        <w:tc>
-          <w:tcPr/>
-          <w:p>
-            <w:pPr>
-              <w:pStyle w:val="Compact"/>
-            </w:pPr>
-            <w:r>
-              <w:t xml:space="preserve">0.90 [0.82, 1.00]</w:t>
-            </w:r>
-          </w:p>
-        </w:tc>
-        <w:tc>
-          <w:tcPr/>
-          <w:p>
-            <w:pPr>
-              <w:pStyle w:val="Compact"/>
-            </w:pPr>
-            <w:r>
-              <w:t xml:space="preserve">0.99 [0.85, 1.14]</w:t>
+              <w:t xml:space="preserve">1.02 [0.97, 1.08]</w:t>
+            </w:r>
+          </w:p>
+        </w:tc>
+        <w:tc>
+          <w:tcPr/>
+          <w:p>
+            <w:pPr>
+              <w:pStyle w:val="Compact"/>
+            </w:pPr>
+            <w:r>
+              <w:t xml:space="preserve">0.90 [0.82, 0.99]</w:t>
+            </w:r>
+          </w:p>
+        </w:tc>
+        <w:tc>
+          <w:tcPr/>
+          <w:p>
+            <w:pPr>
+              <w:pStyle w:val="Compact"/>
+            </w:pPr>
+            <w:r>
+              <w:t xml:space="preserve">0.98 [0.85, 1.14]</w:t>
             </w:r>
           </w:p>
         </w:tc>
@@ -6320,29 +6336,29 @@
               <w:pStyle w:val="Compact"/>
             </w:pPr>
             <w:r>
-              <w:t xml:space="preserve">1.06 [0.95, 1.19]</w:t>
-            </w:r>
-          </w:p>
-        </w:tc>
-        <w:tc>
-          <w:tcPr/>
-          <w:p>
-            <w:pPr>
-              <w:pStyle w:val="Compact"/>
-            </w:pPr>
-            <w:r>
-              <w:t xml:space="preserve">1.49 [1.24, 1.80]</w:t>
-            </w:r>
-          </w:p>
-        </w:tc>
-        <w:tc>
-          <w:tcPr/>
-          <w:p>
-            <w:pPr>
-              <w:pStyle w:val="Compact"/>
-            </w:pPr>
-            <w:r>
-              <w:t xml:space="preserve">1.05 [0.77, 1.43]</w:t>
+              <w:t xml:space="preserve">1.07 [0.96, 1.19]</w:t>
+            </w:r>
+          </w:p>
+        </w:tc>
+        <w:tc>
+          <w:tcPr/>
+          <w:p>
+            <w:pPr>
+              <w:pStyle w:val="Compact"/>
+            </w:pPr>
+            <w:r>
+              <w:t xml:space="preserve">1.49 [1.24, 1.79]</w:t>
+            </w:r>
+          </w:p>
+        </w:tc>
+        <w:tc>
+          <w:tcPr/>
+          <w:p>
+            <w:pPr>
+              <w:pStyle w:val="Compact"/>
+            </w:pPr>
+            <w:r>
+              <w:t xml:space="preserve">1.04 [0.77, 1.42]</w:t>
             </w:r>
           </w:p>
         </w:tc>
@@ -6469,18 +6485,18 @@
               <w:pStyle w:val="Compact"/>
             </w:pPr>
             <w:r>
-              <w:t xml:space="preserve">0.664</w:t>
-            </w:r>
-          </w:p>
-        </w:tc>
-        <w:tc>
-          <w:tcPr/>
-          <w:p>
-            <w:pPr>
-              <w:pStyle w:val="Compact"/>
-            </w:pPr>
-            <w:r>
-              <w:t xml:space="preserve">0.596</w:t>
+              <w:t xml:space="preserve">0.663</w:t>
+            </w:r>
+          </w:p>
+        </w:tc>
+        <w:tc>
+          <w:tcPr/>
+          <w:p>
+            <w:pPr>
+              <w:pStyle w:val="Compact"/>
+            </w:pPr>
+            <w:r>
+              <w:t xml:space="preserve">0.592</w:t>
             </w:r>
           </w:p>
         </w:tc>

</xml_diff>

<commit_message>
IJSSC R1: re-review fix (indoor-games age range); freeze renewed
- "KM Hedmark og Oppland/Indoor games 12-14": the range belongs to the
  indoor games (1 athlete); "/TYR" is Istanbul, not a Norwegian venue.
  The rerun reproduced the re-reviewer's predicted values exactly
  (360 athletes; S8 upper CI 0.78; S1 chi2 263.1 and 8.14).
- S-M7 describes the club fixed-effects model; S22 note ordering; letter
  Comment 3 sentence.
- RUN_ALL green: outputs identical to the frozen outputs, R implementation
  0 mismatches, letter quotes and word count (6,352) checked.

Co-Authored-By: Claude Opus 5.5 <noreply@anthropic.com>
</commit_message>
<xml_diff>
--- a/forskning/ncc-kohort/revision_r1/submission_r1/MANUSCRIPT_R1_clean.docx
+++ b/forskning/ncc-kohort/revision_r1/submission_r1/MANUSCRIPT_R1_clean.docx
@@ -1671,7 +1671,7 @@
         <w:pStyle w:val="FirstParagraph"/>
       </w:pPr>
       <w:r>
-        <w:t xml:space="preserve">Conditioning on athletes still in their career at age 16 (final active season at 16 or later; n = 1,148), volume across ages 15–16 was the largest contributor to subsequent cessation risk (HR = 0.71 per SD, 95% CI [0.65, 0.77], C-index = 0.696; complete-case n = 1,147; Supplementary Table S8). The baseline-only Cox model (volume HR = 0.65 per SD, 95% CI [0.62, 0.69], Supplementary Table S10; with structural controls, Supplementary Table S16), the period-specific decomposition (Table 5), and the remaining descriptive analyses (Supplementary Tables S1, S6, S11, S17; Supplementary Figure S4) are companions; post-baseline Cox estimates are not primary (predictor and at-risk window overlap), and their analogue among athletes still active at 16 is the change model in Section 3.5.</w:t>
+        <w:t xml:space="preserve">Conditioning on athletes still in their career at age 16 (final active season at 16 or later; n = 1,148), volume across ages 15–16 was the largest contributor to subsequent cessation risk (HR = 0.71 per SD, 95% CI [0.65, 0.78], C-index = 0.696; complete-case n = 1,147; Supplementary Table S8). The baseline-only Cox model (volume HR = 0.65 per SD, 95% CI [0.62, 0.69], Supplementary Table S10; with structural controls, Supplementary Table S16), the period-specific decomposition (Table 5), and the remaining descriptive analyses (Supplementary Tables S1, S6, S11, S17; Supplementary Figure S4) are companions; post-baseline Cox estimates are not primary (predictor and at-risk window overlap), and their analogue among athletes still active at 16 is the change model in Section 3.5.</w:t>
       </w:r>
     </w:p>
     <w:p>
@@ -2514,7 +2514,7 @@
         <w:t xml:space="preserve"> </w:t>
       </w:r>
       <w:r>
-        <w:t xml:space="preserve">volume declines. Third, the target population is the engaged core, athletes entered for the regional 13–14 meet, not all young athletes; among casual participants outside the cohort, volume was also associated with retention (OR = 2.17 per 10 meets; Supplementary Table S31), but the thresholds and absolute rates apply to the engaged core. The three venues cover eastern, western, and mid Norway, with northern districts served by the mid-Norway venue. Fourth, predictor and outcome share a measurement scale; despite the baseline-only model, the change models, the exit-aligned and fixed-effects analyses, and the landmark analysis, structural overlap remains a conceptual limitation of register-only designs. Fifth, the post-baseline Cox specification violated proportional hazards (Schoenfeld χ² = 262.8); its estimates are descriptive only. Sixth, Tyrving norms are not equally demanding across event groups (throws and race walking score lower), and the HHI treats event categories symmetrically although they co-occur unevenly (98% of hurdlers also sprinted), so identical values can represent different combination patterns. Seventh, athletes born in 2002 have four senior seasons of observation (2022–2025), though the fixed-window outcome gives near-identical results. Eighth, the thresholds are candidates, checked across two cohorts of one register but not externally validated, and calibrated to a complete-register, open-entry, club-pays system; they do not transfer to coach-gated or pay-to-play systems without re-derivation, and no intervention effect has been demonstrated: §4.8 is targeting logic, not evaluated policy.</w:t>
+        <w:t xml:space="preserve">volume declines. Third, the target population is the engaged core, athletes entered for the regional 13–14 meet, not all young athletes; among casual participants outside the cohort, volume was also associated with retention (OR = 2.17 per 10 meets; Supplementary Table S31), but the thresholds and absolute rates apply to the engaged core. The three venues cover eastern, western, and mid Norway, with northern districts served by the mid-Norway venue. Fourth, predictor and outcome share a measurement scale; despite the baseline-only model, the change models, the exit-aligned and fixed-effects analyses, and the landmark analysis, structural overlap remains a conceptual limitation of register-only designs. Fifth, the post-baseline Cox specification violated proportional hazards (Schoenfeld χ² = 263.1); its estimates are descriptive only. Sixth, Tyrving norms are not equally demanding across event groups (throws and race walking score lower), and the HHI treats event categories symmetrically although they co-occur unevenly (98% of hurdlers also sprinted), so identical values can represent different combination patterns. Seventh, athletes born in 2002 have four senior seasons of observation (2022–2025), though the fixed-window outcome gives near-identical results. Eighth, the thresholds are candidates, checked across two cohorts of one register but not externally validated, and calibrated to a complete-register, open-entry, club-pays system; they do not transfer to coach-gated or pay-to-play systems without re-derivation, and no intervention effect has been demonstrated: §4.8 is targeting logic, not evaluated policy.</w:t>
       </w:r>
     </w:p>
     <w:bookmarkEnd w:id="53"/>
@@ -6163,18 +6163,18 @@
               <w:pStyle w:val="Compact"/>
             </w:pPr>
             <w:r>
-              <w:t xml:space="preserve">0.73 [0.65, 0.83]</w:t>
-            </w:r>
-          </w:p>
-        </w:tc>
-        <w:tc>
-          <w:tcPr/>
-          <w:p>
-            <w:pPr>
-              <w:pStyle w:val="Compact"/>
-            </w:pPr>
-            <w:r>
-              <w:t xml:space="preserve">0.99 [0.82, 1.19]</w:t>
+              <w:t xml:space="preserve">0.74 [0.65, 0.84]</w:t>
+            </w:r>
+          </w:p>
+        </w:tc>
+        <w:tc>
+          <w:tcPr/>
+          <w:p>
+            <w:pPr>
+              <w:pStyle w:val="Compact"/>
+            </w:pPr>
+            <w:r>
+              <w:t xml:space="preserve">0.99 [0.83, 1.20]</w:t>
             </w:r>
           </w:p>
         </w:tc>
@@ -6209,18 +6209,18 @@
               <w:pStyle w:val="Compact"/>
             </w:pPr>
             <w:r>
-              <w:t xml:space="preserve">0.86 [0.75, 0.98]</w:t>
-            </w:r>
-          </w:p>
-        </w:tc>
-        <w:tc>
-          <w:tcPr/>
-          <w:p>
-            <w:pPr>
-              <w:pStyle w:val="Compact"/>
-            </w:pPr>
-            <w:r>
-              <w:t xml:space="preserve">0.70 [0.56, 0.88]</w:t>
+              <w:t xml:space="preserve">0.85 [0.74, 0.97]</w:t>
+            </w:r>
+          </w:p>
+        </w:tc>
+        <w:tc>
+          <w:tcPr/>
+          <w:p>
+            <w:pPr>
+              <w:pStyle w:val="Compact"/>
+            </w:pPr>
+            <w:r>
+              <w:t xml:space="preserve">0.69 [0.55, 0.87]</w:t>
             </w:r>
           </w:p>
         </w:tc>
@@ -6266,7 +6266,7 @@
               <w:pStyle w:val="Compact"/>
             </w:pPr>
             <w:r>
-              <w:t xml:space="preserve">1.08 [0.88, 1.32]</w:t>
+              <w:t xml:space="preserve">1.08 [0.88, 1.31]</w:t>
             </w:r>
           </w:p>
         </w:tc>
@@ -6312,7 +6312,7 @@
               <w:pStyle w:val="Compact"/>
             </w:pPr>
             <w:r>
-              <w:t xml:space="preserve">0.98 [0.85, 1.14]</w:t>
+              <w:t xml:space="preserve">0.99 [0.85, 1.14]</w:t>
             </w:r>
           </w:p>
         </w:tc>
@@ -6347,18 +6347,18 @@
               <w:pStyle w:val="Compact"/>
             </w:pPr>
             <w:r>
-              <w:t xml:space="preserve">1.49 [1.24, 1.79]</w:t>
-            </w:r>
-          </w:p>
-        </w:tc>
-        <w:tc>
-          <w:tcPr/>
-          <w:p>
-            <w:pPr>
-              <w:pStyle w:val="Compact"/>
-            </w:pPr>
-            <w:r>
-              <w:t xml:space="preserve">1.04 [0.77, 1.42]</w:t>
+              <w:t xml:space="preserve">1.49 [1.24, 1.80]</w:t>
+            </w:r>
+          </w:p>
+        </w:tc>
+        <w:tc>
+          <w:tcPr/>
+          <w:p>
+            <w:pPr>
+              <w:pStyle w:val="Compact"/>
+            </w:pPr>
+            <w:r>
+              <w:t xml:space="preserve">1.05 [0.77, 1.43]</w:t>
             </w:r>
           </w:p>
         </w:tc>
@@ -6485,18 +6485,18 @@
               <w:pStyle w:val="Compact"/>
             </w:pPr>
             <w:r>
-              <w:t xml:space="preserve">0.663</w:t>
-            </w:r>
-          </w:p>
-        </w:tc>
-        <w:tc>
-          <w:tcPr/>
-          <w:p>
-            <w:pPr>
-              <w:pStyle w:val="Compact"/>
-            </w:pPr>
-            <w:r>
-              <w:t xml:space="preserve">0.592</w:t>
+              <w:t xml:space="preserve">0.664</w:t>
+            </w:r>
+          </w:p>
+        </w:tc>
+        <w:tc>
+          <w:tcPr/>
+          <w:p>
+            <w:pPr>
+              <w:pStyle w:val="Compact"/>
+            </w:pPr>
+            <w:r>
+              <w:t xml:space="preserve">0.595</w:t>
             </w:r>
           </w:p>
         </w:tc>

</xml_diff>